<commit_message>
Describe candidate generation: 383,752 enumerated analogues, design-stage filters, and the edits used
</commit_message>
<xml_diff>
--- a/paper/Manuscript_MolInf.docx
+++ b/paper/Manuscript_MolInf.docx
@@ -47,7 +47,7 @@
           <w:b w:val="0"/>
           <w:i w:val="0"/>
         </w:rPr>
-        <w:t>Computational papers on acetylcholinesterase (AChE) inhibitors rarely go beyond predicted potency. We designed 2,700 analogues of potent published inhibitors by one or two matched-pair edits and passed them through gates for activity, brain penetration, drug-likeness, toxicity, docking, protonation and stereochemistry, a four-source novelty search and computed retrosynthesis. 106 molecules on 63 scaffolds cleared every gate with at least 5 % margin (63 with 10 % or more), each absent from PubChem, ChEMBL and SureChEMBL and each with a computed route of one to six steps from purchasable materials. A shortlist of 20 was ranked under 5,000 random weightings of eight further checks. The models behind the gates were tested on held-out scaffolds and on compounds published after a cutoff year, where the activity model beat simple baselines overall but not for chemistry unlike its training set; molecular dynamics kept the poses of 16 of 17 simulated shortlist molecules; and the weak components (docking score, efflux term, hERG) are reported. All results are predictions; nothing has been synthesized.</w:t>
+        <w:t>Computational papers on acetylcholinesterase (AChE) inhibitors rarely go beyond predicted potency. We enumerated 383,752 analogues of 2,225 potent published inhibitors by one or two matched-pair edits, kept 2,700 that passed design-stage filters and passed them through gates for activity, brain penetration, drug-likeness, toxicity, docking, protonation and stereochemistry, a four-source novelty search and computed retrosynthesis. 106 molecules on 63 scaffolds cleared every gate with at least 5 % margin (63 with 10 % or more), each absent from PubChem, ChEMBL and SureChEMBL and each with a computed route of one to six steps from purchasable materials. A shortlist of 20 was ranked under 5,000 random weightings of eight further checks. The models behind the gates were tested on held-out scaffolds and on compounds published after a cutoff year, where the activity model beat simple baselines overall but not for chemistry unlike its training set; molecular dynamics kept the poses of 16 of 17 simulated shortlist molecules; and the weak components (docking score, efflux term, hERG) are reported. All results are predictions; nothing has been synthesized.</w:t>
       </w:r>
     </w:p>
     <w:p>
@@ -166,7 +166,7 @@
           <w:i w:val="0"/>
           <w:sz w:val="19"/>
         </w:rPr>
-        <w:t>Overview of the study. Counts are those of the delivered set; the gates are listed in Table 7 and the shortlist ranking in Section 4.7.</w:t>
+        <w:t>Overview of the study. Counts are those of the delivered set; the gates are listed in Table 8 and the shortlist ranking in Section 4.8.</w:t>
       </w:r>
     </w:p>
     <w:p>
@@ -1196,7 +1196,7 @@
           <w:b w:val="0"/>
           <w:i w:val="0"/>
         </w:rPr>
-        <w:t>Figure 4 shows the funnel (the counts are also listed in the Supporting Information). The stored designs lose most of their number at the first four steps, where the activity and BBB models and the logBB gate act together; 374 designs pass every audited gate, and 292 of them clear 5 % margin. The efflux and exposure gates, stereochemistry, docking, protonation and tautomer checks, novelty and retrosynthesis then reduce the 292 to the delivered 106. Of the 194 candidates that reached docking, one failed the docking gate and two the protonation check, and none was a tautomer of a known compound.</w:t>
+        <w:t>The 2,700 stored designs are themselves the survivors of the generation stage (Table 7: 383,752 enumerated one- and two-edit analogues). Figure 4 shows the funnel (the counts are also listed in the Supporting Information). The stored designs lose most of their number at the first four steps, where the activity and BBB models and the logBB gate act together; 374 designs pass every audited gate, and 292 of them clear 5 % margin. The efflux and exposure gates, stereochemistry, docking, protonation and tautomer checks, novelty and retrosynthesis then reduce the 292 to the delivered 106. Of the 194 candidates that reached docking, one failed the docking gate and two the protonation check, and none was a tautomer of a known compound.</w:t>
       </w:r>
     </w:p>
     <w:p>
@@ -4212,7 +4212,7 @@
           <w:b w:val="0"/>
           <w:i w:val="0"/>
         </w:rPr>
-        <w:t>To choose where to start, the 63 priority-tier molecules were put through every remaining computational check and ranked (Section 4.7). The independent graph network removed 2, the docking gates in all three seed runs and after re-docking with the protonated amine removed 1, structural alerts removed 4 (none of the 106 has a PAINS or Brenk alert; 4 carry a NIH alert, among them a monofluoroacetamide and three alpha-halo heteroatom groups), a route longer than three steps removed 11, and no molecule violated the Lipinski or Veber criteria. The 45 that remained were ranked on eight evidence axes under 5,000 random weightings, and the twenty with the best median rank, with at most two per scaffold and four per parent, are listed in Table 4. They lie on 16 scaffolds from 10 parents, have a median margin of 14.7 % and a median graph-network probability of 0.96, and a median worst-case Vina score of −11.3 kcal mol</w:t>
+        <w:t>To choose where to start, the 63 priority-tier molecules were put through every remaining computational check and ranked (Section 4.8). The independent graph network removed 2, the docking gates in all three seed runs and after re-docking with the protonated amine removed 1, structural alerts removed 4 (none of the 106 has a PAINS or Brenk alert; 4 carry a NIH alert, among them a monofluoroacetamide and three alpha-halo heteroatom groups), a route longer than three steps removed 11, and no molecule violated the Lipinski or Veber criteria. The 45 that remained were ranked on eight evidence axes under 5,000 random weightings, and the twenty with the best median rank, with at most two per scaffold and four per parent, are listed in Table 4. They lie on 16 scaffolds from 10 parents, have a median margin of 14.7 % and a median graph-network probability of 0.96, and a median worst-case Vina score of −11.3 kcal mol</w:t>
       </w:r>
       <w:r>
         <w:rPr>
@@ -8962,7 +8962,7 @@
           <w:b w:val="0"/>
           <w:i w:val="0"/>
         </w:rPr>
-        <w:t>Nothing reported here has been synthesized or assayed; every property is a prediction. The activity model is reliable only near known chemistry (in the time-split test it did not beat nearest-neighbour similarity for compounds unlike its training set, Section 2.7), the docking score is a weak filter, the exposure estimate is a regression on total brain-to-blood ratios (cross-validated RMSE 0.55 log units, a typical error of a factor of about 3.5) and not a measured unbound ratio, and the P-gp and BCRP models are proxies. The margin that ranks the molecules is defined by those models, so a larger margin means the molecule sits farther inside their thresholds and not that it is a more potent inhibitor. The statement that these 106 molecules are the strongest we could find holds for the 2,700 designs generated and for the gates stated in Table 7; molecules outside the library, from a different generator, or judged by different models are not covered. The set is also a selection near threshold edges: only the 63 priority-tier molecules have at least 10 % margin, and none of the 106 can be ranked for hERG risk with the models we have. The first experimental step is an Ellman assay[25] for AChE inhibition with donepezil on the same plate, a BChE counter-screen, an MDCK-MDR1 permeability assay with and without a P-gp inhibitor, a BCRP transport assay and hERG patch clamp, beginning with the molecules that have a one- or two-step route.</w:t>
+        <w:t>Nothing reported here has been synthesized or assayed; every property is a prediction. The activity model is reliable only near known chemistry (in the time-split test it did not beat nearest-neighbour similarity for compounds unlike its training set, Section 2.7), the docking score is a weak filter, the exposure estimate is a regression on total brain-to-blood ratios (cross-validated RMSE 0.55 log units, a typical error of a factor of about 3.5) and not a measured unbound ratio, and the P-gp and BCRP models are proxies. The margin that ranks the molecules is defined by those models, so a larger margin means the molecule sits farther inside their thresholds and not that it is a more potent inhibitor. The statement that these 106 molecules are the strongest we could find holds for the 2,700 designs generated and for the gates stated in Table 8; molecules outside the library, from a different generator, or judged by different models are not covered. The set is also a selection near threshold edges: only the 63 priority-tier molecules have at least 10 % margin, and none of the 106 can be ranked for hERG risk with the models we have. The edits come from a matched-pair library whose transformations are mostly exploratory-tier (all 106 delivered molecules) and are matched on the fragment and its attachment atom only, so an exchange that is common in the library may be a poor choice on a given scaffold; the retrosynthesis check is the evidence that the molecules can be made, and it is a computed route and not a demonstrated one. The first experimental step is an Ellman assay[25] for AChE inhibition with donepezil on the same plate, a BChE counter-screen, an MDCK-MDR1 permeability assay with and without a P-gp inhibitor, a BCRP transport assay and hERG patch clamp, beginning with the molecules that have a one- or two-step route.</w:t>
       </w:r>
     </w:p>
     <w:p>
@@ -9021,7 +9021,7 @@
         <w:pStyle w:val="Heading2"/>
       </w:pPr>
       <w:r>
-        <w:t>4.2. Design and gates</w:t>
+        <w:t>4.2. Generation of the stored designs</w:t>
       </w:r>
     </w:p>
     <w:p>
@@ -9030,7 +9030,543 @@
           <w:b w:val="0"/>
           <w:i w:val="0"/>
         </w:rPr>
-        <w:t xml:space="preserve">Matched pairs were mined from the BBB data by fragmentation and indexing[10] (33,331 pairs, 54,350 transformations, 1,090 analyzed). One transformation was applied to each potent parent in round 1 and a second to 16,000 round-1 products in round 2, which, after a design-stage filter for PAINS[34] and Brenk[35] alerts, gave the 2,700 stored designs of this study. Candidates had to pass the gates of Table 7 in this order. Two kinds of threshold are used: </w:t>
+        <w:t>The designs were generated from known, potent inhibitors and not from scratch. The parents are the 2,225 human AChE actives of the curated ChEMBL set with a pChEMBL value of at least 6.5 (IC</w:t>
+      </w:r>
+      <w:r>
+        <w:rPr>
+          <w:b w:val="0"/>
+          <w:i w:val="0"/>
+          <w:vertAlign w:val="subscript"/>
+        </w:rPr>
+        <w:t>50</w:t>
+      </w:r>
+      <w:r>
+        <w:rPr>
+          <w:b w:val="0"/>
+          <w:i w:val="0"/>
+        </w:rPr>
+        <w:t xml:space="preserve"> or K</w:t>
+      </w:r>
+      <w:r>
+        <w:rPr>
+          <w:b w:val="0"/>
+          <w:i w:val="0"/>
+          <w:vertAlign w:val="subscript"/>
+        </w:rPr>
+        <w:t>i</w:t>
+      </w:r>
+      <w:r>
+        <w:rPr>
+          <w:b w:val="0"/>
+          <w:i w:val="0"/>
+        </w:rPr>
+        <w:t xml:space="preserve"> of 316 nM or better). The edits come from a matched-molecular-pair library mined from the blood–brain-barrier data: pairs of real compounds that differ by one fragment at one attachment point, indexed by the fragment pair[10] (33,331 pairs, 54,350 transformations; 1,090 transformations seen in at least four pairs were analysed). For each transformation the library records how often and by how much that exchange changed the measured or classified brain penetration across its pairs. A transformation was used if its mean effect on the BBB probability was positive and it met one of three evidence tiers: confirmatory (false-discovery q&lt;0.05), supporting (at least 10 pairs, effect at least 0.02, p&lt;0.05) or exploratory (at least 5 pairs). Of the 222 transformations used, 8 are confirmatory, 5 supporting and 209 exploratory; the library therefore rests mainly on weak evidence, and every delivered molecule carries the tier of its edit in the Supporting Information. Applying a transformation means cutting a parent at one acyclic or ring-attached single bond (RDKit rdMMPA, one cut), replacing the variable fragment by the transformation's other fragment, re-joining at the attachment point (molzip), sanitising the valences and keeping single-component products that differ from the parent; a product is therefore a valid molecule by construction, but the exchange is matched on the fragment and its attachment atom only and ignores the rest of the local environment.</w:t>
+      </w:r>
+    </w:p>
+    <w:p>
+      <w:r>
+        <w:rPr>
+          <w:b w:val="0"/>
+          <w:i w:val="0"/>
+        </w:rPr>
+        <w:t>Round 1 applied each of the 222 transformations once to all 2,225 parents (38,209 distinct analogues). Round 2 applied a second transformation to 16,000 round-1 products, a random sample (seed 0) of the size-filtered round-1 analogues, giving 345,543 further analogues; the two rounds together are the 383,752 distinct one- or two-edit analogues of this study (Table 7). These were reduced at the design stage in the order of Table 7: removal of structures already present in the project's training data, size, CNS MPO, synthetic-accessibility, PAINS[34]/Brenk[35] and unstable-group filters, agreement of two independent BBB models, a predicted AChE probability of at least 0.5, and a limit of eight designs per scaffold chosen by a confidence score. The 2,454 survivors of the 16,000-seed run and 859 designs from the earlier single-edit run (613 shared) form the 2,700 stored designs, from 386 distinct parents, of which 1,838 are two-edit and 862 one-edit molecules. The gates of Section 4.3 were applied to these 2,700 designs only, so the 383,752 analogues are a pool that was screened by the design-stage filters and not by the audited gates.</w:t>
+      </w:r>
+    </w:p>
+    <w:p>
+      <w:r>
+        <w:rPr>
+          <w:b w:val="0"/>
+          <w:i w:val="0"/>
+        </w:rPr>
+        <w:t>The delivered molecules use only 22 distinct transformations, all of them ordinary medicinal-chemistry substitutions: methyl to cyclopropyl (22); phenyl to methyl (14); methoxy to methyl (11); methyl to cyclopropylmethyl (11); ethyl to propyl (8); methoxy to methylthio (7). 39 of the 106 are one-edit and 67 two-edit molecules; all 106 come from exploratory-tier transformations (median 9 pairs per transformation, range 5 to 111), and only 5 carry a transformation with q&lt;0.05. The transformation statistics describe how an edit moved brain penetration in other compounds; they do not show that an edit preserves AChE inhibition on a particular parent, which is only predicted by the activity model, and the matched-pair statistics did no better than random edits when tested (Table 8). That an edit can be made is supported differently: each delivered molecule has a computed route of one to six steps from purchasable materials, found by retrosynthesis and independent of the transformation library (Section 4.7).</w:t>
+      </w:r>
+    </w:p>
+    <w:p>
+      <w:r>
+        <w:rPr>
+          <w:b/>
+        </w:rPr>
+        <w:t xml:space="preserve">Table 7. </w:t>
+      </w:r>
+      <w:r>
+        <w:rPr>
+          <w:b w:val="0"/>
+          <w:i w:val="0"/>
+          <w:sz w:val="19"/>
+        </w:rPr>
+        <w:t>Generation of the stored designs: from the potent published parents to the 2,700 designs that enter the gates of Table 8. Counts are from the design runs; the shared designs are those found in both runs.</w:t>
+      </w:r>
+    </w:p>
+    <w:tbl>
+      <w:tblPr>
+        <w:tblStyle w:val="TableGrid"/>
+        <w:tblW w:type="auto" w:w="0"/>
+        <w:tblLook w:firstColumn="1" w:firstRow="1" w:lastColumn="0" w:lastRow="0" w:noHBand="0" w:noVBand="1" w:val="04A0"/>
+      </w:tblPr>
+      <w:tblGrid>
+        <w:gridCol w:w="4703"/>
+        <w:gridCol w:w="4703"/>
+      </w:tblGrid>
+      <w:tr>
+        <w:tc>
+          <w:tcPr>
+            <w:tcW w:type="dxa" w:w="4703"/>
+            <w:shd w:val="clear" w:color="auto" w:fill="D9E2F3"/>
+          </w:tcPr>
+          <w:p>
+            <w:r/>
+            <w:r>
+              <w:rPr>
+                <w:b/>
+                <w:i w:val="0"/>
+                <w:sz w:val="17"/>
+              </w:rPr>
+              <w:t>Step</w:t>
+            </w:r>
+          </w:p>
+        </w:tc>
+        <w:tc>
+          <w:tcPr>
+            <w:tcW w:type="dxa" w:w="4703"/>
+            <w:shd w:val="clear" w:color="auto" w:fill="D9E2F3"/>
+          </w:tcPr>
+          <w:p>
+            <w:r/>
+            <w:r>
+              <w:rPr>
+                <w:b/>
+                <w:i w:val="0"/>
+                <w:sz w:val="17"/>
+              </w:rPr>
+              <w:t>Count</w:t>
+            </w:r>
+          </w:p>
+        </w:tc>
+      </w:tr>
+      <w:tr>
+        <w:tc>
+          <w:tcPr>
+            <w:tcW w:type="dxa" w:w="4703"/>
+          </w:tcPr>
+          <w:p>
+            <w:r/>
+            <w:r>
+              <w:rPr>
+                <w:b w:val="0"/>
+                <w:i w:val="0"/>
+                <w:sz w:val="17"/>
+              </w:rPr>
+              <w:t>Potent published AChE parents (pChEMBL at least 6.5)</w:t>
+            </w:r>
+          </w:p>
+        </w:tc>
+        <w:tc>
+          <w:tcPr>
+            <w:tcW w:type="dxa" w:w="4703"/>
+          </w:tcPr>
+          <w:p>
+            <w:r/>
+            <w:r>
+              <w:rPr>
+                <w:b w:val="0"/>
+                <w:i w:val="0"/>
+                <w:sz w:val="17"/>
+              </w:rPr>
+              <w:t>2,225</w:t>
+            </w:r>
+          </w:p>
+        </w:tc>
+      </w:tr>
+      <w:tr>
+        <w:tc>
+          <w:tcPr>
+            <w:tcW w:type="dxa" w:w="4703"/>
+          </w:tcPr>
+          <w:p>
+            <w:r/>
+            <w:r>
+              <w:rPr>
+                <w:b w:val="0"/>
+                <w:i w:val="0"/>
+                <w:sz w:val="17"/>
+              </w:rPr>
+              <w:t>Matched-pair transformations used</w:t>
+            </w:r>
+          </w:p>
+        </w:tc>
+        <w:tc>
+          <w:tcPr>
+            <w:tcW w:type="dxa" w:w="4703"/>
+          </w:tcPr>
+          <w:p>
+            <w:r/>
+            <w:r>
+              <w:rPr>
+                <w:b w:val="0"/>
+                <w:i w:val="0"/>
+                <w:sz w:val="17"/>
+              </w:rPr>
+              <w:t>222</w:t>
+            </w:r>
+          </w:p>
+        </w:tc>
+      </w:tr>
+      <w:tr>
+        <w:tc>
+          <w:tcPr>
+            <w:tcW w:type="dxa" w:w="4703"/>
+          </w:tcPr>
+          <w:p>
+            <w:r/>
+            <w:r>
+              <w:rPr>
+                <w:b w:val="0"/>
+                <w:i w:val="0"/>
+                <w:sz w:val="17"/>
+              </w:rPr>
+              <w:t>Round 1: distinct analogues, one edit</w:t>
+            </w:r>
+          </w:p>
+        </w:tc>
+        <w:tc>
+          <w:tcPr>
+            <w:tcW w:type="dxa" w:w="4703"/>
+          </w:tcPr>
+          <w:p>
+            <w:r/>
+            <w:r>
+              <w:rPr>
+                <w:b w:val="0"/>
+                <w:i w:val="0"/>
+                <w:sz w:val="17"/>
+              </w:rPr>
+              <w:t>38,209</w:t>
+            </w:r>
+          </w:p>
+        </w:tc>
+      </w:tr>
+      <w:tr>
+        <w:tc>
+          <w:tcPr>
+            <w:tcW w:type="dxa" w:w="4703"/>
+          </w:tcPr>
+          <w:p>
+            <w:r/>
+            <w:r>
+              <w:rPr>
+                <w:b w:val="0"/>
+                <w:i w:val="0"/>
+                <w:sz w:val="17"/>
+              </w:rPr>
+              <w:t>Round 2: additional distinct analogues, second edit on 16,000 round-1 products</w:t>
+            </w:r>
+          </w:p>
+        </w:tc>
+        <w:tc>
+          <w:tcPr>
+            <w:tcW w:type="dxa" w:w="4703"/>
+          </w:tcPr>
+          <w:p>
+            <w:r/>
+            <w:r>
+              <w:rPr>
+                <w:b w:val="0"/>
+                <w:i w:val="0"/>
+                <w:sz w:val="17"/>
+              </w:rPr>
+              <w:t>345,543</w:t>
+            </w:r>
+          </w:p>
+        </w:tc>
+      </w:tr>
+      <w:tr>
+        <w:tc>
+          <w:tcPr>
+            <w:tcW w:type="dxa" w:w="4703"/>
+          </w:tcPr>
+          <w:p>
+            <w:r/>
+            <w:r>
+              <w:rPr>
+                <w:b w:val="0"/>
+                <w:i w:val="0"/>
+                <w:sz w:val="17"/>
+              </w:rPr>
+              <w:t>All distinct analogues (one or two edits)</w:t>
+            </w:r>
+          </w:p>
+        </w:tc>
+        <w:tc>
+          <w:tcPr>
+            <w:tcW w:type="dxa" w:w="4703"/>
+          </w:tcPr>
+          <w:p>
+            <w:r/>
+            <w:r>
+              <w:rPr>
+                <w:b w:val="0"/>
+                <w:i w:val="0"/>
+                <w:sz w:val="17"/>
+              </w:rPr>
+              <w:t>383,752</w:t>
+            </w:r>
+          </w:p>
+        </w:tc>
+      </w:tr>
+      <w:tr>
+        <w:tc>
+          <w:tcPr>
+            <w:tcW w:type="dxa" w:w="4703"/>
+          </w:tcPr>
+          <w:p>
+            <w:r/>
+            <w:r>
+              <w:rPr>
+                <w:b w:val="0"/>
+                <w:i w:val="0"/>
+                <w:sz w:val="17"/>
+              </w:rPr>
+              <w:t>Not already in the project's training data</w:t>
+            </w:r>
+          </w:p>
+        </w:tc>
+        <w:tc>
+          <w:tcPr>
+            <w:tcW w:type="dxa" w:w="4703"/>
+          </w:tcPr>
+          <w:p>
+            <w:r/>
+            <w:r>
+              <w:rPr>
+                <w:b w:val="0"/>
+                <w:i w:val="0"/>
+                <w:sz w:val="17"/>
+              </w:rPr>
+              <w:t>383,134</w:t>
+            </w:r>
+          </w:p>
+        </w:tc>
+      </w:tr>
+      <w:tr>
+        <w:tc>
+          <w:tcPr>
+            <w:tcW w:type="dxa" w:w="4703"/>
+          </w:tcPr>
+          <w:p>
+            <w:r/>
+            <w:r>
+              <w:rPr>
+                <w:b w:val="0"/>
+                <w:i w:val="0"/>
+                <w:sz w:val="17"/>
+              </w:rPr>
+              <w:t>15–45 heavy atoms, CNS MPO at least 4, SA at most 5, no PAINS/Brenk alert, no unstable group</w:t>
+            </w:r>
+          </w:p>
+        </w:tc>
+        <w:tc>
+          <w:tcPr>
+            <w:tcW w:type="dxa" w:w="4703"/>
+          </w:tcPr>
+          <w:p>
+            <w:r/>
+            <w:r>
+              <w:rPr>
+                <w:b w:val="0"/>
+                <w:i w:val="0"/>
+                <w:sz w:val="17"/>
+              </w:rPr>
+              <w:t>12,484</w:t>
+            </w:r>
+          </w:p>
+        </w:tc>
+      </w:tr>
+      <w:tr>
+        <w:tc>
+          <w:tcPr>
+            <w:tcW w:type="dxa" w:w="4703"/>
+          </w:tcPr>
+          <w:p>
+            <w:r/>
+            <w:r>
+              <w:rPr>
+                <w:b w:val="0"/>
+                <w:i w:val="0"/>
+                <w:sz w:val="17"/>
+              </w:rPr>
+              <w:t>Both BBB models at least 0.6 and disagreement at most 0.15</w:t>
+            </w:r>
+          </w:p>
+        </w:tc>
+        <w:tc>
+          <w:tcPr>
+            <w:tcW w:type="dxa" w:w="4703"/>
+          </w:tcPr>
+          <w:p>
+            <w:r/>
+            <w:r>
+              <w:rPr>
+                <w:b w:val="0"/>
+                <w:i w:val="0"/>
+                <w:sz w:val="17"/>
+              </w:rPr>
+              <w:t>4,112</w:t>
+            </w:r>
+          </w:p>
+        </w:tc>
+      </w:tr>
+      <w:tr>
+        <w:tc>
+          <w:tcPr>
+            <w:tcW w:type="dxa" w:w="4703"/>
+          </w:tcPr>
+          <w:p>
+            <w:r/>
+            <w:r>
+              <w:rPr>
+                <w:b w:val="0"/>
+                <w:i w:val="0"/>
+                <w:sz w:val="17"/>
+              </w:rPr>
+              <w:t>AChE probability at least 0.5</w:t>
+            </w:r>
+          </w:p>
+        </w:tc>
+        <w:tc>
+          <w:tcPr>
+            <w:tcW w:type="dxa" w:w="4703"/>
+          </w:tcPr>
+          <w:p>
+            <w:r/>
+            <w:r>
+              <w:rPr>
+                <w:b w:val="0"/>
+                <w:i w:val="0"/>
+                <w:sz w:val="17"/>
+              </w:rPr>
+              <w:t>3,898</w:t>
+            </w:r>
+          </w:p>
+        </w:tc>
+      </w:tr>
+      <w:tr>
+        <w:tc>
+          <w:tcPr>
+            <w:tcW w:type="dxa" w:w="4703"/>
+          </w:tcPr>
+          <w:p>
+            <w:r/>
+            <w:r>
+              <w:rPr>
+                <w:b w:val="0"/>
+                <w:i w:val="0"/>
+                <w:sz w:val="17"/>
+              </w:rPr>
+              <w:t>At most 8 per scaffold, best first (16,000-seed run)</w:t>
+            </w:r>
+          </w:p>
+        </w:tc>
+        <w:tc>
+          <w:tcPr>
+            <w:tcW w:type="dxa" w:w="4703"/>
+          </w:tcPr>
+          <w:p>
+            <w:r/>
+            <w:r>
+              <w:rPr>
+                <w:b w:val="0"/>
+                <w:i w:val="0"/>
+                <w:sz w:val="17"/>
+              </w:rPr>
+              <w:t>2,454</w:t>
+            </w:r>
+          </w:p>
+        </w:tc>
+      </w:tr>
+      <w:tr>
+        <w:tc>
+          <w:tcPr>
+            <w:tcW w:type="dxa" w:w="4703"/>
+          </w:tcPr>
+          <w:p>
+            <w:r/>
+            <w:r>
+              <w:rPr>
+                <w:b w:val="0"/>
+                <w:i w:val="0"/>
+                <w:sz w:val="17"/>
+              </w:rPr>
+              <w:t>Added from the earlier single-edit run (613 shared)</w:t>
+            </w:r>
+          </w:p>
+        </w:tc>
+        <w:tc>
+          <w:tcPr>
+            <w:tcW w:type="dxa" w:w="4703"/>
+          </w:tcPr>
+          <w:p>
+            <w:r/>
+            <w:r>
+              <w:rPr>
+                <w:b w:val="0"/>
+                <w:i w:val="0"/>
+                <w:sz w:val="17"/>
+              </w:rPr>
+              <w:t>246</w:t>
+            </w:r>
+          </w:p>
+        </w:tc>
+      </w:tr>
+      <w:tr>
+        <w:tc>
+          <w:tcPr>
+            <w:tcW w:type="dxa" w:w="4703"/>
+          </w:tcPr>
+          <w:p>
+            <w:r/>
+            <w:r>
+              <w:rPr>
+                <w:b w:val="0"/>
+                <w:i w:val="0"/>
+                <w:sz w:val="17"/>
+              </w:rPr>
+              <w:t>Stored designs (union; 386 parents)</w:t>
+            </w:r>
+          </w:p>
+        </w:tc>
+        <w:tc>
+          <w:tcPr>
+            <w:tcW w:type="dxa" w:w="4703"/>
+          </w:tcPr>
+          <w:p>
+            <w:r/>
+            <w:r>
+              <w:rPr>
+                <w:b w:val="0"/>
+                <w:i w:val="0"/>
+                <w:sz w:val="17"/>
+              </w:rPr>
+              <w:t>2,700</w:t>
+            </w:r>
+          </w:p>
+        </w:tc>
+      </w:tr>
+    </w:tbl>
+    <w:p>
+      <w:pPr>
+        <w:pStyle w:val="Heading2"/>
+      </w:pPr>
+      <w:r>
+        <w:t>4.3. Design and gates</w:t>
+      </w:r>
+    </w:p>
+    <w:p>
+      <w:r>
+        <w:rPr>
+          <w:b w:val="0"/>
+          <w:i w:val="0"/>
+        </w:rPr>
+        <w:t xml:space="preserve">The stored designs of Section 4.2 entered the gates in the order below. Candidates had to pass the gates of Table 8 in this order. Two kinds of threshold are used: </w:t>
       </w:r>
       <w:r>
         <w:rPr>
@@ -9094,7 +9630,7 @@
         <w:rPr>
           <w:b/>
         </w:rPr>
-        <w:t xml:space="preserve">Table 7. </w:t>
+        <w:t xml:space="preserve">Table 8. </w:t>
       </w:r>
       <w:r>
         <w:rPr>
@@ -9792,7 +10328,7 @@
         <w:pStyle w:val="Heading2"/>
       </w:pPr>
       <w:r>
-        <w:t>4.3. Docking, protonation and stereochemistry</w:t>
+        <w:t>4.4. Docking, protonation and stereochemistry</w:t>
       </w:r>
     </w:p>
     <w:p>
@@ -9824,7 +10360,7 @@
         <w:pStyle w:val="Heading2"/>
       </w:pPr>
       <w:r>
-        <w:t>4.4. Novelty</w:t>
+        <w:t>4.5. Novelty</w:t>
       </w:r>
     </w:p>
     <w:p>
@@ -9841,7 +10377,7 @@
         <w:pStyle w:val="Heading2"/>
       </w:pPr>
       <w:r>
-        <w:t>4.5. Computed retrosynthesis</w:t>
+        <w:t>4.6. Computed retrosynthesis</w:t>
       </w:r>
     </w:p>
     <w:p>
@@ -9858,7 +10394,7 @@
         <w:pStyle w:val="Heading2"/>
       </w:pPr>
       <w:r>
-        <w:t>4.6. Selection</w:t>
+        <w:t>4.7. Selection</w:t>
       </w:r>
     </w:p>
     <w:p>
@@ -9875,7 +10411,7 @@
         <w:pStyle w:val="Heading2"/>
       </w:pPr>
       <w:r>
-        <w:t>4.7. Shortlist ranking</w:t>
+        <w:t>4.8. Shortlist ranking</w:t>
       </w:r>
     </w:p>
     <w:p>
@@ -9892,7 +10428,7 @@
         <w:pStyle w:val="Heading2"/>
       </w:pPr>
       <w:r>
-        <w:t>4.8. Temporal validation and pose-stability dynamics</w:t>
+        <w:t>4.9. Temporal validation and pose-stability dynamics</w:t>
       </w:r>
     </w:p>
     <w:p>

</xml_diff>

<commit_message>
Domain-threshold sensitivity, Table 1 rows for the time split and the edits
</commit_message>
<xml_diff>
--- a/paper/Manuscript_MolInf.docx
+++ b/paper/Manuscript_MolInf.docx
@@ -490,6 +490,138 @@
                 <w:sz w:val="17"/>
               </w:rPr>
               <w:t>NN 0.720</w:t>
+            </w:r>
+          </w:p>
+        </w:tc>
+      </w:tr>
+      <w:tr>
+        <w:tc>
+          <w:tcPr>
+            <w:tcW w:type="dxa" w:w="2351"/>
+          </w:tcPr>
+          <w:p>
+            <w:r/>
+            <w:r>
+              <w:rPr>
+                <w:b w:val="0"/>
+                <w:i w:val="0"/>
+                <w:sz w:val="17"/>
+              </w:rPr>
+              <w:t>AChE, time split 2015</w:t>
+            </w:r>
+          </w:p>
+        </w:tc>
+        <w:tc>
+          <w:tcPr>
+            <w:tcW w:type="dxa" w:w="2351"/>
+          </w:tcPr>
+          <w:p>
+            <w:r/>
+            <w:r>
+              <w:rPr>
+                <w:b w:val="0"/>
+                <w:i w:val="0"/>
+                <w:sz w:val="17"/>
+              </w:rPr>
+              <w:t>later compounds: all / in domain / least-similar third, AUC</w:t>
+            </w:r>
+          </w:p>
+        </w:tc>
+        <w:tc>
+          <w:tcPr>
+            <w:tcW w:type="dxa" w:w="2351"/>
+          </w:tcPr>
+          <w:p>
+            <w:r/>
+            <w:r>
+              <w:rPr>
+                <w:b w:val="0"/>
+                <w:i w:val="0"/>
+                <w:sz w:val="17"/>
+              </w:rPr>
+              <w:t>0.77 / 0.81 / 0.55</w:t>
+            </w:r>
+          </w:p>
+        </w:tc>
+        <w:tc>
+          <w:tcPr>
+            <w:tcW w:type="dxa" w:w="2351"/>
+          </w:tcPr>
+          <w:p>
+            <w:r/>
+            <w:r>
+              <w:rPr>
+                <w:b w:val="0"/>
+                <w:i w:val="0"/>
+                <w:sz w:val="17"/>
+              </w:rPr>
+              <w:t>NN 0.74 / 0.68 / 0.58</w:t>
+            </w:r>
+          </w:p>
+        </w:tc>
+      </w:tr>
+      <w:tr>
+        <w:tc>
+          <w:tcPr>
+            <w:tcW w:type="dxa" w:w="2351"/>
+          </w:tcPr>
+          <w:p>
+            <w:r/>
+            <w:r>
+              <w:rPr>
+                <w:b w:val="0"/>
+                <w:i w:val="0"/>
+                <w:sz w:val="17"/>
+              </w:rPr>
+              <w:t>Edits in real AChE pairs</w:t>
+            </w:r>
+          </w:p>
+        </w:tc>
+        <w:tc>
+          <w:tcPr>
+            <w:tcW w:type="dxa" w:w="2351"/>
+          </w:tcPr>
+          <w:p>
+            <w:r/>
+            <w:r>
+              <w:rPr>
+                <w:b w:val="0"/>
+                <w:i w:val="0"/>
+                <w:sz w:val="17"/>
+              </w:rPr>
+              <w:t>961 same-publication pairs, share within 0.5 log units</w:t>
+            </w:r>
+          </w:p>
+        </w:tc>
+        <w:tc>
+          <w:tcPr>
+            <w:tcW w:type="dxa" w:w="2351"/>
+          </w:tcPr>
+          <w:p>
+            <w:r/>
+            <w:r>
+              <w:rPr>
+                <w:b w:val="0"/>
+                <w:i w:val="0"/>
+                <w:sz w:val="17"/>
+              </w:rPr>
+              <w:t>64.5 %</w:t>
+            </w:r>
+          </w:p>
+        </w:tc>
+        <w:tc>
+          <w:tcPr>
+            <w:tcW w:type="dxa" w:w="2351"/>
+          </w:tcPr>
+          <w:p>
+            <w:r/>
+            <w:r>
+              <w:rPr>
+                <w:b w:val="0"/>
+                <w:i w:val="0"/>
+                <w:sz w:val="17"/>
+              </w:rPr>
+              <w:t>other exchanges 51.6 %</w:t>
             </w:r>
           </w:p>
         </w:tc>
@@ -6721,7 +6853,7 @@
           <w:b w:val="0"/>
           <w:i w:val="0"/>
         </w:rPr>
-        <w:t>Time-split validation inside the applicability domain. The activity gate admits only molecules whose similarity to the nearest potent training active is at least 0.417 (Section 4.3). Repeating the time-split test for the later compounds that satisfy that condition (41, 46 and 48 % of later compounds at the three cutoffs), the activity design reached ROC-AUC 0.79, 0.81 and 0.85 against 0.67, 0.68 and 0.72 for nearest-neighbour similarity and 0.64, 0.69 and 0.73 for the descriptor model, with non-overlapping intervals; outside the domain it reached 0.60, 0.63 and 0.64. The pre-specified bar (2015 cutoff, in domain, above both baselines and above 0.65) was met. We state that this analysis was added after the earlier test failed in the least-similar third, motivated by the domain gate the design already enforced, and we report both.</w:t>
+        <w:t>Time-split validation inside the applicability domain. The activity gate admits only molecules whose similarity to the nearest potent training active is at least 0.417 (Section 4.3). Repeating the time-split test for the later compounds that satisfy that condition (41, 46 and 48 % of later compounds at the three cutoffs), the activity design reached ROC-AUC 0.79, 0.81 and 0.85 against 0.67, 0.68 and 0.72 for nearest-neighbour similarity and 0.64, 0.69 and 0.73 for the descriptor model, with non-overlapping intervals; outside the domain it reached 0.60, 0.63 and 0.64. The pre-specified bar (2015 cutoff, in domain, above both baselines and above 0.65) was met. We state that this analysis was added after the earlier test failed in the least-similar third, motivated by the domain gate the design already enforced, and we report both. The result does not depend on the threshold: at similarities of 0.30, 0.50 and 0.60 the activity design reached ROC-AUC 0.80, 0.82 and 0.82 against 0.74, 0.64 and 0.60 for nearest-neighbour similarity (2015 cutoff).</w:t>
       </w:r>
     </w:p>
     <w:p>

</xml_diff>

<commit_message>
Add second MD replica; replicate variation reported; validation set and notebook for the pose-stability screen
</commit_message>
<xml_diff>
--- a/paper/Manuscript_MolInf.docx
+++ b/paper/Manuscript_MolInf.docx
@@ -47,7 +47,7 @@
           <w:b w:val="0"/>
           <w:i w:val="0"/>
         </w:rPr>
-        <w:t>Computational papers on acetylcholinesterase (AChE) inhibitors rarely go beyond predicted potency. We enumerated 383,752 analogues of 2,225 potent published inhibitors by one or two matched-pair edits, kept 2,700 that passed design-stage filters and passed them through gates for activity, brain penetration, drug-likeness, toxicity, docking, protonation and stereochemistry, a four-source novelty search and computed retrosynthesis. 106 molecules on 63 scaffolds cleared every gate with at least 5 % margin (63 with 10 % or more), each absent from PubChem, ChEMBL and SureChEMBL and each with a computed route of one to six steps from purchasable materials. A shortlist of 20 was ranked under 5,000 random weightings of eight further checks. The models behind the gates were tested on held-out scaffolds and on compounds published after a cutoff year, where the activity model beat simple baselines overall but not for chemistry unlike its training set; molecular dynamics kept the poses of 16 of 17 simulated shortlist molecules; and the weak components (docking score, efflux term, hERG) are reported. The substitutions used preserve potency to within 0.5 log units in 64.5 % of measured AChE compound pairs (51.6 % for other exchanges), every molecule is tied to a measured potent parent, and inside its applicability domain the activity model ranks later-published compounds with ROC-AUC 0.81 (0.68 for nearest-neighbour similarity). All results are predictions; nothing has been synthesized.</w:t>
+        <w:t>Computational papers on acetylcholinesterase (AChE) inhibitors rarely go beyond predicted potency. We enumerated 383,752 analogues of 2,225 potent published inhibitors by one or two matched-pair edits, kept 2,700 that passed design-stage filters and passed them through gates for activity, brain penetration, drug-likeness, toxicity, docking, protonation and stereochemistry, a four-source novelty search and computed retrosynthesis. 106 molecules on 63 scaffolds cleared every gate with at least 5 % margin (63 with 10 % or more), each absent from PubChem, ChEMBL and SureChEMBL and each with a computed route of one to six steps from purchasable materials. A shortlist of 20 was ranked under 5,000 random weightings of eight further checks. The models behind the gates were tested on held-out scaffolds and on compounds published after a cutoff year, where the activity model beat simple baselines overall but not for chemistry unlike its training set; molecular dynamics in two 2 ns replicas left no shortlisted molecule outside the gorge, although the RMSD criterion varied between replicas (donepezil 2.1 and 3.1 Å); and the weak components (docking score, efflux term, hERG) are reported. The substitutions used preserve potency to within 0.5 log units in 64.5 % of measured AChE compound pairs (51.6 % for other exchanges), every molecule is tied to a measured potent parent, and inside its applicability domain the activity model ranks later-published compounds with ROC-AUC 0.81 (0.68 for nearest-neighbour similarity). All results are predictions; nothing has been synthesized.</w:t>
       </w:r>
     </w:p>
     <w:p>
@@ -166,7 +166,7 @@
           <w:i w:val="0"/>
           <w:sz w:val="19"/>
         </w:rPr>
-        <w:t>Overview of the study. Counts are those of the delivered set; the gates are listed in Table 10 and the shortlist ranking in Section 4.8.</w:t>
+        <w:t>Overview of the study. Counts are those of the delivered set; the gates are listed in Table 11 and the shortlist ranking in Section 4.8.</w:t>
       </w:r>
     </w:p>
     <w:p>
@@ -1328,7 +1328,7 @@
           <w:b w:val="0"/>
           <w:i w:val="0"/>
         </w:rPr>
-        <w:t>The 2,700 stored designs are themselves the survivors of the generation stage (Table 9: 383,752 enumerated one- and two-edit analogues). Figure 4 shows the funnel (the counts are also listed in the Supporting Information). The stored designs lose most of their number at the first four steps, where the activity and BBB models and the logBB gate act together; 374 designs pass every audited gate, and 292 of them clear 5 % margin. The efflux and exposure gates, stereochemistry, docking, protonation and tautomer checks, novelty and retrosynthesis then reduce the 292 to the delivered 106. Of the 194 candidates that reached docking, one failed the docking gate and two the protonation check, and none was a tautomer of a known compound.</w:t>
+        <w:t>The 2,700 stored designs are themselves the survivors of the generation stage (Table 10: 383,752 enumerated one- and two-edit analogues). Figure 4 shows the funnel (the counts are also listed in the Supporting Information). The stored designs lose most of their number at the first four steps, where the activity and BBB models and the logBB gate act together; 374 designs pass every audited gate, and 292 of them clear 5 % margin. The efflux and exposure gates, stereochemistry, docking, protonation and tautomer checks, novelty and retrosynthesis then reduce the 292 to the delivered 106. Of the 194 candidates that reached docking, one failed the docking gate and two the protonation check, and none was a tautomer of a known compound.</w:t>
       </w:r>
     </w:p>
     <w:p>
@@ -6871,7 +6871,7 @@
           <w:b w:val="0"/>
           <w:i w:val="0"/>
         </w:rPr>
-        <w:t>Blind re-discovery. Using only compounds reported up to a cutoff year, we applied the design stage's edits to the potent parents and asked how many compounds reported later were reproduced exactly and how close the generated analogues came to later potent compounds: at the 2015 cutoff the design-stage edits generated 325,244 analogues from 1,247 earlier potent parents and reproduced 7 of the 2,784 later compounds exactly (5 of the 593 later potent compounds), against 5 to 8 (2 to 3 potent) for 3 random draws of unused edits; the share of later potent compounds with a generated analogue at ECFP4 similarity of at least 0.8 was 2.9 % for the design-stage edits and 2.0 to 2.9 % for the random draws (mean highest similarity 0.48 against 0.47 to 0.47); at the 2018 cutoff the design-stage edits generated 345,702 analogues from 1,531 earlier potent parents and reproduced 6 of the 1,819 later compounds exactly (3 of the 393 later potent compounds), against 4 to 4 (1 to 3 potent) for 3 random draws of unused edits; the share of later potent compounds with a generated analogue at ECFP4 similarity of at least 0.8 was 2.5 % for the design-stage edits and 1.5 to 2.3 % for the random draws (mean highest similarity 0.49 against 0.47 to 0.48); at the 2012 cutoff (exact matches only) the design-stage edits reproduced 5 later compounds (4 potent) against 3 to 8 (2 to 3 potent) for 2 random draws. Exact re-discovery is rare and the counts are too small to separate the edit sets, and the near-recovery measure shows at most a small difference (the design-stage edits are within the range of the random draws at 2015 and slightly above it at 2018): the edit library has not been shown to find future compounds clearly better than other edits, which agrees with the matched-pair statistics test of Table 10. The value of the cascade therefore lies in its gates and its anchoring to measured parents and not in the edit selection.</w:t>
+        <w:t>Blind re-discovery. Using only compounds reported up to a cutoff year, we applied the design stage's edits to the potent parents and asked how many compounds reported later were reproduced exactly and how close the generated analogues came to later potent compounds: at the 2015 cutoff the design-stage edits generated 325,244 analogues from 1,247 earlier potent parents and reproduced 7 of the 2,784 later compounds exactly (5 of the 593 later potent compounds), against 5 to 8 (2 to 3 potent) for 3 random draws of unused edits; the share of later potent compounds with a generated analogue at ECFP4 similarity of at least 0.8 was 2.9 % for the design-stage edits and 2.0 to 2.9 % for the random draws (mean highest similarity 0.48 against 0.47 to 0.47); at the 2018 cutoff the design-stage edits generated 345,702 analogues from 1,531 earlier potent parents and reproduced 6 of the 1,819 later compounds exactly (3 of the 393 later potent compounds), against 4 to 4 (1 to 3 potent) for 3 random draws of unused edits; the share of later potent compounds with a generated analogue at ECFP4 similarity of at least 0.8 was 2.5 % for the design-stage edits and 1.5 to 2.3 % for the random draws (mean highest similarity 0.49 against 0.47 to 0.48); at the 2012 cutoff (exact matches only) the design-stage edits reproduced 5 later compounds (4 potent) against 3 to 8 (2 to 3 potent) for 2 random draws. Exact re-discovery is rare and the counts are too small to separate the edit sets, and the near-recovery measure shows at most a small difference (the design-stage edits are within the range of the random draws at 2015 and slightly above it at 2018): the edit library has not been shown to find future compounds clearly better than other edits, which agrees with the matched-pair statistics test of Table 11. The value of the cascade therefore lies in its gates and its anchoring to measured parents and not in the edit selection.</w:t>
       </w:r>
     </w:p>
     <w:p>
@@ -10879,7 +10879,7 @@
           <w:b w:val="0"/>
           <w:i w:val="0"/>
         </w:rPr>
-        <w:t>Pose stability (Table 8). Donepezil from its crystal pose stayed in the gorge (mean RMSD over the second half 2.12 Å), so the protocol is valid. Of the 17 shortlisted molecules simulated, 16 kept their pose by the criterion and 1 did not (Shortlist 12, RMSD 4.16 Å). Shortlist 18, 19 and 20 were not simulated because the time budget of the Kaggle session was used. One 2 ns replica is a short and single test, so this is a screen for gross pose instability and not a free-energy or residence-time result; no molecule's potency can be inferred from it.</w:t>
+        <w:t>Pose stability (Table 8). Donepezil from its crystal pose stayed in the gorge (mean RMSD over the second half 2.12 Å), so the protocol is valid for this replica. Of the 17 shortlisted molecules simulated, 16 kept their pose by the criterion and 1 did not (Shortlist 12, RMSD 4.16 Å). Shortlist 18, 19 and 20 were not simulated in this first replica because its time budget was used; the second replica below covers them. One 2 ns replica is a short and single test (a second replica follows), so this is a screen for gross pose instability and not a free-energy or residence-time result; no molecule's potency can be inferred from it.</w:t>
       </w:r>
     </w:p>
     <w:p>
@@ -10895,7 +10895,7 @@
           <w:i w:val="0"/>
           <w:sz w:val="19"/>
         </w:rPr>
-        <w:t>Pose stability in 2 ns of explicit-solvent dynamics (one replica). RMSD: mean ligand heavy-atom RMSD over the second half of production (Å); COM: centre-of-mass shift over the same period (Å); Trp86: fraction of frames with a ligand aromatic ring centroid within 5.5 Å of the Trp86 ring centroid (all values here were recovered from the saved trajectories and the run log, because the summary file of one of the two GPU processes was overwritten by the other; the remaining contact fractions and the MM-GBSA energies survive for only half of the molecules and are therefore not reported). Stable: RMSD at most 3.0 Å and centre-of-mass shift at most 6 Å.</w:t>
+        <w:t>Pose stability in 2 ns of explicit-solvent dynamics (first replica, seed 1). RMSD: mean ligand heavy-atom RMSD over the second half of production (Å); COM: centre-of-mass shift over the same period (Å); Trp86: fraction of frames with a ligand aromatic ring centroid within 5.5 Å of the Trp86 ring centroid (all values here were recovered from the saved trajectories and the run log, because the summary file of one of the two GPU processes was overwritten by the other; the remaining contact fractions and the MM-GBSA energies survive for only half of the molecules and are therefore not reported). Stable: RMSD at most 3.0 Å and centre-of-mass shift at most 6 Å.</w:t>
       </w:r>
     </w:p>
     <w:tbl>
@@ -12476,6 +12476,1854 @@
       </w:tr>
     </w:tbl>
     <w:p>
+      <w:r>
+        <w:rPr>
+          <w:b w:val="0"/>
+          <w:i w:val="0"/>
+        </w:rPr>
+        <w:t>Replicate. A second 2 ns replica (seed 2, identical poses and protocol, no MM-GBSA) covered all 20 shortlisted molecules, including Shortlist 18 to 20, which the first replica did not reach (Table 9). In the replica donepezil, the reference that must pass for the protocol to be valid, had a mean RMSD of 3.13 Å (2.12 Å in the first replica), just over the 3.0 Å criterion, so the protocol did not meet its own validity condition in this replica. The difference between the two donepezil trajectories (about 1 Å) is the run-to-run variation of a single 2 ns trajectory, and every stable or unstable call below carries it. In the replica 19 of 20 shortlisted molecules met the stability criterion. For the 17 molecules simulated twice, 15 were stable in both replicas and the call agreed for 15; the calls differed for Shortlist 12 (RMSD 4.16 and 1.28 Å) and Shortlist 13 (RMSD 1.98 and 3.81 Å). The Spearman correlation between the RMSD values of the two replicas is only 0.11 (mean absolute difference 0.90 Å). The dynamics therefore detect gross instability reproducibly, since no shortlisted molecule left the gorge in either replica (largest centre-of-mass shift 3.3 Å), but a 3.0 Å RMSD criterion on a 2 ns trajectory does not separate individual molecules reliably, and the first-replica statement about Shortlist 12 should be read with this variation. Two replicas of 2 ns remain a screen, and agreement between them would say only that the screen is repeatable, not that the poses are correct.</w:t>
+      </w:r>
+    </w:p>
+    <w:p>
+      <w:r>
+        <w:rPr>
+          <w:b/>
+        </w:rPr>
+        <w:t xml:space="preserve">Table 9. </w:t>
+      </w:r>
+      <w:r>
+        <w:rPr>
+          <w:b w:val="0"/>
+          <w:i w:val="0"/>
+          <w:sz w:val="19"/>
+        </w:rPr>
+        <w:t>Replicate pose-stability dynamics (2 ns each; seeds 1 and 2). RMSD: mean ligand heavy-atom RMSD over the second half of production (Å); Stable: RMSD at most 3.0 Å and centre-of-mass shift at most 6 Å. The first replica did not reach Shortlist 18 to 20 (–).</w:t>
+      </w:r>
+    </w:p>
+    <w:tbl>
+      <w:tblPr>
+        <w:tblStyle w:val="TableGrid"/>
+        <w:tblW w:type="auto" w:w="0"/>
+        <w:tblLook w:firstColumn="1" w:firstRow="1" w:lastColumn="0" w:lastRow="0" w:noHBand="0" w:noVBand="1" w:val="04A0"/>
+      </w:tblPr>
+      <w:tblGrid>
+        <w:gridCol w:w="1881"/>
+        <w:gridCol w:w="1881"/>
+        <w:gridCol w:w="1881"/>
+        <w:gridCol w:w="1881"/>
+        <w:gridCol w:w="1881"/>
+      </w:tblGrid>
+      <w:tr>
+        <w:tc>
+          <w:tcPr>
+            <w:tcW w:type="dxa" w:w="1881"/>
+            <w:shd w:val="clear" w:color="auto" w:fill="D9E2F3"/>
+          </w:tcPr>
+          <w:p>
+            <w:r/>
+            <w:r>
+              <w:rPr>
+                <w:b/>
+                <w:i w:val="0"/>
+                <w:sz w:val="17"/>
+              </w:rPr>
+              <w:t>Molecule</w:t>
+            </w:r>
+          </w:p>
+        </w:tc>
+        <w:tc>
+          <w:tcPr>
+            <w:tcW w:type="dxa" w:w="1881"/>
+            <w:shd w:val="clear" w:color="auto" w:fill="D9E2F3"/>
+          </w:tcPr>
+          <w:p>
+            <w:r/>
+            <w:r>
+              <w:rPr>
+                <w:b/>
+                <w:i w:val="0"/>
+                <w:sz w:val="17"/>
+              </w:rPr>
+              <w:t>RMSD 1</w:t>
+            </w:r>
+          </w:p>
+        </w:tc>
+        <w:tc>
+          <w:tcPr>
+            <w:tcW w:type="dxa" w:w="1881"/>
+            <w:shd w:val="clear" w:color="auto" w:fill="D9E2F3"/>
+          </w:tcPr>
+          <w:p>
+            <w:r/>
+            <w:r>
+              <w:rPr>
+                <w:b/>
+                <w:i w:val="0"/>
+                <w:sz w:val="17"/>
+              </w:rPr>
+              <w:t>RMSD 2</w:t>
+            </w:r>
+          </w:p>
+        </w:tc>
+        <w:tc>
+          <w:tcPr>
+            <w:tcW w:type="dxa" w:w="1881"/>
+            <w:shd w:val="clear" w:color="auto" w:fill="D9E2F3"/>
+          </w:tcPr>
+          <w:p>
+            <w:r/>
+            <w:r>
+              <w:rPr>
+                <w:b/>
+                <w:i w:val="0"/>
+                <w:sz w:val="17"/>
+              </w:rPr>
+              <w:t>Stable 1</w:t>
+            </w:r>
+          </w:p>
+        </w:tc>
+        <w:tc>
+          <w:tcPr>
+            <w:tcW w:type="dxa" w:w="1881"/>
+            <w:shd w:val="clear" w:color="auto" w:fill="D9E2F3"/>
+          </w:tcPr>
+          <w:p>
+            <w:r/>
+            <w:r>
+              <w:rPr>
+                <w:b/>
+                <w:i w:val="0"/>
+                <w:sz w:val="17"/>
+              </w:rPr>
+              <w:t>Stable 2</w:t>
+            </w:r>
+          </w:p>
+        </w:tc>
+      </w:tr>
+      <w:tr>
+        <w:tc>
+          <w:tcPr>
+            <w:tcW w:type="dxa" w:w="1881"/>
+          </w:tcPr>
+          <w:p>
+            <w:r/>
+            <w:r>
+              <w:rPr>
+                <w:b w:val="0"/>
+                <w:i w:val="0"/>
+                <w:sz w:val="17"/>
+              </w:rPr>
+              <w:t>donepezil (crystal pose)</w:t>
+            </w:r>
+          </w:p>
+        </w:tc>
+        <w:tc>
+          <w:tcPr>
+            <w:tcW w:type="dxa" w:w="1881"/>
+          </w:tcPr>
+          <w:p>
+            <w:r/>
+            <w:r>
+              <w:rPr>
+                <w:b w:val="0"/>
+                <w:i w:val="0"/>
+                <w:sz w:val="17"/>
+              </w:rPr>
+              <w:t>2.12</w:t>
+            </w:r>
+          </w:p>
+        </w:tc>
+        <w:tc>
+          <w:tcPr>
+            <w:tcW w:type="dxa" w:w="1881"/>
+          </w:tcPr>
+          <w:p>
+            <w:r/>
+            <w:r>
+              <w:rPr>
+                <w:b w:val="0"/>
+                <w:i w:val="0"/>
+                <w:sz w:val="17"/>
+              </w:rPr>
+              <w:t>3.13</w:t>
+            </w:r>
+          </w:p>
+        </w:tc>
+        <w:tc>
+          <w:tcPr>
+            <w:tcW w:type="dxa" w:w="1881"/>
+          </w:tcPr>
+          <w:p>
+            <w:r/>
+            <w:r>
+              <w:rPr>
+                <w:b w:val="0"/>
+                <w:i w:val="0"/>
+                <w:sz w:val="17"/>
+              </w:rPr>
+              <w:t>yes</w:t>
+            </w:r>
+          </w:p>
+        </w:tc>
+        <w:tc>
+          <w:tcPr>
+            <w:tcW w:type="dxa" w:w="1881"/>
+          </w:tcPr>
+          <w:p>
+            <w:r/>
+            <w:r>
+              <w:rPr>
+                <w:b w:val="0"/>
+                <w:i w:val="0"/>
+                <w:sz w:val="17"/>
+              </w:rPr>
+              <w:t>no</w:t>
+            </w:r>
+          </w:p>
+        </w:tc>
+      </w:tr>
+      <w:tr>
+        <w:tc>
+          <w:tcPr>
+            <w:tcW w:type="dxa" w:w="1881"/>
+          </w:tcPr>
+          <w:p>
+            <w:r/>
+            <w:r>
+              <w:rPr>
+                <w:b w:val="0"/>
+                <w:i w:val="0"/>
+                <w:sz w:val="17"/>
+              </w:rPr>
+              <w:t>Shortlist 1</w:t>
+            </w:r>
+          </w:p>
+        </w:tc>
+        <w:tc>
+          <w:tcPr>
+            <w:tcW w:type="dxa" w:w="1881"/>
+          </w:tcPr>
+          <w:p>
+            <w:r/>
+            <w:r>
+              <w:rPr>
+                <w:b w:val="0"/>
+                <w:i w:val="0"/>
+                <w:sz w:val="17"/>
+              </w:rPr>
+              <w:t>1.08</w:t>
+            </w:r>
+          </w:p>
+        </w:tc>
+        <w:tc>
+          <w:tcPr>
+            <w:tcW w:type="dxa" w:w="1881"/>
+          </w:tcPr>
+          <w:p>
+            <w:r/>
+            <w:r>
+              <w:rPr>
+                <w:b w:val="0"/>
+                <w:i w:val="0"/>
+                <w:sz w:val="17"/>
+              </w:rPr>
+              <w:t>0.75</w:t>
+            </w:r>
+          </w:p>
+        </w:tc>
+        <w:tc>
+          <w:tcPr>
+            <w:tcW w:type="dxa" w:w="1881"/>
+          </w:tcPr>
+          <w:p>
+            <w:r/>
+            <w:r>
+              <w:rPr>
+                <w:b w:val="0"/>
+                <w:i w:val="0"/>
+                <w:sz w:val="17"/>
+              </w:rPr>
+              <w:t>yes</w:t>
+            </w:r>
+          </w:p>
+        </w:tc>
+        <w:tc>
+          <w:tcPr>
+            <w:tcW w:type="dxa" w:w="1881"/>
+          </w:tcPr>
+          <w:p>
+            <w:r/>
+            <w:r>
+              <w:rPr>
+                <w:b w:val="0"/>
+                <w:i w:val="0"/>
+                <w:sz w:val="17"/>
+              </w:rPr>
+              <w:t>yes</w:t>
+            </w:r>
+          </w:p>
+        </w:tc>
+      </w:tr>
+      <w:tr>
+        <w:tc>
+          <w:tcPr>
+            <w:tcW w:type="dxa" w:w="1881"/>
+          </w:tcPr>
+          <w:p>
+            <w:r/>
+            <w:r>
+              <w:rPr>
+                <w:b w:val="0"/>
+                <w:i w:val="0"/>
+                <w:sz w:val="17"/>
+              </w:rPr>
+              <w:t>Shortlist 2</w:t>
+            </w:r>
+          </w:p>
+        </w:tc>
+        <w:tc>
+          <w:tcPr>
+            <w:tcW w:type="dxa" w:w="1881"/>
+          </w:tcPr>
+          <w:p>
+            <w:r/>
+            <w:r>
+              <w:rPr>
+                <w:b w:val="0"/>
+                <w:i w:val="0"/>
+                <w:sz w:val="17"/>
+              </w:rPr>
+              <w:t>2.64</w:t>
+            </w:r>
+          </w:p>
+        </w:tc>
+        <w:tc>
+          <w:tcPr>
+            <w:tcW w:type="dxa" w:w="1881"/>
+          </w:tcPr>
+          <w:p>
+            <w:r/>
+            <w:r>
+              <w:rPr>
+                <w:b w:val="0"/>
+                <w:i w:val="0"/>
+                <w:sz w:val="17"/>
+              </w:rPr>
+              <w:t>2.70</w:t>
+            </w:r>
+          </w:p>
+        </w:tc>
+        <w:tc>
+          <w:tcPr>
+            <w:tcW w:type="dxa" w:w="1881"/>
+          </w:tcPr>
+          <w:p>
+            <w:r/>
+            <w:r>
+              <w:rPr>
+                <w:b w:val="0"/>
+                <w:i w:val="0"/>
+                <w:sz w:val="17"/>
+              </w:rPr>
+              <w:t>yes</w:t>
+            </w:r>
+          </w:p>
+        </w:tc>
+        <w:tc>
+          <w:tcPr>
+            <w:tcW w:type="dxa" w:w="1881"/>
+          </w:tcPr>
+          <w:p>
+            <w:r/>
+            <w:r>
+              <w:rPr>
+                <w:b w:val="0"/>
+                <w:i w:val="0"/>
+                <w:sz w:val="17"/>
+              </w:rPr>
+              <w:t>yes</w:t>
+            </w:r>
+          </w:p>
+        </w:tc>
+      </w:tr>
+      <w:tr>
+        <w:tc>
+          <w:tcPr>
+            <w:tcW w:type="dxa" w:w="1881"/>
+          </w:tcPr>
+          <w:p>
+            <w:r/>
+            <w:r>
+              <w:rPr>
+                <w:b w:val="0"/>
+                <w:i w:val="0"/>
+                <w:sz w:val="17"/>
+              </w:rPr>
+              <w:t>Shortlist 3</w:t>
+            </w:r>
+          </w:p>
+        </w:tc>
+        <w:tc>
+          <w:tcPr>
+            <w:tcW w:type="dxa" w:w="1881"/>
+          </w:tcPr>
+          <w:p>
+            <w:r/>
+            <w:r>
+              <w:rPr>
+                <w:b w:val="0"/>
+                <w:i w:val="0"/>
+                <w:sz w:val="17"/>
+              </w:rPr>
+              <w:t>0.99</w:t>
+            </w:r>
+          </w:p>
+        </w:tc>
+        <w:tc>
+          <w:tcPr>
+            <w:tcW w:type="dxa" w:w="1881"/>
+          </w:tcPr>
+          <w:p>
+            <w:r/>
+            <w:r>
+              <w:rPr>
+                <w:b w:val="0"/>
+                <w:i w:val="0"/>
+                <w:sz w:val="17"/>
+              </w:rPr>
+              <w:t>1.98</w:t>
+            </w:r>
+          </w:p>
+        </w:tc>
+        <w:tc>
+          <w:tcPr>
+            <w:tcW w:type="dxa" w:w="1881"/>
+          </w:tcPr>
+          <w:p>
+            <w:r/>
+            <w:r>
+              <w:rPr>
+                <w:b w:val="0"/>
+                <w:i w:val="0"/>
+                <w:sz w:val="17"/>
+              </w:rPr>
+              <w:t>yes</w:t>
+            </w:r>
+          </w:p>
+        </w:tc>
+        <w:tc>
+          <w:tcPr>
+            <w:tcW w:type="dxa" w:w="1881"/>
+          </w:tcPr>
+          <w:p>
+            <w:r/>
+            <w:r>
+              <w:rPr>
+                <w:b w:val="0"/>
+                <w:i w:val="0"/>
+                <w:sz w:val="17"/>
+              </w:rPr>
+              <w:t>yes</w:t>
+            </w:r>
+          </w:p>
+        </w:tc>
+      </w:tr>
+      <w:tr>
+        <w:tc>
+          <w:tcPr>
+            <w:tcW w:type="dxa" w:w="1881"/>
+          </w:tcPr>
+          <w:p>
+            <w:r/>
+            <w:r>
+              <w:rPr>
+                <w:b w:val="0"/>
+                <w:i w:val="0"/>
+                <w:sz w:val="17"/>
+              </w:rPr>
+              <w:t>Shortlist 4</w:t>
+            </w:r>
+          </w:p>
+        </w:tc>
+        <w:tc>
+          <w:tcPr>
+            <w:tcW w:type="dxa" w:w="1881"/>
+          </w:tcPr>
+          <w:p>
+            <w:r/>
+            <w:r>
+              <w:rPr>
+                <w:b w:val="0"/>
+                <w:i w:val="0"/>
+                <w:sz w:val="17"/>
+              </w:rPr>
+              <w:t>2.53</w:t>
+            </w:r>
+          </w:p>
+        </w:tc>
+        <w:tc>
+          <w:tcPr>
+            <w:tcW w:type="dxa" w:w="1881"/>
+          </w:tcPr>
+          <w:p>
+            <w:r/>
+            <w:r>
+              <w:rPr>
+                <w:b w:val="0"/>
+                <w:i w:val="0"/>
+                <w:sz w:val="17"/>
+              </w:rPr>
+              <w:t>1.59</w:t>
+            </w:r>
+          </w:p>
+        </w:tc>
+        <w:tc>
+          <w:tcPr>
+            <w:tcW w:type="dxa" w:w="1881"/>
+          </w:tcPr>
+          <w:p>
+            <w:r/>
+            <w:r>
+              <w:rPr>
+                <w:b w:val="0"/>
+                <w:i w:val="0"/>
+                <w:sz w:val="17"/>
+              </w:rPr>
+              <w:t>yes</w:t>
+            </w:r>
+          </w:p>
+        </w:tc>
+        <w:tc>
+          <w:tcPr>
+            <w:tcW w:type="dxa" w:w="1881"/>
+          </w:tcPr>
+          <w:p>
+            <w:r/>
+            <w:r>
+              <w:rPr>
+                <w:b w:val="0"/>
+                <w:i w:val="0"/>
+                <w:sz w:val="17"/>
+              </w:rPr>
+              <w:t>yes</w:t>
+            </w:r>
+          </w:p>
+        </w:tc>
+      </w:tr>
+      <w:tr>
+        <w:tc>
+          <w:tcPr>
+            <w:tcW w:type="dxa" w:w="1881"/>
+          </w:tcPr>
+          <w:p>
+            <w:r/>
+            <w:r>
+              <w:rPr>
+                <w:b w:val="0"/>
+                <w:i w:val="0"/>
+                <w:sz w:val="17"/>
+              </w:rPr>
+              <w:t>Shortlist 5</w:t>
+            </w:r>
+          </w:p>
+        </w:tc>
+        <w:tc>
+          <w:tcPr>
+            <w:tcW w:type="dxa" w:w="1881"/>
+          </w:tcPr>
+          <w:p>
+            <w:r/>
+            <w:r>
+              <w:rPr>
+                <w:b w:val="0"/>
+                <w:i w:val="0"/>
+                <w:sz w:val="17"/>
+              </w:rPr>
+              <w:t>1.23</w:t>
+            </w:r>
+          </w:p>
+        </w:tc>
+        <w:tc>
+          <w:tcPr>
+            <w:tcW w:type="dxa" w:w="1881"/>
+          </w:tcPr>
+          <w:p>
+            <w:r/>
+            <w:r>
+              <w:rPr>
+                <w:b w:val="0"/>
+                <w:i w:val="0"/>
+                <w:sz w:val="17"/>
+              </w:rPr>
+              <w:t>2.15</w:t>
+            </w:r>
+          </w:p>
+        </w:tc>
+        <w:tc>
+          <w:tcPr>
+            <w:tcW w:type="dxa" w:w="1881"/>
+          </w:tcPr>
+          <w:p>
+            <w:r/>
+            <w:r>
+              <w:rPr>
+                <w:b w:val="0"/>
+                <w:i w:val="0"/>
+                <w:sz w:val="17"/>
+              </w:rPr>
+              <w:t>yes</w:t>
+            </w:r>
+          </w:p>
+        </w:tc>
+        <w:tc>
+          <w:tcPr>
+            <w:tcW w:type="dxa" w:w="1881"/>
+          </w:tcPr>
+          <w:p>
+            <w:r/>
+            <w:r>
+              <w:rPr>
+                <w:b w:val="0"/>
+                <w:i w:val="0"/>
+                <w:sz w:val="17"/>
+              </w:rPr>
+              <w:t>yes</w:t>
+            </w:r>
+          </w:p>
+        </w:tc>
+      </w:tr>
+      <w:tr>
+        <w:tc>
+          <w:tcPr>
+            <w:tcW w:type="dxa" w:w="1881"/>
+          </w:tcPr>
+          <w:p>
+            <w:r/>
+            <w:r>
+              <w:rPr>
+                <w:b w:val="0"/>
+                <w:i w:val="0"/>
+                <w:sz w:val="17"/>
+              </w:rPr>
+              <w:t>Shortlist 6</w:t>
+            </w:r>
+          </w:p>
+        </w:tc>
+        <w:tc>
+          <w:tcPr>
+            <w:tcW w:type="dxa" w:w="1881"/>
+          </w:tcPr>
+          <w:p>
+            <w:r/>
+            <w:r>
+              <w:rPr>
+                <w:b w:val="0"/>
+                <w:i w:val="0"/>
+                <w:sz w:val="17"/>
+              </w:rPr>
+              <w:t>1.48</w:t>
+            </w:r>
+          </w:p>
+        </w:tc>
+        <w:tc>
+          <w:tcPr>
+            <w:tcW w:type="dxa" w:w="1881"/>
+          </w:tcPr>
+          <w:p>
+            <w:r/>
+            <w:r>
+              <w:rPr>
+                <w:b w:val="0"/>
+                <w:i w:val="0"/>
+                <w:sz w:val="17"/>
+              </w:rPr>
+              <w:t>2.43</w:t>
+            </w:r>
+          </w:p>
+        </w:tc>
+        <w:tc>
+          <w:tcPr>
+            <w:tcW w:type="dxa" w:w="1881"/>
+          </w:tcPr>
+          <w:p>
+            <w:r/>
+            <w:r>
+              <w:rPr>
+                <w:b w:val="0"/>
+                <w:i w:val="0"/>
+                <w:sz w:val="17"/>
+              </w:rPr>
+              <w:t>yes</w:t>
+            </w:r>
+          </w:p>
+        </w:tc>
+        <w:tc>
+          <w:tcPr>
+            <w:tcW w:type="dxa" w:w="1881"/>
+          </w:tcPr>
+          <w:p>
+            <w:r/>
+            <w:r>
+              <w:rPr>
+                <w:b w:val="0"/>
+                <w:i w:val="0"/>
+                <w:sz w:val="17"/>
+              </w:rPr>
+              <w:t>yes</w:t>
+            </w:r>
+          </w:p>
+        </w:tc>
+      </w:tr>
+      <w:tr>
+        <w:tc>
+          <w:tcPr>
+            <w:tcW w:type="dxa" w:w="1881"/>
+          </w:tcPr>
+          <w:p>
+            <w:r/>
+            <w:r>
+              <w:rPr>
+                <w:b w:val="0"/>
+                <w:i w:val="0"/>
+                <w:sz w:val="17"/>
+              </w:rPr>
+              <w:t>Shortlist 7</w:t>
+            </w:r>
+          </w:p>
+        </w:tc>
+        <w:tc>
+          <w:tcPr>
+            <w:tcW w:type="dxa" w:w="1881"/>
+          </w:tcPr>
+          <w:p>
+            <w:r/>
+            <w:r>
+              <w:rPr>
+                <w:b w:val="0"/>
+                <w:i w:val="0"/>
+                <w:sz w:val="17"/>
+              </w:rPr>
+              <w:t>2.17</w:t>
+            </w:r>
+          </w:p>
+        </w:tc>
+        <w:tc>
+          <w:tcPr>
+            <w:tcW w:type="dxa" w:w="1881"/>
+          </w:tcPr>
+          <w:p>
+            <w:r/>
+            <w:r>
+              <w:rPr>
+                <w:b w:val="0"/>
+                <w:i w:val="0"/>
+                <w:sz w:val="17"/>
+              </w:rPr>
+              <w:t>1.75</w:t>
+            </w:r>
+          </w:p>
+        </w:tc>
+        <w:tc>
+          <w:tcPr>
+            <w:tcW w:type="dxa" w:w="1881"/>
+          </w:tcPr>
+          <w:p>
+            <w:r/>
+            <w:r>
+              <w:rPr>
+                <w:b w:val="0"/>
+                <w:i w:val="0"/>
+                <w:sz w:val="17"/>
+              </w:rPr>
+              <w:t>yes</w:t>
+            </w:r>
+          </w:p>
+        </w:tc>
+        <w:tc>
+          <w:tcPr>
+            <w:tcW w:type="dxa" w:w="1881"/>
+          </w:tcPr>
+          <w:p>
+            <w:r/>
+            <w:r>
+              <w:rPr>
+                <w:b w:val="0"/>
+                <w:i w:val="0"/>
+                <w:sz w:val="17"/>
+              </w:rPr>
+              <w:t>yes</w:t>
+            </w:r>
+          </w:p>
+        </w:tc>
+      </w:tr>
+      <w:tr>
+        <w:tc>
+          <w:tcPr>
+            <w:tcW w:type="dxa" w:w="1881"/>
+          </w:tcPr>
+          <w:p>
+            <w:r/>
+            <w:r>
+              <w:rPr>
+                <w:b w:val="0"/>
+                <w:i w:val="0"/>
+                <w:sz w:val="17"/>
+              </w:rPr>
+              <w:t>Shortlist 8</w:t>
+            </w:r>
+          </w:p>
+        </w:tc>
+        <w:tc>
+          <w:tcPr>
+            <w:tcW w:type="dxa" w:w="1881"/>
+          </w:tcPr>
+          <w:p>
+            <w:r/>
+            <w:r>
+              <w:rPr>
+                <w:b w:val="0"/>
+                <w:i w:val="0"/>
+                <w:sz w:val="17"/>
+              </w:rPr>
+              <w:t>0.99</w:t>
+            </w:r>
+          </w:p>
+        </w:tc>
+        <w:tc>
+          <w:tcPr>
+            <w:tcW w:type="dxa" w:w="1881"/>
+          </w:tcPr>
+          <w:p>
+            <w:r/>
+            <w:r>
+              <w:rPr>
+                <w:b w:val="0"/>
+                <w:i w:val="0"/>
+                <w:sz w:val="17"/>
+              </w:rPr>
+              <w:t>1.58</w:t>
+            </w:r>
+          </w:p>
+        </w:tc>
+        <w:tc>
+          <w:tcPr>
+            <w:tcW w:type="dxa" w:w="1881"/>
+          </w:tcPr>
+          <w:p>
+            <w:r/>
+            <w:r>
+              <w:rPr>
+                <w:b w:val="0"/>
+                <w:i w:val="0"/>
+                <w:sz w:val="17"/>
+              </w:rPr>
+              <w:t>yes</w:t>
+            </w:r>
+          </w:p>
+        </w:tc>
+        <w:tc>
+          <w:tcPr>
+            <w:tcW w:type="dxa" w:w="1881"/>
+          </w:tcPr>
+          <w:p>
+            <w:r/>
+            <w:r>
+              <w:rPr>
+                <w:b w:val="0"/>
+                <w:i w:val="0"/>
+                <w:sz w:val="17"/>
+              </w:rPr>
+              <w:t>yes</w:t>
+            </w:r>
+          </w:p>
+        </w:tc>
+      </w:tr>
+      <w:tr>
+        <w:tc>
+          <w:tcPr>
+            <w:tcW w:type="dxa" w:w="1881"/>
+          </w:tcPr>
+          <w:p>
+            <w:r/>
+            <w:r>
+              <w:rPr>
+                <w:b w:val="0"/>
+                <w:i w:val="0"/>
+                <w:sz w:val="17"/>
+              </w:rPr>
+              <w:t>Shortlist 9</w:t>
+            </w:r>
+          </w:p>
+        </w:tc>
+        <w:tc>
+          <w:tcPr>
+            <w:tcW w:type="dxa" w:w="1881"/>
+          </w:tcPr>
+          <w:p>
+            <w:r/>
+            <w:r>
+              <w:rPr>
+                <w:b w:val="0"/>
+                <w:i w:val="0"/>
+                <w:sz w:val="17"/>
+              </w:rPr>
+              <w:t>2.41</w:t>
+            </w:r>
+          </w:p>
+        </w:tc>
+        <w:tc>
+          <w:tcPr>
+            <w:tcW w:type="dxa" w:w="1881"/>
+          </w:tcPr>
+          <w:p>
+            <w:r/>
+            <w:r>
+              <w:rPr>
+                <w:b w:val="0"/>
+                <w:i w:val="0"/>
+                <w:sz w:val="17"/>
+              </w:rPr>
+              <w:t>1.92</w:t>
+            </w:r>
+          </w:p>
+        </w:tc>
+        <w:tc>
+          <w:tcPr>
+            <w:tcW w:type="dxa" w:w="1881"/>
+          </w:tcPr>
+          <w:p>
+            <w:r/>
+            <w:r>
+              <w:rPr>
+                <w:b w:val="0"/>
+                <w:i w:val="0"/>
+                <w:sz w:val="17"/>
+              </w:rPr>
+              <w:t>yes</w:t>
+            </w:r>
+          </w:p>
+        </w:tc>
+        <w:tc>
+          <w:tcPr>
+            <w:tcW w:type="dxa" w:w="1881"/>
+          </w:tcPr>
+          <w:p>
+            <w:r/>
+            <w:r>
+              <w:rPr>
+                <w:b w:val="0"/>
+                <w:i w:val="0"/>
+                <w:sz w:val="17"/>
+              </w:rPr>
+              <w:t>yes</w:t>
+            </w:r>
+          </w:p>
+        </w:tc>
+      </w:tr>
+      <w:tr>
+        <w:tc>
+          <w:tcPr>
+            <w:tcW w:type="dxa" w:w="1881"/>
+          </w:tcPr>
+          <w:p>
+            <w:r/>
+            <w:r>
+              <w:rPr>
+                <w:b w:val="0"/>
+                <w:i w:val="0"/>
+                <w:sz w:val="17"/>
+              </w:rPr>
+              <w:t>Shortlist 10</w:t>
+            </w:r>
+          </w:p>
+        </w:tc>
+        <w:tc>
+          <w:tcPr>
+            <w:tcW w:type="dxa" w:w="1881"/>
+          </w:tcPr>
+          <w:p>
+            <w:r/>
+            <w:r>
+              <w:rPr>
+                <w:b w:val="0"/>
+                <w:i w:val="0"/>
+                <w:sz w:val="17"/>
+              </w:rPr>
+              <w:t>0.71</w:t>
+            </w:r>
+          </w:p>
+        </w:tc>
+        <w:tc>
+          <w:tcPr>
+            <w:tcW w:type="dxa" w:w="1881"/>
+          </w:tcPr>
+          <w:p>
+            <w:r/>
+            <w:r>
+              <w:rPr>
+                <w:b w:val="0"/>
+                <w:i w:val="0"/>
+                <w:sz w:val="17"/>
+              </w:rPr>
+              <w:t>2.29</w:t>
+            </w:r>
+          </w:p>
+        </w:tc>
+        <w:tc>
+          <w:tcPr>
+            <w:tcW w:type="dxa" w:w="1881"/>
+          </w:tcPr>
+          <w:p>
+            <w:r/>
+            <w:r>
+              <w:rPr>
+                <w:b w:val="0"/>
+                <w:i w:val="0"/>
+                <w:sz w:val="17"/>
+              </w:rPr>
+              <w:t>yes</w:t>
+            </w:r>
+          </w:p>
+        </w:tc>
+        <w:tc>
+          <w:tcPr>
+            <w:tcW w:type="dxa" w:w="1881"/>
+          </w:tcPr>
+          <w:p>
+            <w:r/>
+            <w:r>
+              <w:rPr>
+                <w:b w:val="0"/>
+                <w:i w:val="0"/>
+                <w:sz w:val="17"/>
+              </w:rPr>
+              <w:t>yes</w:t>
+            </w:r>
+          </w:p>
+        </w:tc>
+      </w:tr>
+      <w:tr>
+        <w:tc>
+          <w:tcPr>
+            <w:tcW w:type="dxa" w:w="1881"/>
+          </w:tcPr>
+          <w:p>
+            <w:r/>
+            <w:r>
+              <w:rPr>
+                <w:b w:val="0"/>
+                <w:i w:val="0"/>
+                <w:sz w:val="17"/>
+              </w:rPr>
+              <w:t>Shortlist 11</w:t>
+            </w:r>
+          </w:p>
+        </w:tc>
+        <w:tc>
+          <w:tcPr>
+            <w:tcW w:type="dxa" w:w="1881"/>
+          </w:tcPr>
+          <w:p>
+            <w:r/>
+            <w:r>
+              <w:rPr>
+                <w:b w:val="0"/>
+                <w:i w:val="0"/>
+                <w:sz w:val="17"/>
+              </w:rPr>
+              <w:t>1.47</w:t>
+            </w:r>
+          </w:p>
+        </w:tc>
+        <w:tc>
+          <w:tcPr>
+            <w:tcW w:type="dxa" w:w="1881"/>
+          </w:tcPr>
+          <w:p>
+            <w:r/>
+            <w:r>
+              <w:rPr>
+                <w:b w:val="0"/>
+                <w:i w:val="0"/>
+                <w:sz w:val="17"/>
+              </w:rPr>
+              <w:t>2.52</w:t>
+            </w:r>
+          </w:p>
+        </w:tc>
+        <w:tc>
+          <w:tcPr>
+            <w:tcW w:type="dxa" w:w="1881"/>
+          </w:tcPr>
+          <w:p>
+            <w:r/>
+            <w:r>
+              <w:rPr>
+                <w:b w:val="0"/>
+                <w:i w:val="0"/>
+                <w:sz w:val="17"/>
+              </w:rPr>
+              <w:t>yes</w:t>
+            </w:r>
+          </w:p>
+        </w:tc>
+        <w:tc>
+          <w:tcPr>
+            <w:tcW w:type="dxa" w:w="1881"/>
+          </w:tcPr>
+          <w:p>
+            <w:r/>
+            <w:r>
+              <w:rPr>
+                <w:b w:val="0"/>
+                <w:i w:val="0"/>
+                <w:sz w:val="17"/>
+              </w:rPr>
+              <w:t>yes</w:t>
+            </w:r>
+          </w:p>
+        </w:tc>
+      </w:tr>
+      <w:tr>
+        <w:tc>
+          <w:tcPr>
+            <w:tcW w:type="dxa" w:w="1881"/>
+          </w:tcPr>
+          <w:p>
+            <w:r/>
+            <w:r>
+              <w:rPr>
+                <w:b w:val="0"/>
+                <w:i w:val="0"/>
+                <w:sz w:val="17"/>
+              </w:rPr>
+              <w:t>Shortlist 12</w:t>
+            </w:r>
+          </w:p>
+        </w:tc>
+        <w:tc>
+          <w:tcPr>
+            <w:tcW w:type="dxa" w:w="1881"/>
+          </w:tcPr>
+          <w:p>
+            <w:r/>
+            <w:r>
+              <w:rPr>
+                <w:b w:val="0"/>
+                <w:i w:val="0"/>
+                <w:sz w:val="17"/>
+              </w:rPr>
+              <w:t>4.16</w:t>
+            </w:r>
+          </w:p>
+        </w:tc>
+        <w:tc>
+          <w:tcPr>
+            <w:tcW w:type="dxa" w:w="1881"/>
+          </w:tcPr>
+          <w:p>
+            <w:r/>
+            <w:r>
+              <w:rPr>
+                <w:b w:val="0"/>
+                <w:i w:val="0"/>
+                <w:sz w:val="17"/>
+              </w:rPr>
+              <w:t>1.28</w:t>
+            </w:r>
+          </w:p>
+        </w:tc>
+        <w:tc>
+          <w:tcPr>
+            <w:tcW w:type="dxa" w:w="1881"/>
+          </w:tcPr>
+          <w:p>
+            <w:r/>
+            <w:r>
+              <w:rPr>
+                <w:b w:val="0"/>
+                <w:i w:val="0"/>
+                <w:sz w:val="17"/>
+              </w:rPr>
+              <w:t>no</w:t>
+            </w:r>
+          </w:p>
+        </w:tc>
+        <w:tc>
+          <w:tcPr>
+            <w:tcW w:type="dxa" w:w="1881"/>
+          </w:tcPr>
+          <w:p>
+            <w:r/>
+            <w:r>
+              <w:rPr>
+                <w:b w:val="0"/>
+                <w:i w:val="0"/>
+                <w:sz w:val="17"/>
+              </w:rPr>
+              <w:t>yes</w:t>
+            </w:r>
+          </w:p>
+        </w:tc>
+      </w:tr>
+      <w:tr>
+        <w:tc>
+          <w:tcPr>
+            <w:tcW w:type="dxa" w:w="1881"/>
+          </w:tcPr>
+          <w:p>
+            <w:r/>
+            <w:r>
+              <w:rPr>
+                <w:b w:val="0"/>
+                <w:i w:val="0"/>
+                <w:sz w:val="17"/>
+              </w:rPr>
+              <w:t>Shortlist 13</w:t>
+            </w:r>
+          </w:p>
+        </w:tc>
+        <w:tc>
+          <w:tcPr>
+            <w:tcW w:type="dxa" w:w="1881"/>
+          </w:tcPr>
+          <w:p>
+            <w:r/>
+            <w:r>
+              <w:rPr>
+                <w:b w:val="0"/>
+                <w:i w:val="0"/>
+                <w:sz w:val="17"/>
+              </w:rPr>
+              <w:t>1.98</w:t>
+            </w:r>
+          </w:p>
+        </w:tc>
+        <w:tc>
+          <w:tcPr>
+            <w:tcW w:type="dxa" w:w="1881"/>
+          </w:tcPr>
+          <w:p>
+            <w:r/>
+            <w:r>
+              <w:rPr>
+                <w:b w:val="0"/>
+                <w:i w:val="0"/>
+                <w:sz w:val="17"/>
+              </w:rPr>
+              <w:t>3.81</w:t>
+            </w:r>
+          </w:p>
+        </w:tc>
+        <w:tc>
+          <w:tcPr>
+            <w:tcW w:type="dxa" w:w="1881"/>
+          </w:tcPr>
+          <w:p>
+            <w:r/>
+            <w:r>
+              <w:rPr>
+                <w:b w:val="0"/>
+                <w:i w:val="0"/>
+                <w:sz w:val="17"/>
+              </w:rPr>
+              <w:t>yes</w:t>
+            </w:r>
+          </w:p>
+        </w:tc>
+        <w:tc>
+          <w:tcPr>
+            <w:tcW w:type="dxa" w:w="1881"/>
+          </w:tcPr>
+          <w:p>
+            <w:r/>
+            <w:r>
+              <w:rPr>
+                <w:b w:val="0"/>
+                <w:i w:val="0"/>
+                <w:sz w:val="17"/>
+              </w:rPr>
+              <w:t>no</w:t>
+            </w:r>
+          </w:p>
+        </w:tc>
+      </w:tr>
+      <w:tr>
+        <w:tc>
+          <w:tcPr>
+            <w:tcW w:type="dxa" w:w="1881"/>
+          </w:tcPr>
+          <w:p>
+            <w:r/>
+            <w:r>
+              <w:rPr>
+                <w:b w:val="0"/>
+                <w:i w:val="0"/>
+                <w:sz w:val="17"/>
+              </w:rPr>
+              <w:t>Shortlist 14</w:t>
+            </w:r>
+          </w:p>
+        </w:tc>
+        <w:tc>
+          <w:tcPr>
+            <w:tcW w:type="dxa" w:w="1881"/>
+          </w:tcPr>
+          <w:p>
+            <w:r/>
+            <w:r>
+              <w:rPr>
+                <w:b w:val="0"/>
+                <w:i w:val="0"/>
+                <w:sz w:val="17"/>
+              </w:rPr>
+              <w:t>1.42</w:t>
+            </w:r>
+          </w:p>
+        </w:tc>
+        <w:tc>
+          <w:tcPr>
+            <w:tcW w:type="dxa" w:w="1881"/>
+          </w:tcPr>
+          <w:p>
+            <w:r/>
+            <w:r>
+              <w:rPr>
+                <w:b w:val="0"/>
+                <w:i w:val="0"/>
+                <w:sz w:val="17"/>
+              </w:rPr>
+              <w:t>1.15</w:t>
+            </w:r>
+          </w:p>
+        </w:tc>
+        <w:tc>
+          <w:tcPr>
+            <w:tcW w:type="dxa" w:w="1881"/>
+          </w:tcPr>
+          <w:p>
+            <w:r/>
+            <w:r>
+              <w:rPr>
+                <w:b w:val="0"/>
+                <w:i w:val="0"/>
+                <w:sz w:val="17"/>
+              </w:rPr>
+              <w:t>yes</w:t>
+            </w:r>
+          </w:p>
+        </w:tc>
+        <w:tc>
+          <w:tcPr>
+            <w:tcW w:type="dxa" w:w="1881"/>
+          </w:tcPr>
+          <w:p>
+            <w:r/>
+            <w:r>
+              <w:rPr>
+                <w:b w:val="0"/>
+                <w:i w:val="0"/>
+                <w:sz w:val="17"/>
+              </w:rPr>
+              <w:t>yes</w:t>
+            </w:r>
+          </w:p>
+        </w:tc>
+      </w:tr>
+      <w:tr>
+        <w:tc>
+          <w:tcPr>
+            <w:tcW w:type="dxa" w:w="1881"/>
+          </w:tcPr>
+          <w:p>
+            <w:r/>
+            <w:r>
+              <w:rPr>
+                <w:b w:val="0"/>
+                <w:i w:val="0"/>
+                <w:sz w:val="17"/>
+              </w:rPr>
+              <w:t>Shortlist 15</w:t>
+            </w:r>
+          </w:p>
+        </w:tc>
+        <w:tc>
+          <w:tcPr>
+            <w:tcW w:type="dxa" w:w="1881"/>
+          </w:tcPr>
+          <w:p>
+            <w:r/>
+            <w:r>
+              <w:rPr>
+                <w:b w:val="0"/>
+                <w:i w:val="0"/>
+                <w:sz w:val="17"/>
+              </w:rPr>
+              <w:t>2.27</w:t>
+            </w:r>
+          </w:p>
+        </w:tc>
+        <w:tc>
+          <w:tcPr>
+            <w:tcW w:type="dxa" w:w="1881"/>
+          </w:tcPr>
+          <w:p>
+            <w:r/>
+            <w:r>
+              <w:rPr>
+                <w:b w:val="0"/>
+                <w:i w:val="0"/>
+                <w:sz w:val="17"/>
+              </w:rPr>
+              <w:t>1.01</w:t>
+            </w:r>
+          </w:p>
+        </w:tc>
+        <w:tc>
+          <w:tcPr>
+            <w:tcW w:type="dxa" w:w="1881"/>
+          </w:tcPr>
+          <w:p>
+            <w:r/>
+            <w:r>
+              <w:rPr>
+                <w:b w:val="0"/>
+                <w:i w:val="0"/>
+                <w:sz w:val="17"/>
+              </w:rPr>
+              <w:t>yes</w:t>
+            </w:r>
+          </w:p>
+        </w:tc>
+        <w:tc>
+          <w:tcPr>
+            <w:tcW w:type="dxa" w:w="1881"/>
+          </w:tcPr>
+          <w:p>
+            <w:r/>
+            <w:r>
+              <w:rPr>
+                <w:b w:val="0"/>
+                <w:i w:val="0"/>
+                <w:sz w:val="17"/>
+              </w:rPr>
+              <w:t>yes</w:t>
+            </w:r>
+          </w:p>
+        </w:tc>
+      </w:tr>
+      <w:tr>
+        <w:tc>
+          <w:tcPr>
+            <w:tcW w:type="dxa" w:w="1881"/>
+          </w:tcPr>
+          <w:p>
+            <w:r/>
+            <w:r>
+              <w:rPr>
+                <w:b w:val="0"/>
+                <w:i w:val="0"/>
+                <w:sz w:val="17"/>
+              </w:rPr>
+              <w:t>Shortlist 16</w:t>
+            </w:r>
+          </w:p>
+        </w:tc>
+        <w:tc>
+          <w:tcPr>
+            <w:tcW w:type="dxa" w:w="1881"/>
+          </w:tcPr>
+          <w:p>
+            <w:r/>
+            <w:r>
+              <w:rPr>
+                <w:b w:val="0"/>
+                <w:i w:val="0"/>
+                <w:sz w:val="17"/>
+              </w:rPr>
+              <w:t>1.33</w:t>
+            </w:r>
+          </w:p>
+        </w:tc>
+        <w:tc>
+          <w:tcPr>
+            <w:tcW w:type="dxa" w:w="1881"/>
+          </w:tcPr>
+          <w:p>
+            <w:r/>
+            <w:r>
+              <w:rPr>
+                <w:b w:val="0"/>
+                <w:i w:val="0"/>
+                <w:sz w:val="17"/>
+              </w:rPr>
+              <w:t>1.89</w:t>
+            </w:r>
+          </w:p>
+        </w:tc>
+        <w:tc>
+          <w:tcPr>
+            <w:tcW w:type="dxa" w:w="1881"/>
+          </w:tcPr>
+          <w:p>
+            <w:r/>
+            <w:r>
+              <w:rPr>
+                <w:b w:val="0"/>
+                <w:i w:val="0"/>
+                <w:sz w:val="17"/>
+              </w:rPr>
+              <w:t>yes</w:t>
+            </w:r>
+          </w:p>
+        </w:tc>
+        <w:tc>
+          <w:tcPr>
+            <w:tcW w:type="dxa" w:w="1881"/>
+          </w:tcPr>
+          <w:p>
+            <w:r/>
+            <w:r>
+              <w:rPr>
+                <w:b w:val="0"/>
+                <w:i w:val="0"/>
+                <w:sz w:val="17"/>
+              </w:rPr>
+              <w:t>yes</w:t>
+            </w:r>
+          </w:p>
+        </w:tc>
+      </w:tr>
+      <w:tr>
+        <w:tc>
+          <w:tcPr>
+            <w:tcW w:type="dxa" w:w="1881"/>
+          </w:tcPr>
+          <w:p>
+            <w:r/>
+            <w:r>
+              <w:rPr>
+                <w:b w:val="0"/>
+                <w:i w:val="0"/>
+                <w:sz w:val="17"/>
+              </w:rPr>
+              <w:t>Shortlist 17</w:t>
+            </w:r>
+          </w:p>
+        </w:tc>
+        <w:tc>
+          <w:tcPr>
+            <w:tcW w:type="dxa" w:w="1881"/>
+          </w:tcPr>
+          <w:p>
+            <w:r/>
+            <w:r>
+              <w:rPr>
+                <w:b w:val="0"/>
+                <w:i w:val="0"/>
+                <w:sz w:val="17"/>
+              </w:rPr>
+              <w:t>0.99</w:t>
+            </w:r>
+          </w:p>
+        </w:tc>
+        <w:tc>
+          <w:tcPr>
+            <w:tcW w:type="dxa" w:w="1881"/>
+          </w:tcPr>
+          <w:p>
+            <w:r/>
+            <w:r>
+              <w:rPr>
+                <w:b w:val="0"/>
+                <w:i w:val="0"/>
+                <w:sz w:val="17"/>
+              </w:rPr>
+              <w:t>0.83</w:t>
+            </w:r>
+          </w:p>
+        </w:tc>
+        <w:tc>
+          <w:tcPr>
+            <w:tcW w:type="dxa" w:w="1881"/>
+          </w:tcPr>
+          <w:p>
+            <w:r/>
+            <w:r>
+              <w:rPr>
+                <w:b w:val="0"/>
+                <w:i w:val="0"/>
+                <w:sz w:val="17"/>
+              </w:rPr>
+              <w:t>yes</w:t>
+            </w:r>
+          </w:p>
+        </w:tc>
+        <w:tc>
+          <w:tcPr>
+            <w:tcW w:type="dxa" w:w="1881"/>
+          </w:tcPr>
+          <w:p>
+            <w:r/>
+            <w:r>
+              <w:rPr>
+                <w:b w:val="0"/>
+                <w:i w:val="0"/>
+                <w:sz w:val="17"/>
+              </w:rPr>
+              <w:t>yes</w:t>
+            </w:r>
+          </w:p>
+        </w:tc>
+      </w:tr>
+      <w:tr>
+        <w:tc>
+          <w:tcPr>
+            <w:tcW w:type="dxa" w:w="1881"/>
+          </w:tcPr>
+          <w:p>
+            <w:r/>
+            <w:r>
+              <w:rPr>
+                <w:b w:val="0"/>
+                <w:i w:val="0"/>
+                <w:sz w:val="17"/>
+              </w:rPr>
+              <w:t>Shortlist 18</w:t>
+            </w:r>
+          </w:p>
+        </w:tc>
+        <w:tc>
+          <w:tcPr>
+            <w:tcW w:type="dxa" w:w="1881"/>
+          </w:tcPr>
+          <w:p>
+            <w:r/>
+            <w:r>
+              <w:rPr>
+                <w:b w:val="0"/>
+                <w:i w:val="0"/>
+                <w:sz w:val="17"/>
+              </w:rPr>
+              <w:t>–</w:t>
+            </w:r>
+          </w:p>
+        </w:tc>
+        <w:tc>
+          <w:tcPr>
+            <w:tcW w:type="dxa" w:w="1881"/>
+          </w:tcPr>
+          <w:p>
+            <w:r/>
+            <w:r>
+              <w:rPr>
+                <w:b w:val="0"/>
+                <w:i w:val="0"/>
+                <w:sz w:val="17"/>
+              </w:rPr>
+              <w:t>0.84</w:t>
+            </w:r>
+          </w:p>
+        </w:tc>
+        <w:tc>
+          <w:tcPr>
+            <w:tcW w:type="dxa" w:w="1881"/>
+          </w:tcPr>
+          <w:p>
+            <w:r/>
+            <w:r>
+              <w:rPr>
+                <w:b w:val="0"/>
+                <w:i w:val="0"/>
+                <w:sz w:val="17"/>
+              </w:rPr>
+              <w:t>–</w:t>
+            </w:r>
+          </w:p>
+        </w:tc>
+        <w:tc>
+          <w:tcPr>
+            <w:tcW w:type="dxa" w:w="1881"/>
+          </w:tcPr>
+          <w:p>
+            <w:r/>
+            <w:r>
+              <w:rPr>
+                <w:b w:val="0"/>
+                <w:i w:val="0"/>
+                <w:sz w:val="17"/>
+              </w:rPr>
+              <w:t>yes</w:t>
+            </w:r>
+          </w:p>
+        </w:tc>
+      </w:tr>
+      <w:tr>
+        <w:tc>
+          <w:tcPr>
+            <w:tcW w:type="dxa" w:w="1881"/>
+          </w:tcPr>
+          <w:p>
+            <w:r/>
+            <w:r>
+              <w:rPr>
+                <w:b w:val="0"/>
+                <w:i w:val="0"/>
+                <w:sz w:val="17"/>
+              </w:rPr>
+              <w:t>Shortlist 19</w:t>
+            </w:r>
+          </w:p>
+        </w:tc>
+        <w:tc>
+          <w:tcPr>
+            <w:tcW w:type="dxa" w:w="1881"/>
+          </w:tcPr>
+          <w:p>
+            <w:r/>
+            <w:r>
+              <w:rPr>
+                <w:b w:val="0"/>
+                <w:i w:val="0"/>
+                <w:sz w:val="17"/>
+              </w:rPr>
+              <w:t>–</w:t>
+            </w:r>
+          </w:p>
+        </w:tc>
+        <w:tc>
+          <w:tcPr>
+            <w:tcW w:type="dxa" w:w="1881"/>
+          </w:tcPr>
+          <w:p>
+            <w:r/>
+            <w:r>
+              <w:rPr>
+                <w:b w:val="0"/>
+                <w:i w:val="0"/>
+                <w:sz w:val="17"/>
+              </w:rPr>
+              <w:t>0.65</w:t>
+            </w:r>
+          </w:p>
+        </w:tc>
+        <w:tc>
+          <w:tcPr>
+            <w:tcW w:type="dxa" w:w="1881"/>
+          </w:tcPr>
+          <w:p>
+            <w:r/>
+            <w:r>
+              <w:rPr>
+                <w:b w:val="0"/>
+                <w:i w:val="0"/>
+                <w:sz w:val="17"/>
+              </w:rPr>
+              <w:t>–</w:t>
+            </w:r>
+          </w:p>
+        </w:tc>
+        <w:tc>
+          <w:tcPr>
+            <w:tcW w:type="dxa" w:w="1881"/>
+          </w:tcPr>
+          <w:p>
+            <w:r/>
+            <w:r>
+              <w:rPr>
+                <w:b w:val="0"/>
+                <w:i w:val="0"/>
+                <w:sz w:val="17"/>
+              </w:rPr>
+              <w:t>yes</w:t>
+            </w:r>
+          </w:p>
+        </w:tc>
+      </w:tr>
+      <w:tr>
+        <w:tc>
+          <w:tcPr>
+            <w:tcW w:type="dxa" w:w="1881"/>
+          </w:tcPr>
+          <w:p>
+            <w:r/>
+            <w:r>
+              <w:rPr>
+                <w:b w:val="0"/>
+                <w:i w:val="0"/>
+                <w:sz w:val="17"/>
+              </w:rPr>
+              <w:t>Shortlist 20</w:t>
+            </w:r>
+          </w:p>
+        </w:tc>
+        <w:tc>
+          <w:tcPr>
+            <w:tcW w:type="dxa" w:w="1881"/>
+          </w:tcPr>
+          <w:p>
+            <w:r/>
+            <w:r>
+              <w:rPr>
+                <w:b w:val="0"/>
+                <w:i w:val="0"/>
+                <w:sz w:val="17"/>
+              </w:rPr>
+              <w:t>–</w:t>
+            </w:r>
+          </w:p>
+        </w:tc>
+        <w:tc>
+          <w:tcPr>
+            <w:tcW w:type="dxa" w:w="1881"/>
+          </w:tcPr>
+          <w:p>
+            <w:r/>
+            <w:r>
+              <w:rPr>
+                <w:b w:val="0"/>
+                <w:i w:val="0"/>
+                <w:sz w:val="17"/>
+              </w:rPr>
+              <w:t>1.17</w:t>
+            </w:r>
+          </w:p>
+        </w:tc>
+        <w:tc>
+          <w:tcPr>
+            <w:tcW w:type="dxa" w:w="1881"/>
+          </w:tcPr>
+          <w:p>
+            <w:r/>
+            <w:r>
+              <w:rPr>
+                <w:b w:val="0"/>
+                <w:i w:val="0"/>
+                <w:sz w:val="17"/>
+              </w:rPr>
+              <w:t>–</w:t>
+            </w:r>
+          </w:p>
+        </w:tc>
+        <w:tc>
+          <w:tcPr>
+            <w:tcW w:type="dxa" w:w="1881"/>
+          </w:tcPr>
+          <w:p>
+            <w:r/>
+            <w:r>
+              <w:rPr>
+                <w:b w:val="0"/>
+                <w:i w:val="0"/>
+                <w:sz w:val="17"/>
+              </w:rPr>
+              <w:t>yes</w:t>
+            </w:r>
+          </w:p>
+        </w:tc>
+      </w:tr>
+    </w:tbl>
+    <w:p>
       <w:pPr>
         <w:pStyle w:val="Heading2"/>
       </w:pPr>
@@ -12489,7 +14337,7 @@
           <w:b w:val="0"/>
           <w:i w:val="0"/>
         </w:rPr>
-        <w:t>Nothing reported here has been synthesized or assayed; every property is a prediction. The activity model is reliable only near known chemistry (in the time-split test it did not beat nearest-neighbour similarity for compounds unlike its training set, Section 2.8), the docking score is a weak filter, the exposure estimate is a regression on total brain-to-blood ratios (cross-validated RMSE 0.55 log units, a typical error of a factor of about 3.5) and not a measured unbound ratio, and the P-gp and BCRP models are proxies. The margin that ranks the molecules is defined by those models, so a larger margin means the molecule sits farther inside their thresholds and not that it is a more potent inhibitor. The statement that these 106 molecules are the strongest we could find holds for the 2,700 designs generated and for the gates stated in Table 10; molecules outside the library, from a different generator, or judged by different models are not covered. The set is also a selection near threshold edges: only the 63 priority-tier molecules have at least 10 % margin, and none of the 106 can be ranked for hERG risk with the models we have. The edits come from a matched-pair library whose transformations are mostly exploratory-tier (all 106 delivered molecules) and are matched on the fragment and its attachment atom only, so an exchange that is common in the library may be a poor choice on a given scaffold; the retrosynthesis check is the evidence that the molecules can be made, and it is a computed route and not a demonstrated one. In a blind re-discovery test the edit library did not find later-reported compounds better than random draws of other edits, so we do not claim that the edit selection adds anything beyond the gates and the anchoring to measured parents. The first experimental step is an Ellman assay[25] for AChE inhibition with donepezil on the same plate, a BChE counter-screen, an MDCK-MDR1 permeability assay with and without a P-gp inhibitor, a BCRP transport assay and hERG patch clamp, beginning with the molecules that have a one- or two-step route.</w:t>
+        <w:t>Nothing reported here has been synthesized or assayed; every property is a prediction. The activity model is reliable only near known chemistry (in the time-split test it did not beat nearest-neighbour similarity for compounds unlike its training set, Section 2.8), the docking score is a weak filter, the exposure estimate is a regression on total brain-to-blood ratios (cross-validated RMSE 0.55 log units, a typical error of a factor of about 3.5) and not a measured unbound ratio, and the P-gp and BCRP models are proxies. The margin that ranks the molecules is defined by those models, so a larger margin means the molecule sits farther inside their thresholds and not that it is a more potent inhibitor. The statement that these 106 molecules are the strongest we could find holds for the 2,700 designs generated and for the gates stated in Table 11; molecules outside the library, from a different generator, or judged by different models are not covered. The set is also a selection near threshold edges: only the 63 priority-tier molecules have at least 10 % margin, and none of the 106 can be ranked for hERG risk with the models we have. The edits come from a matched-pair library whose transformations are mostly exploratory-tier (all 106 delivered molecules) and are matched on the fragment and its attachment atom only, so an exchange that is common in the library may be a poor choice on a given scaffold; the retrosynthesis check is the evidence that the molecules can be made, and it is a computed route and not a demonstrated one. In a blind re-discovery test the edit library did not find later-reported compounds better than random draws of other edits, so we do not claim that the edit selection adds anything beyond the gates and the anchoring to measured parents. The first experimental step is an Ellman assay[25] for AChE inhibition with donepezil on the same plate, a BChE counter-screen, an MDCK-MDR1 permeability assay with and without a P-gp inhibitor, a BCRP transport assay and hERG patch clamp, beginning with the molecules that have a one- or two-step route.</w:t>
       </w:r>
     </w:p>
     <w:p>
@@ -12596,7 +14444,7 @@
           <w:b w:val="0"/>
           <w:i w:val="0"/>
         </w:rPr>
-        <w:t>Round 1 applied each of the 222 transformations once to all 2,225 parents (38,209 distinct analogues). Round 2 applied a second transformation to 16,000 round-1 products, a random sample (seed 0) of the size-filtered round-1 analogues, giving 345,543 further analogues; the two rounds together are the 383,752 distinct one- or two-edit analogues of this study (Table 9). These were reduced at the design stage in the order of Table 9: removal of structures already present in the project's training data, size, CNS MPO, synthetic-accessibility, PAINS[34]/Brenk[35] and unstable-group filters, agreement of two independent BBB models, a predicted AChE probability of at least 0.5, and a limit of eight designs per scaffold chosen by a confidence score. The 2,454 survivors of the 16,000-seed run and 859 designs from the earlier single-edit run (613 shared) form the 2,700 stored designs, from 386 distinct parents, of which 1,838 are two-edit and 862 one-edit molecules. The gates of Section 4.3 were applied to these 2,700 designs only, so the 383,752 analogues are a pool that was screened by the design-stage filters and not by the audited gates.</w:t>
+        <w:t>Round 1 applied each of the 222 transformations once to all 2,225 parents (38,209 distinct analogues). Round 2 applied a second transformation to 16,000 round-1 products, a random sample (seed 0) of the size-filtered round-1 analogues, giving 345,543 further analogues; the two rounds together are the 383,752 distinct one- or two-edit analogues of this study (Table 10). These were reduced at the design stage in the order of Table 10: removal of structures already present in the project's training data, size, CNS MPO, synthetic-accessibility, PAINS[34]/Brenk[35] and unstable-group filters, agreement of two independent BBB models, a predicted AChE probability of at least 0.5, and a limit of eight designs per scaffold chosen by a confidence score. The 2,454 survivors of the 16,000-seed run and 859 designs from the earlier single-edit run (613 shared) form the 2,700 stored designs, from 386 distinct parents, of which 1,838 are two-edit and 862 one-edit molecules. The gates of Section 4.3 were applied to these 2,700 designs only, so the 383,752 analogues are a pool that was screened by the design-stage filters and not by the audited gates.</w:t>
       </w:r>
     </w:p>
     <w:p>
@@ -12605,7 +14453,7 @@
           <w:b w:val="0"/>
           <w:i w:val="0"/>
         </w:rPr>
-        <w:t>The delivered molecules use only 22 distinct transformations, all of them ordinary medicinal-chemistry substitutions: methyl to cyclopropyl (22); phenyl to methyl (14); methoxy to methyl (11); methyl to cyclopropylmethyl (11); ethyl to propyl (8); methoxy to methylthio (7). 39 of the 106 are one-edit and 67 two-edit molecules; all 106 come from exploratory-tier transformations (median 9 pairs per transformation, range 5 to 111), and only 5 carry a transformation with q&lt;0.05. The transformation statistics describe how an edit moved brain penetration in other compounds; they do not show that an edit preserves AChE inhibition on a particular parent, which is only predicted by the activity model, and the matched-pair statistics did no better than random edits when tested (Table 10). That an edit can be made is supported differently: each delivered molecule has a computed route of one to six steps from purchasable materials, found by retrosynthesis and independent of the transformation library (Section 4.7).</w:t>
+        <w:t>The delivered molecules use only 22 distinct transformations, all of them ordinary medicinal-chemistry substitutions: methyl to cyclopropyl (22); phenyl to methyl (14); methoxy to methyl (11); methyl to cyclopropylmethyl (11); ethyl to propyl (8); methoxy to methylthio (7). 39 of the 106 are one-edit and 67 two-edit molecules; all 106 come from exploratory-tier transformations (median 9 pairs per transformation, range 5 to 111), and only 5 carry a transformation with q&lt;0.05. The transformation statistics describe how an edit moved brain penetration in other compounds; they do not show that an edit preserves AChE inhibition on a particular parent, which is only predicted by the activity model, and the matched-pair statistics did no better than random edits when tested (Table 11). That an edit can be made is supported differently: each delivered molecule has a computed route of one to six steps from purchasable materials, found by retrosynthesis and independent of the transformation library (Section 4.7).</w:t>
       </w:r>
     </w:p>
     <w:p>
@@ -12613,7 +14461,7 @@
         <w:rPr>
           <w:b/>
         </w:rPr>
-        <w:t xml:space="preserve">Table 9. </w:t>
+        <w:t xml:space="preserve">Table 10. </w:t>
       </w:r>
       <w:r>
         <w:rPr>
@@ -12621,7 +14469,7 @@
           <w:i w:val="0"/>
           <w:sz w:val="19"/>
         </w:rPr>
-        <w:t>Generation of the stored designs: from the potent published parents to the 2,700 designs that enter the gates of Table 10. Counts are from the design runs; the shared designs are those found in both runs.</w:t>
+        <w:t>Generation of the stored designs: from the potent published parents to the 2,700 designs that enter the gates of Table 11. Counts are from the design runs; the shared designs are those found in both runs.</w:t>
       </w:r>
     </w:p>
     <w:tbl>
@@ -13093,7 +14941,7 @@
           <w:b w:val="0"/>
           <w:i w:val="0"/>
         </w:rPr>
-        <w:t xml:space="preserve">The stored designs of Section 4.2 entered the gates in the order below. Candidates had to pass the gates of Table 10 in this order. Two kinds of threshold are used: </w:t>
+        <w:t xml:space="preserve">The stored designs of Section 4.2 entered the gates in the order below. Candidates had to pass the gates of Table 11 in this order. Two kinds of threshold are used: </w:t>
       </w:r>
       <w:r>
         <w:rPr>
@@ -13157,7 +15005,7 @@
         <w:rPr>
           <w:b/>
         </w:rPr>
-        <w:t xml:space="preserve">Table 10. </w:t>
+        <w:t xml:space="preserve">Table 11. </w:t>
       </w:r>
       <w:r>
         <w:rPr>
@@ -14003,7 +15851,7 @@
           <w:b w:val="0"/>
           <w:i w:val="0"/>
         </w:rPr>
-        <w:t>Pose-stability dynamics. The 20 shortlisted molecules and donepezil (crystal pose) were simulated in explicit solvent (OpenMM 8, Amber ff14SB and GAFF2 with AM1-BCC charges, TIP3P, 0.15 M NaCl, 4 fs steps with hydrogen mass repartitioning, 300 K, 1 atm) from the top Vina pose of the protonated molecule (exhaustiveness 16, seed 42), after 100 ps with ligand and backbone restraints and 200 ps with backbone restraints, for 2 ns of production. One replica was run. A pose was called stable if the mean ligand heavy-atom RMSD over the second half of production, after fitting the pocket Cα atoms, was at most 3.0 Å and the ligand centre of mass stayed within 6 Å of its start; donepezil had to pass for the protocol to be valid. The runs were made on Kaggle GPUs because the laptop has no OpenMM installation.</w:t>
+        <w:t>Pose-stability dynamics. The 20 shortlisted molecules and donepezil (crystal pose) were simulated in explicit solvent (OpenMM 8, Amber ff14SB and GAFF2 with AM1-BCC charges, TIP3P, 0.15 M NaCl, 4 fs steps with hydrogen mass repartitioning, 300 K, 1 atm) from the top Vina pose of the protonated molecule (exhaustiveness 16, seed 42), after 100 ps with ligand and backbone restraints and 200 ps with backbone restraints, for 2 ns of production. Two replicas (seeds 1 and 2) were run. A pose was called stable if the mean ligand heavy-atom RMSD over the second half of production, after fitting the pocket Cα atoms, was at most 3.0 Å and the ligand centre of mass stayed within 6 Å of its start; donepezil had to pass for the protocol to be valid. The runs were made on Kaggle GPUs because the laptop has no OpenMM installation.</w:t>
       </w:r>
     </w:p>
     <w:p>

</xml_diff>

<commit_message>
Validate the pose-stability screen on 10 potent vs 10 inactive compounds: no separation; paper updated
</commit_message>
<xml_diff>
--- a/paper/Manuscript_MolInf.docx
+++ b/paper/Manuscript_MolInf.docx
@@ -47,7 +47,7 @@
           <w:b w:val="0"/>
           <w:i w:val="0"/>
         </w:rPr>
-        <w:t>Computational papers on acetylcholinesterase (AChE) inhibitors rarely go beyond predicted potency. We enumerated 383,752 analogues of 2,225 potent published inhibitors by one or two matched-pair edits, kept 2,700 that passed design-stage filters and passed them through gates for activity, brain penetration, drug-likeness, toxicity, docking, protonation and stereochemistry, a four-source novelty search and computed retrosynthesis. 106 molecules on 63 scaffolds cleared every gate with at least 5 % margin (63 with 10 % or more), each absent from PubChem, ChEMBL and SureChEMBL and each with a computed route of one to six steps from purchasable materials. A shortlist of 20 was ranked under 5,000 random weightings of eight further checks. The models behind the gates were tested on held-out scaffolds and on compounds published after a cutoff year, where the activity model beat simple baselines overall but not for chemistry unlike its training set; molecular dynamics in two 2 ns replicas left no shortlisted molecule outside the gorge, although the RMSD criterion varied between replicas (donepezil 2.1 and 3.1 Å); and the weak components (docking score, efflux term, hERG) are reported. The substitutions used preserve potency to within 0.5 log units in 64.5 % of measured AChE compound pairs (51.6 % for other exchanges), every molecule is tied to a measured potent parent, and inside its applicability domain the activity model ranks later-published compounds with ROC-AUC 0.81 (0.68 for nearest-neighbour similarity). All results are predictions; nothing has been synthesized.</w:t>
+        <w:t>Computational papers on acetylcholinesterase (AChE) inhibitors rarely go beyond predicted potency. We enumerated 383,752 analogues of 2,225 potent published inhibitors by one or two matched-pair edits, kept 2,700 that passed design-stage filters and passed them through gates for activity, brain penetration, drug-likeness, toxicity, docking, protonation and stereochemistry, a four-source novelty search and computed retrosynthesis. 106 molecules on 63 scaffolds cleared every gate with at least 5 % margin (63 with 10 % or more), each absent from PubChem, ChEMBL and SureChEMBL and each with a computed route of one to six steps from purchasable materials. A shortlist of 20 was ranked under 5,000 random weightings of eight further checks. The models behind the gates were tested on held-out scaffolds and on compounds published after a cutoff year, where the activity model beat simple baselines overall but not for chemistry unlike its training set; molecular dynamics in two 2 ns replicas left no shortlisted molecule outside the gorge, although the RMSD criterion varied between replicas (donepezil 2.1 and 3.1 Å), and the same screen did not separate ten potent from ten inactive published compounds (area under the curve 0.47); and the weak components (docking score, efflux term, hERG) are reported. The substitutions used preserve potency to within 0.5 log units in 64.5 % of measured AChE compound pairs (51.6 % for other exchanges), every molecule is tied to a measured potent parent, and inside its applicability domain the activity model ranks later-published compounds with ROC-AUC 0.81 (0.68 for nearest-neighbour similarity). All results are predictions; nothing has been synthesized.</w:t>
       </w:r>
     </w:p>
     <w:p>
@@ -166,7 +166,7 @@
           <w:i w:val="0"/>
           <w:sz w:val="19"/>
         </w:rPr>
-        <w:t>Overview of the study. Counts are those of the delivered set; the gates are listed in Table 11 and the shortlist ranking in Section 4.8.</w:t>
+        <w:t>Overview of the study. Counts are those of the delivered set; the gates are listed in Table 12 and the shortlist ranking in Section 4.8.</w:t>
       </w:r>
     </w:p>
     <w:p>
@@ -1328,7 +1328,7 @@
           <w:b w:val="0"/>
           <w:i w:val="0"/>
         </w:rPr>
-        <w:t>The 2,700 stored designs are themselves the survivors of the generation stage (Table 10: 383,752 enumerated one- and two-edit analogues). Figure 4 shows the funnel (the counts are also listed in the Supporting Information). The stored designs lose most of their number at the first four steps, where the activity and BBB models and the logBB gate act together; 374 designs pass every audited gate, and 292 of them clear 5 % margin. The efflux and exposure gates, stereochemistry, docking, protonation and tautomer checks, novelty and retrosynthesis then reduce the 292 to the delivered 106. Of the 194 candidates that reached docking, one failed the docking gate and two the protonation check, and none was a tautomer of a known compound.</w:t>
+        <w:t>The 2,700 stored designs are themselves the survivors of the generation stage (Table 11: 383,752 enumerated one- and two-edit analogues). Figure 4 shows the funnel (the counts are also listed in the Supporting Information). The stored designs lose most of their number at the first four steps, where the activity and BBB models and the logBB gate act together; 374 designs pass every audited gate, and 292 of them clear 5 % margin. The efflux and exposure gates, stereochemistry, docking, protonation and tautomer checks, novelty and retrosynthesis then reduce the 292 to the delivered 106. Of the 194 candidates that reached docking, one failed the docking gate and two the protonation check, and none was a tautomer of a known compound.</w:t>
       </w:r>
     </w:p>
     <w:p>
@@ -6871,7 +6871,7 @@
           <w:b w:val="0"/>
           <w:i w:val="0"/>
         </w:rPr>
-        <w:t>Blind re-discovery. Using only compounds reported up to a cutoff year, we applied the design stage's edits to the potent parents and asked how many compounds reported later were reproduced exactly and how close the generated analogues came to later potent compounds: at the 2015 cutoff the design-stage edits generated 325,244 analogues from 1,247 earlier potent parents and reproduced 7 of the 2,784 later compounds exactly (5 of the 593 later potent compounds), against 5 to 8 (2 to 3 potent) for 3 random draws of unused edits; the share of later potent compounds with a generated analogue at ECFP4 similarity of at least 0.8 was 2.9 % for the design-stage edits and 2.0 to 2.9 % for the random draws (mean highest similarity 0.48 against 0.47 to 0.47); at the 2018 cutoff the design-stage edits generated 345,702 analogues from 1,531 earlier potent parents and reproduced 6 of the 1,819 later compounds exactly (3 of the 393 later potent compounds), against 4 to 4 (1 to 3 potent) for 3 random draws of unused edits; the share of later potent compounds with a generated analogue at ECFP4 similarity of at least 0.8 was 2.5 % for the design-stage edits and 1.5 to 2.3 % for the random draws (mean highest similarity 0.49 against 0.47 to 0.48); at the 2012 cutoff (exact matches only) the design-stage edits reproduced 5 later compounds (4 potent) against 3 to 8 (2 to 3 potent) for 2 random draws. Exact re-discovery is rare and the counts are too small to separate the edit sets, and the near-recovery measure shows at most a small difference (the design-stage edits are within the range of the random draws at 2015 and slightly above it at 2018): the edit library has not been shown to find future compounds clearly better than other edits, which agrees with the matched-pair statistics test of Table 11. The value of the cascade therefore lies in its gates and its anchoring to measured parents and not in the edit selection.</w:t>
+        <w:t>Blind re-discovery. Using only compounds reported up to a cutoff year, we applied the design stage's edits to the potent parents and asked how many compounds reported later were reproduced exactly and how close the generated analogues came to later potent compounds: at the 2015 cutoff the design-stage edits generated 325,244 analogues from 1,247 earlier potent parents and reproduced 7 of the 2,784 later compounds exactly (5 of the 593 later potent compounds), against 5 to 8 (2 to 3 potent) for 3 random draws of unused edits; the share of later potent compounds with a generated analogue at ECFP4 similarity of at least 0.8 was 2.9 % for the design-stage edits and 2.0 to 2.9 % for the random draws (mean highest similarity 0.48 against 0.47 to 0.47); at the 2018 cutoff the design-stage edits generated 345,702 analogues from 1,531 earlier potent parents and reproduced 6 of the 1,819 later compounds exactly (3 of the 393 later potent compounds), against 4 to 4 (1 to 3 potent) for 3 random draws of unused edits; the share of later potent compounds with a generated analogue at ECFP4 similarity of at least 0.8 was 2.5 % for the design-stage edits and 1.5 to 2.3 % for the random draws (mean highest similarity 0.49 against 0.47 to 0.48); at the 2012 cutoff (exact matches only) the design-stage edits reproduced 5 later compounds (4 potent) against 3 to 8 (2 to 3 potent) for 2 random draws. Exact re-discovery is rare and the counts are too small to separate the edit sets, and the near-recovery measure shows at most a small difference (the design-stage edits are within the range of the random draws at 2015 and slightly above it at 2018): the edit library has not been shown to find future compounds clearly better than other edits, which agrees with the matched-pair statistics test of Table 12. The value of the cascade therefore lies in its gates and its anchoring to measured parents and not in the edit selection.</w:t>
       </w:r>
     </w:p>
     <w:p>
@@ -14324,6 +14324,2110 @@
       </w:tr>
     </w:tbl>
     <w:p>
+      <w:r>
+        <w:rPr>
+          <w:b w:val="0"/>
+          <w:i w:val="0"/>
+        </w:rPr>
+        <w:t>Validation of the screen against known activity. To test whether the pose-stability screen carries any information about activity, we applied the identical protocol (docking, preparation, 2 ns explicit-solvent run, one trajectory each) to ten potent and ten inactive published AChE compounds (Table 10). The screen did not separate them. The criterion RMSD at most 3.0 Å with centre-of-mass shift at most 6 Å was met by 10 of 10 potent and 8 of 10 inactive compounds (Fisher test, p = 0.47); the second-half RMSD gave an area under the curve of 0.47 (95% interval 0.20 to 0.74, Mann–Whitney p = 0.85) and the centre-of-mass shift 0.63 (0.38 to 0.87, p = 0.34), with the potent compounds having the slightly higher median RMSD (1.52 against 1.33 Å). Donepezil in its crystal pose again exceeded the RMSD criterion in this run (3.29 Å), so the protocol did not meet its own validity condition here either. Persistent stacking on Trp86 was the one measure that differed (potent compounds, median fraction 0.99; inactive compounds, 0.35; area under the curve 0.81, 95% interval 0.58 to 0.99, p = 0.018); it was one of three measures examined, the test is not corrected for that, and it rests on ten compounds per class, so it is a lead for further work and not a demonstrated discriminator. We therefore state that the stability screen, as run, is a check against gross loss of the pose and not a predictor of potency, and no ranking in this paper depends on it.</w:t>
+      </w:r>
+    </w:p>
+    <w:p>
+      <w:r>
+        <w:rPr>
+          <w:b/>
+        </w:rPr>
+        <w:t xml:space="preserve">Table 10. </w:t>
+      </w:r>
+      <w:r>
+        <w:rPr>
+          <w:b w:val="0"/>
+          <w:i w:val="0"/>
+          <w:sz w:val="19"/>
+        </w:rPr>
+        <w:t>Does the pose-stability screen separate potent from inactive published AChE compounds? Ten potent (pChEMBL at least 8.5) and ten inactive (below 5) compounds from ChEMBL were docked and simulated with the protocol of the shortlist (one 2 ns trajectory each, seed 7). RMSD and COM shift: second half of production (Å); Trp86: fraction of frames with a ligand ring within 5.5 Å of the Trp86 indole.</w:t>
+      </w:r>
+    </w:p>
+    <w:tbl>
+      <w:tblPr>
+        <w:tblStyle w:val="TableGrid"/>
+        <w:tblW w:type="auto" w:w="0"/>
+        <w:tblLook w:firstColumn="1" w:firstRow="1" w:lastColumn="0" w:lastRow="0" w:noHBand="0" w:noVBand="1" w:val="04A0"/>
+      </w:tblPr>
+      <w:tblGrid>
+        <w:gridCol w:w="1568"/>
+        <w:gridCol w:w="1568"/>
+        <w:gridCol w:w="1568"/>
+        <w:gridCol w:w="1568"/>
+        <w:gridCol w:w="1568"/>
+        <w:gridCol w:w="1568"/>
+      </w:tblGrid>
+      <w:tr>
+        <w:tc>
+          <w:tcPr>
+            <w:tcW w:type="dxa" w:w="1568"/>
+            <w:shd w:val="clear" w:color="auto" w:fill="D9E2F3"/>
+          </w:tcPr>
+          <w:p>
+            <w:r/>
+            <w:r>
+              <w:rPr>
+                <w:b/>
+                <w:i w:val="0"/>
+                <w:sz w:val="17"/>
+              </w:rPr>
+              <w:t>Compound</w:t>
+            </w:r>
+          </w:p>
+        </w:tc>
+        <w:tc>
+          <w:tcPr>
+            <w:tcW w:type="dxa" w:w="1568"/>
+            <w:shd w:val="clear" w:color="auto" w:fill="D9E2F3"/>
+          </w:tcPr>
+          <w:p>
+            <w:r/>
+            <w:r>
+              <w:rPr>
+                <w:b/>
+                <w:i w:val="0"/>
+                <w:sz w:val="17"/>
+              </w:rPr>
+              <w:t>Class</w:t>
+            </w:r>
+          </w:p>
+        </w:tc>
+        <w:tc>
+          <w:tcPr>
+            <w:tcW w:type="dxa" w:w="1568"/>
+            <w:shd w:val="clear" w:color="auto" w:fill="D9E2F3"/>
+          </w:tcPr>
+          <w:p>
+            <w:r/>
+            <w:r>
+              <w:rPr>
+                <w:b/>
+                <w:i w:val="0"/>
+                <w:sz w:val="17"/>
+              </w:rPr>
+              <w:t>pChEMBL</w:t>
+            </w:r>
+          </w:p>
+        </w:tc>
+        <w:tc>
+          <w:tcPr>
+            <w:tcW w:type="dxa" w:w="1568"/>
+            <w:shd w:val="clear" w:color="auto" w:fill="D9E2F3"/>
+          </w:tcPr>
+          <w:p>
+            <w:r/>
+            <w:r>
+              <w:rPr>
+                <w:b/>
+                <w:i w:val="0"/>
+                <w:sz w:val="17"/>
+              </w:rPr>
+              <w:t>RMSD</w:t>
+            </w:r>
+          </w:p>
+        </w:tc>
+        <w:tc>
+          <w:tcPr>
+            <w:tcW w:type="dxa" w:w="1568"/>
+            <w:shd w:val="clear" w:color="auto" w:fill="D9E2F3"/>
+          </w:tcPr>
+          <w:p>
+            <w:r/>
+            <w:r>
+              <w:rPr>
+                <w:b/>
+                <w:i w:val="0"/>
+                <w:sz w:val="17"/>
+              </w:rPr>
+              <w:t>COM</w:t>
+            </w:r>
+          </w:p>
+        </w:tc>
+        <w:tc>
+          <w:tcPr>
+            <w:tcW w:type="dxa" w:w="1568"/>
+            <w:shd w:val="clear" w:color="auto" w:fill="D9E2F3"/>
+          </w:tcPr>
+          <w:p>
+            <w:r/>
+            <w:r>
+              <w:rPr>
+                <w:b/>
+                <w:i w:val="0"/>
+                <w:sz w:val="17"/>
+              </w:rPr>
+              <w:t>Trp86</w:t>
+            </w:r>
+          </w:p>
+        </w:tc>
+      </w:tr>
+      <w:tr>
+        <w:tc>
+          <w:tcPr>
+            <w:tcW w:type="dxa" w:w="1568"/>
+          </w:tcPr>
+          <w:p>
+            <w:r/>
+            <w:r>
+              <w:rPr>
+                <w:b w:val="0"/>
+                <w:i w:val="0"/>
+                <w:sz w:val="17"/>
+              </w:rPr>
+              <w:t>1</w:t>
+            </w:r>
+          </w:p>
+        </w:tc>
+        <w:tc>
+          <w:tcPr>
+            <w:tcW w:type="dxa" w:w="1568"/>
+          </w:tcPr>
+          <w:p>
+            <w:r/>
+            <w:r>
+              <w:rPr>
+                <w:b w:val="0"/>
+                <w:i w:val="0"/>
+                <w:sz w:val="17"/>
+              </w:rPr>
+              <w:t>potent</w:t>
+            </w:r>
+          </w:p>
+        </w:tc>
+        <w:tc>
+          <w:tcPr>
+            <w:tcW w:type="dxa" w:w="1568"/>
+          </w:tcPr>
+          <w:p>
+            <w:r/>
+            <w:r>
+              <w:rPr>
+                <w:b w:val="0"/>
+                <w:i w:val="0"/>
+                <w:sz w:val="17"/>
+              </w:rPr>
+              <w:t>9.1</w:t>
+            </w:r>
+          </w:p>
+        </w:tc>
+        <w:tc>
+          <w:tcPr>
+            <w:tcW w:type="dxa" w:w="1568"/>
+          </w:tcPr>
+          <w:p>
+            <w:r/>
+            <w:r>
+              <w:rPr>
+                <w:b w:val="0"/>
+                <w:i w:val="0"/>
+                <w:sz w:val="17"/>
+              </w:rPr>
+              <w:t>2.48</w:t>
+            </w:r>
+          </w:p>
+        </w:tc>
+        <w:tc>
+          <w:tcPr>
+            <w:tcW w:type="dxa" w:w="1568"/>
+          </w:tcPr>
+          <w:p>
+            <w:r/>
+            <w:r>
+              <w:rPr>
+                <w:b w:val="0"/>
+                <w:i w:val="0"/>
+                <w:sz w:val="17"/>
+              </w:rPr>
+              <w:t>1.47</w:t>
+            </w:r>
+          </w:p>
+        </w:tc>
+        <w:tc>
+          <w:tcPr>
+            <w:tcW w:type="dxa" w:w="1568"/>
+          </w:tcPr>
+          <w:p>
+            <w:r/>
+            <w:r>
+              <w:rPr>
+                <w:b w:val="0"/>
+                <w:i w:val="0"/>
+                <w:sz w:val="17"/>
+              </w:rPr>
+              <w:t>0.99</w:t>
+            </w:r>
+          </w:p>
+        </w:tc>
+      </w:tr>
+      <w:tr>
+        <w:tc>
+          <w:tcPr>
+            <w:tcW w:type="dxa" w:w="1568"/>
+          </w:tcPr>
+          <w:p>
+            <w:r/>
+            <w:r>
+              <w:rPr>
+                <w:b w:val="0"/>
+                <w:i w:val="0"/>
+                <w:sz w:val="17"/>
+              </w:rPr>
+              <w:t>2</w:t>
+            </w:r>
+          </w:p>
+        </w:tc>
+        <w:tc>
+          <w:tcPr>
+            <w:tcW w:type="dxa" w:w="1568"/>
+          </w:tcPr>
+          <w:p>
+            <w:r/>
+            <w:r>
+              <w:rPr>
+                <w:b w:val="0"/>
+                <w:i w:val="0"/>
+                <w:sz w:val="17"/>
+              </w:rPr>
+              <w:t>potent</w:t>
+            </w:r>
+          </w:p>
+        </w:tc>
+        <w:tc>
+          <w:tcPr>
+            <w:tcW w:type="dxa" w:w="1568"/>
+          </w:tcPr>
+          <w:p>
+            <w:r/>
+            <w:r>
+              <w:rPr>
+                <w:b w:val="0"/>
+                <w:i w:val="0"/>
+                <w:sz w:val="17"/>
+              </w:rPr>
+              <w:t>8.9</w:t>
+            </w:r>
+          </w:p>
+        </w:tc>
+        <w:tc>
+          <w:tcPr>
+            <w:tcW w:type="dxa" w:w="1568"/>
+          </w:tcPr>
+          <w:p>
+            <w:r/>
+            <w:r>
+              <w:rPr>
+                <w:b w:val="0"/>
+                <w:i w:val="0"/>
+                <w:sz w:val="17"/>
+              </w:rPr>
+              <w:t>1.03</w:t>
+            </w:r>
+          </w:p>
+        </w:tc>
+        <w:tc>
+          <w:tcPr>
+            <w:tcW w:type="dxa" w:w="1568"/>
+          </w:tcPr>
+          <w:p>
+            <w:r/>
+            <w:r>
+              <w:rPr>
+                <w:b w:val="0"/>
+                <w:i w:val="0"/>
+                <w:sz w:val="17"/>
+              </w:rPr>
+              <w:t>0.46</w:t>
+            </w:r>
+          </w:p>
+        </w:tc>
+        <w:tc>
+          <w:tcPr>
+            <w:tcW w:type="dxa" w:w="1568"/>
+          </w:tcPr>
+          <w:p>
+            <w:r/>
+            <w:r>
+              <w:rPr>
+                <w:b w:val="0"/>
+                <w:i w:val="0"/>
+                <w:sz w:val="17"/>
+              </w:rPr>
+              <w:t>0.99</w:t>
+            </w:r>
+          </w:p>
+        </w:tc>
+      </w:tr>
+      <w:tr>
+        <w:tc>
+          <w:tcPr>
+            <w:tcW w:type="dxa" w:w="1568"/>
+          </w:tcPr>
+          <w:p>
+            <w:r/>
+            <w:r>
+              <w:rPr>
+                <w:b w:val="0"/>
+                <w:i w:val="0"/>
+                <w:sz w:val="17"/>
+              </w:rPr>
+              <w:t>3</w:t>
+            </w:r>
+          </w:p>
+        </w:tc>
+        <w:tc>
+          <w:tcPr>
+            <w:tcW w:type="dxa" w:w="1568"/>
+          </w:tcPr>
+          <w:p>
+            <w:r/>
+            <w:r>
+              <w:rPr>
+                <w:b w:val="0"/>
+                <w:i w:val="0"/>
+                <w:sz w:val="17"/>
+              </w:rPr>
+              <w:t>potent</w:t>
+            </w:r>
+          </w:p>
+        </w:tc>
+        <w:tc>
+          <w:tcPr>
+            <w:tcW w:type="dxa" w:w="1568"/>
+          </w:tcPr>
+          <w:p>
+            <w:r/>
+            <w:r>
+              <w:rPr>
+                <w:b w:val="0"/>
+                <w:i w:val="0"/>
+                <w:sz w:val="17"/>
+              </w:rPr>
+              <w:t>9.1</w:t>
+            </w:r>
+          </w:p>
+        </w:tc>
+        <w:tc>
+          <w:tcPr>
+            <w:tcW w:type="dxa" w:w="1568"/>
+          </w:tcPr>
+          <w:p>
+            <w:r/>
+            <w:r>
+              <w:rPr>
+                <w:b w:val="0"/>
+                <w:i w:val="0"/>
+                <w:sz w:val="17"/>
+              </w:rPr>
+              <w:t>1.30</w:t>
+            </w:r>
+          </w:p>
+        </w:tc>
+        <w:tc>
+          <w:tcPr>
+            <w:tcW w:type="dxa" w:w="1568"/>
+          </w:tcPr>
+          <w:p>
+            <w:r/>
+            <w:r>
+              <w:rPr>
+                <w:b w:val="0"/>
+                <w:i w:val="0"/>
+                <w:sz w:val="17"/>
+              </w:rPr>
+              <w:t>0.79</w:t>
+            </w:r>
+          </w:p>
+        </w:tc>
+        <w:tc>
+          <w:tcPr>
+            <w:tcW w:type="dxa" w:w="1568"/>
+          </w:tcPr>
+          <w:p>
+            <w:r/>
+            <w:r>
+              <w:rPr>
+                <w:b w:val="0"/>
+                <w:i w:val="0"/>
+                <w:sz w:val="17"/>
+              </w:rPr>
+              <w:t>0.99</w:t>
+            </w:r>
+          </w:p>
+        </w:tc>
+      </w:tr>
+      <w:tr>
+        <w:tc>
+          <w:tcPr>
+            <w:tcW w:type="dxa" w:w="1568"/>
+          </w:tcPr>
+          <w:p>
+            <w:r/>
+            <w:r>
+              <w:rPr>
+                <w:b w:val="0"/>
+                <w:i w:val="0"/>
+                <w:sz w:val="17"/>
+              </w:rPr>
+              <w:t>4</w:t>
+            </w:r>
+          </w:p>
+        </w:tc>
+        <w:tc>
+          <w:tcPr>
+            <w:tcW w:type="dxa" w:w="1568"/>
+          </w:tcPr>
+          <w:p>
+            <w:r/>
+            <w:r>
+              <w:rPr>
+                <w:b w:val="0"/>
+                <w:i w:val="0"/>
+                <w:sz w:val="17"/>
+              </w:rPr>
+              <w:t>potent</w:t>
+            </w:r>
+          </w:p>
+        </w:tc>
+        <w:tc>
+          <w:tcPr>
+            <w:tcW w:type="dxa" w:w="1568"/>
+          </w:tcPr>
+          <w:p>
+            <w:r/>
+            <w:r>
+              <w:rPr>
+                <w:b w:val="0"/>
+                <w:i w:val="0"/>
+                <w:sz w:val="17"/>
+              </w:rPr>
+              <w:t>8.5</w:t>
+            </w:r>
+          </w:p>
+        </w:tc>
+        <w:tc>
+          <w:tcPr>
+            <w:tcW w:type="dxa" w:w="1568"/>
+          </w:tcPr>
+          <w:p>
+            <w:r/>
+            <w:r>
+              <w:rPr>
+                <w:b w:val="0"/>
+                <w:i w:val="0"/>
+                <w:sz w:val="17"/>
+              </w:rPr>
+              <w:t>2.34</w:t>
+            </w:r>
+          </w:p>
+        </w:tc>
+        <w:tc>
+          <w:tcPr>
+            <w:tcW w:type="dxa" w:w="1568"/>
+          </w:tcPr>
+          <w:p>
+            <w:r/>
+            <w:r>
+              <w:rPr>
+                <w:b w:val="0"/>
+                <w:i w:val="0"/>
+                <w:sz w:val="17"/>
+              </w:rPr>
+              <w:t>0.72</w:t>
+            </w:r>
+          </w:p>
+        </w:tc>
+        <w:tc>
+          <w:tcPr>
+            <w:tcW w:type="dxa" w:w="1568"/>
+          </w:tcPr>
+          <w:p>
+            <w:r/>
+            <w:r>
+              <w:rPr>
+                <w:b w:val="0"/>
+                <w:i w:val="0"/>
+                <w:sz w:val="17"/>
+              </w:rPr>
+              <w:t>0.99</w:t>
+            </w:r>
+          </w:p>
+        </w:tc>
+      </w:tr>
+      <w:tr>
+        <w:tc>
+          <w:tcPr>
+            <w:tcW w:type="dxa" w:w="1568"/>
+          </w:tcPr>
+          <w:p>
+            <w:r/>
+            <w:r>
+              <w:rPr>
+                <w:b w:val="0"/>
+                <w:i w:val="0"/>
+                <w:sz w:val="17"/>
+              </w:rPr>
+              <w:t>5</w:t>
+            </w:r>
+          </w:p>
+        </w:tc>
+        <w:tc>
+          <w:tcPr>
+            <w:tcW w:type="dxa" w:w="1568"/>
+          </w:tcPr>
+          <w:p>
+            <w:r/>
+            <w:r>
+              <w:rPr>
+                <w:b w:val="0"/>
+                <w:i w:val="0"/>
+                <w:sz w:val="17"/>
+              </w:rPr>
+              <w:t>potent</w:t>
+            </w:r>
+          </w:p>
+        </w:tc>
+        <w:tc>
+          <w:tcPr>
+            <w:tcW w:type="dxa" w:w="1568"/>
+          </w:tcPr>
+          <w:p>
+            <w:r/>
+            <w:r>
+              <w:rPr>
+                <w:b w:val="0"/>
+                <w:i w:val="0"/>
+                <w:sz w:val="17"/>
+              </w:rPr>
+              <w:t>8.6</w:t>
+            </w:r>
+          </w:p>
+        </w:tc>
+        <w:tc>
+          <w:tcPr>
+            <w:tcW w:type="dxa" w:w="1568"/>
+          </w:tcPr>
+          <w:p>
+            <w:r/>
+            <w:r>
+              <w:rPr>
+                <w:b w:val="0"/>
+                <w:i w:val="0"/>
+                <w:sz w:val="17"/>
+              </w:rPr>
+              <w:t>1.17</w:t>
+            </w:r>
+          </w:p>
+        </w:tc>
+        <w:tc>
+          <w:tcPr>
+            <w:tcW w:type="dxa" w:w="1568"/>
+          </w:tcPr>
+          <w:p>
+            <w:r/>
+            <w:r>
+              <w:rPr>
+                <w:b w:val="0"/>
+                <w:i w:val="0"/>
+                <w:sz w:val="17"/>
+              </w:rPr>
+              <w:t>0.62</w:t>
+            </w:r>
+          </w:p>
+        </w:tc>
+        <w:tc>
+          <w:tcPr>
+            <w:tcW w:type="dxa" w:w="1568"/>
+          </w:tcPr>
+          <w:p>
+            <w:r/>
+            <w:r>
+              <w:rPr>
+                <w:b w:val="0"/>
+                <w:i w:val="0"/>
+                <w:sz w:val="17"/>
+              </w:rPr>
+              <w:t>1.00</w:t>
+            </w:r>
+          </w:p>
+        </w:tc>
+      </w:tr>
+      <w:tr>
+        <w:tc>
+          <w:tcPr>
+            <w:tcW w:type="dxa" w:w="1568"/>
+          </w:tcPr>
+          <w:p>
+            <w:r/>
+            <w:r>
+              <w:rPr>
+                <w:b w:val="0"/>
+                <w:i w:val="0"/>
+                <w:sz w:val="17"/>
+              </w:rPr>
+              <w:t>6</w:t>
+            </w:r>
+          </w:p>
+        </w:tc>
+        <w:tc>
+          <w:tcPr>
+            <w:tcW w:type="dxa" w:w="1568"/>
+          </w:tcPr>
+          <w:p>
+            <w:r/>
+            <w:r>
+              <w:rPr>
+                <w:b w:val="0"/>
+                <w:i w:val="0"/>
+                <w:sz w:val="17"/>
+              </w:rPr>
+              <w:t>potent</w:t>
+            </w:r>
+          </w:p>
+        </w:tc>
+        <w:tc>
+          <w:tcPr>
+            <w:tcW w:type="dxa" w:w="1568"/>
+          </w:tcPr>
+          <w:p>
+            <w:r/>
+            <w:r>
+              <w:rPr>
+                <w:b w:val="0"/>
+                <w:i w:val="0"/>
+                <w:sz w:val="17"/>
+              </w:rPr>
+              <w:t>8.9</w:t>
+            </w:r>
+          </w:p>
+        </w:tc>
+        <w:tc>
+          <w:tcPr>
+            <w:tcW w:type="dxa" w:w="1568"/>
+          </w:tcPr>
+          <w:p>
+            <w:r/>
+            <w:r>
+              <w:rPr>
+                <w:b w:val="0"/>
+                <w:i w:val="0"/>
+                <w:sz w:val="17"/>
+              </w:rPr>
+              <w:t>1.45</w:t>
+            </w:r>
+          </w:p>
+        </w:tc>
+        <w:tc>
+          <w:tcPr>
+            <w:tcW w:type="dxa" w:w="1568"/>
+          </w:tcPr>
+          <w:p>
+            <w:r/>
+            <w:r>
+              <w:rPr>
+                <w:b w:val="0"/>
+                <w:i w:val="0"/>
+                <w:sz w:val="17"/>
+              </w:rPr>
+              <w:t>0.52</w:t>
+            </w:r>
+          </w:p>
+        </w:tc>
+        <w:tc>
+          <w:tcPr>
+            <w:tcW w:type="dxa" w:w="1568"/>
+          </w:tcPr>
+          <w:p>
+            <w:r/>
+            <w:r>
+              <w:rPr>
+                <w:b w:val="0"/>
+                <w:i w:val="0"/>
+                <w:sz w:val="17"/>
+              </w:rPr>
+              <w:t>0.96</w:t>
+            </w:r>
+          </w:p>
+        </w:tc>
+      </w:tr>
+      <w:tr>
+        <w:tc>
+          <w:tcPr>
+            <w:tcW w:type="dxa" w:w="1568"/>
+          </w:tcPr>
+          <w:p>
+            <w:r/>
+            <w:r>
+              <w:rPr>
+                <w:b w:val="0"/>
+                <w:i w:val="0"/>
+                <w:sz w:val="17"/>
+              </w:rPr>
+              <w:t>7</w:t>
+            </w:r>
+          </w:p>
+        </w:tc>
+        <w:tc>
+          <w:tcPr>
+            <w:tcW w:type="dxa" w:w="1568"/>
+          </w:tcPr>
+          <w:p>
+            <w:r/>
+            <w:r>
+              <w:rPr>
+                <w:b w:val="0"/>
+                <w:i w:val="0"/>
+                <w:sz w:val="17"/>
+              </w:rPr>
+              <w:t>potent</w:t>
+            </w:r>
+          </w:p>
+        </w:tc>
+        <w:tc>
+          <w:tcPr>
+            <w:tcW w:type="dxa" w:w="1568"/>
+          </w:tcPr>
+          <w:p>
+            <w:r/>
+            <w:r>
+              <w:rPr>
+                <w:b w:val="0"/>
+                <w:i w:val="0"/>
+                <w:sz w:val="17"/>
+              </w:rPr>
+              <w:t>9.0</w:t>
+            </w:r>
+          </w:p>
+        </w:tc>
+        <w:tc>
+          <w:tcPr>
+            <w:tcW w:type="dxa" w:w="1568"/>
+          </w:tcPr>
+          <w:p>
+            <w:r/>
+            <w:r>
+              <w:rPr>
+                <w:b w:val="0"/>
+                <w:i w:val="0"/>
+                <w:sz w:val="17"/>
+              </w:rPr>
+              <w:t>2.08</w:t>
+            </w:r>
+          </w:p>
+        </w:tc>
+        <w:tc>
+          <w:tcPr>
+            <w:tcW w:type="dxa" w:w="1568"/>
+          </w:tcPr>
+          <w:p>
+            <w:r/>
+            <w:r>
+              <w:rPr>
+                <w:b w:val="0"/>
+                <w:i w:val="0"/>
+                <w:sz w:val="17"/>
+              </w:rPr>
+              <w:t>1.23</w:t>
+            </w:r>
+          </w:p>
+        </w:tc>
+        <w:tc>
+          <w:tcPr>
+            <w:tcW w:type="dxa" w:w="1568"/>
+          </w:tcPr>
+          <w:p>
+            <w:r/>
+            <w:r>
+              <w:rPr>
+                <w:b w:val="0"/>
+                <w:i w:val="0"/>
+                <w:sz w:val="17"/>
+              </w:rPr>
+              <w:t>1.00</w:t>
+            </w:r>
+          </w:p>
+        </w:tc>
+      </w:tr>
+      <w:tr>
+        <w:tc>
+          <w:tcPr>
+            <w:tcW w:type="dxa" w:w="1568"/>
+          </w:tcPr>
+          <w:p>
+            <w:r/>
+            <w:r>
+              <w:rPr>
+                <w:b w:val="0"/>
+                <w:i w:val="0"/>
+                <w:sz w:val="17"/>
+              </w:rPr>
+              <w:t>8</w:t>
+            </w:r>
+          </w:p>
+        </w:tc>
+        <w:tc>
+          <w:tcPr>
+            <w:tcW w:type="dxa" w:w="1568"/>
+          </w:tcPr>
+          <w:p>
+            <w:r/>
+            <w:r>
+              <w:rPr>
+                <w:b w:val="0"/>
+                <w:i w:val="0"/>
+                <w:sz w:val="17"/>
+              </w:rPr>
+              <w:t>potent</w:t>
+            </w:r>
+          </w:p>
+        </w:tc>
+        <w:tc>
+          <w:tcPr>
+            <w:tcW w:type="dxa" w:w="1568"/>
+          </w:tcPr>
+          <w:p>
+            <w:r/>
+            <w:r>
+              <w:rPr>
+                <w:b w:val="0"/>
+                <w:i w:val="0"/>
+                <w:sz w:val="17"/>
+              </w:rPr>
+              <w:t>9.1</w:t>
+            </w:r>
+          </w:p>
+        </w:tc>
+        <w:tc>
+          <w:tcPr>
+            <w:tcW w:type="dxa" w:w="1568"/>
+          </w:tcPr>
+          <w:p>
+            <w:r/>
+            <w:r>
+              <w:rPr>
+                <w:b w:val="0"/>
+                <w:i w:val="0"/>
+                <w:sz w:val="17"/>
+              </w:rPr>
+              <w:t>1.90</w:t>
+            </w:r>
+          </w:p>
+        </w:tc>
+        <w:tc>
+          <w:tcPr>
+            <w:tcW w:type="dxa" w:w="1568"/>
+          </w:tcPr>
+          <w:p>
+            <w:r/>
+            <w:r>
+              <w:rPr>
+                <w:b w:val="0"/>
+                <w:i w:val="0"/>
+                <w:sz w:val="17"/>
+              </w:rPr>
+              <w:t>0.62</w:t>
+            </w:r>
+          </w:p>
+        </w:tc>
+        <w:tc>
+          <w:tcPr>
+            <w:tcW w:type="dxa" w:w="1568"/>
+          </w:tcPr>
+          <w:p>
+            <w:r/>
+            <w:r>
+              <w:rPr>
+                <w:b w:val="0"/>
+                <w:i w:val="0"/>
+                <w:sz w:val="17"/>
+              </w:rPr>
+              <w:t>1.00</w:t>
+            </w:r>
+          </w:p>
+        </w:tc>
+      </w:tr>
+      <w:tr>
+        <w:tc>
+          <w:tcPr>
+            <w:tcW w:type="dxa" w:w="1568"/>
+          </w:tcPr>
+          <w:p>
+            <w:r/>
+            <w:r>
+              <w:rPr>
+                <w:b w:val="0"/>
+                <w:i w:val="0"/>
+                <w:sz w:val="17"/>
+              </w:rPr>
+              <w:t>9</w:t>
+            </w:r>
+          </w:p>
+        </w:tc>
+        <w:tc>
+          <w:tcPr>
+            <w:tcW w:type="dxa" w:w="1568"/>
+          </w:tcPr>
+          <w:p>
+            <w:r/>
+            <w:r>
+              <w:rPr>
+                <w:b w:val="0"/>
+                <w:i w:val="0"/>
+                <w:sz w:val="17"/>
+              </w:rPr>
+              <w:t>potent</w:t>
+            </w:r>
+          </w:p>
+        </w:tc>
+        <w:tc>
+          <w:tcPr>
+            <w:tcW w:type="dxa" w:w="1568"/>
+          </w:tcPr>
+          <w:p>
+            <w:r/>
+            <w:r>
+              <w:rPr>
+                <w:b w:val="0"/>
+                <w:i w:val="0"/>
+                <w:sz w:val="17"/>
+              </w:rPr>
+              <w:t>8.6</w:t>
+            </w:r>
+          </w:p>
+        </w:tc>
+        <w:tc>
+          <w:tcPr>
+            <w:tcW w:type="dxa" w:w="1568"/>
+          </w:tcPr>
+          <w:p>
+            <w:r/>
+            <w:r>
+              <w:rPr>
+                <w:b w:val="0"/>
+                <w:i w:val="0"/>
+                <w:sz w:val="17"/>
+              </w:rPr>
+              <w:t>1.58</w:t>
+            </w:r>
+          </w:p>
+        </w:tc>
+        <w:tc>
+          <w:tcPr>
+            <w:tcW w:type="dxa" w:w="1568"/>
+          </w:tcPr>
+          <w:p>
+            <w:r/>
+            <w:r>
+              <w:rPr>
+                <w:b w:val="0"/>
+                <w:i w:val="0"/>
+                <w:sz w:val="17"/>
+              </w:rPr>
+              <w:t>0.68</w:t>
+            </w:r>
+          </w:p>
+        </w:tc>
+        <w:tc>
+          <w:tcPr>
+            <w:tcW w:type="dxa" w:w="1568"/>
+          </w:tcPr>
+          <w:p>
+            <w:r/>
+            <w:r>
+              <w:rPr>
+                <w:b w:val="0"/>
+                <w:i w:val="0"/>
+                <w:sz w:val="17"/>
+              </w:rPr>
+              <w:t>0.99</w:t>
+            </w:r>
+          </w:p>
+        </w:tc>
+      </w:tr>
+      <w:tr>
+        <w:tc>
+          <w:tcPr>
+            <w:tcW w:type="dxa" w:w="1568"/>
+          </w:tcPr>
+          <w:p>
+            <w:r/>
+            <w:r>
+              <w:rPr>
+                <w:b w:val="0"/>
+                <w:i w:val="0"/>
+                <w:sz w:val="17"/>
+              </w:rPr>
+              <w:t>10</w:t>
+            </w:r>
+          </w:p>
+        </w:tc>
+        <w:tc>
+          <w:tcPr>
+            <w:tcW w:type="dxa" w:w="1568"/>
+          </w:tcPr>
+          <w:p>
+            <w:r/>
+            <w:r>
+              <w:rPr>
+                <w:b w:val="0"/>
+                <w:i w:val="0"/>
+                <w:sz w:val="17"/>
+              </w:rPr>
+              <w:t>potent</w:t>
+            </w:r>
+          </w:p>
+        </w:tc>
+        <w:tc>
+          <w:tcPr>
+            <w:tcW w:type="dxa" w:w="1568"/>
+          </w:tcPr>
+          <w:p>
+            <w:r/>
+            <w:r>
+              <w:rPr>
+                <w:b w:val="0"/>
+                <w:i w:val="0"/>
+                <w:sz w:val="17"/>
+              </w:rPr>
+              <w:t>9.5</w:t>
+            </w:r>
+          </w:p>
+        </w:tc>
+        <w:tc>
+          <w:tcPr>
+            <w:tcW w:type="dxa" w:w="1568"/>
+          </w:tcPr>
+          <w:p>
+            <w:r/>
+            <w:r>
+              <w:rPr>
+                <w:b w:val="0"/>
+                <w:i w:val="0"/>
+                <w:sz w:val="17"/>
+              </w:rPr>
+              <w:t>1.18</w:t>
+            </w:r>
+          </w:p>
+        </w:tc>
+        <w:tc>
+          <w:tcPr>
+            <w:tcW w:type="dxa" w:w="1568"/>
+          </w:tcPr>
+          <w:p>
+            <w:r/>
+            <w:r>
+              <w:rPr>
+                <w:b w:val="0"/>
+                <w:i w:val="0"/>
+                <w:sz w:val="17"/>
+              </w:rPr>
+              <w:t>0.52</w:t>
+            </w:r>
+          </w:p>
+        </w:tc>
+        <w:tc>
+          <w:tcPr>
+            <w:tcW w:type="dxa" w:w="1568"/>
+          </w:tcPr>
+          <w:p>
+            <w:r/>
+            <w:r>
+              <w:rPr>
+                <w:b w:val="0"/>
+                <w:i w:val="0"/>
+                <w:sz w:val="17"/>
+              </w:rPr>
+              <w:t>1.00</w:t>
+            </w:r>
+          </w:p>
+        </w:tc>
+      </w:tr>
+      <w:tr>
+        <w:tc>
+          <w:tcPr>
+            <w:tcW w:type="dxa" w:w="1568"/>
+          </w:tcPr>
+          <w:p>
+            <w:r/>
+            <w:r>
+              <w:rPr>
+                <w:b w:val="0"/>
+                <w:i w:val="0"/>
+                <w:sz w:val="17"/>
+              </w:rPr>
+              <w:t>11</w:t>
+            </w:r>
+          </w:p>
+        </w:tc>
+        <w:tc>
+          <w:tcPr>
+            <w:tcW w:type="dxa" w:w="1568"/>
+          </w:tcPr>
+          <w:p>
+            <w:r/>
+            <w:r>
+              <w:rPr>
+                <w:b w:val="0"/>
+                <w:i w:val="0"/>
+                <w:sz w:val="17"/>
+              </w:rPr>
+              <w:t>inactive</w:t>
+            </w:r>
+          </w:p>
+        </w:tc>
+        <w:tc>
+          <w:tcPr>
+            <w:tcW w:type="dxa" w:w="1568"/>
+          </w:tcPr>
+          <w:p>
+            <w:r/>
+            <w:r>
+              <w:rPr>
+                <w:b w:val="0"/>
+                <w:i w:val="0"/>
+                <w:sz w:val="17"/>
+              </w:rPr>
+              <w:t>4.7</w:t>
+            </w:r>
+          </w:p>
+        </w:tc>
+        <w:tc>
+          <w:tcPr>
+            <w:tcW w:type="dxa" w:w="1568"/>
+          </w:tcPr>
+          <w:p>
+            <w:r/>
+            <w:r>
+              <w:rPr>
+                <w:b w:val="0"/>
+                <w:i w:val="0"/>
+                <w:sz w:val="17"/>
+              </w:rPr>
+              <w:t>3.16</w:t>
+            </w:r>
+          </w:p>
+        </w:tc>
+        <w:tc>
+          <w:tcPr>
+            <w:tcW w:type="dxa" w:w="1568"/>
+          </w:tcPr>
+          <w:p>
+            <w:r/>
+            <w:r>
+              <w:rPr>
+                <w:b w:val="0"/>
+                <w:i w:val="0"/>
+                <w:sz w:val="17"/>
+              </w:rPr>
+              <w:t>1.43</w:t>
+            </w:r>
+          </w:p>
+        </w:tc>
+        <w:tc>
+          <w:tcPr>
+            <w:tcW w:type="dxa" w:w="1568"/>
+          </w:tcPr>
+          <w:p>
+            <w:r/>
+            <w:r>
+              <w:rPr>
+                <w:b w:val="0"/>
+                <w:i w:val="0"/>
+                <w:sz w:val="17"/>
+              </w:rPr>
+              <w:t>0.00</w:t>
+            </w:r>
+          </w:p>
+        </w:tc>
+      </w:tr>
+      <w:tr>
+        <w:tc>
+          <w:tcPr>
+            <w:tcW w:type="dxa" w:w="1568"/>
+          </w:tcPr>
+          <w:p>
+            <w:r/>
+            <w:r>
+              <w:rPr>
+                <w:b w:val="0"/>
+                <w:i w:val="0"/>
+                <w:sz w:val="17"/>
+              </w:rPr>
+              <w:t>12</w:t>
+            </w:r>
+          </w:p>
+        </w:tc>
+        <w:tc>
+          <w:tcPr>
+            <w:tcW w:type="dxa" w:w="1568"/>
+          </w:tcPr>
+          <w:p>
+            <w:r/>
+            <w:r>
+              <w:rPr>
+                <w:b w:val="0"/>
+                <w:i w:val="0"/>
+                <w:sz w:val="17"/>
+              </w:rPr>
+              <w:t>inactive</w:t>
+            </w:r>
+          </w:p>
+        </w:tc>
+        <w:tc>
+          <w:tcPr>
+            <w:tcW w:type="dxa" w:w="1568"/>
+          </w:tcPr>
+          <w:p>
+            <w:r/>
+            <w:r>
+              <w:rPr>
+                <w:b w:val="0"/>
+                <w:i w:val="0"/>
+                <w:sz w:val="17"/>
+              </w:rPr>
+              <w:t>4.9</w:t>
+            </w:r>
+          </w:p>
+        </w:tc>
+        <w:tc>
+          <w:tcPr>
+            <w:tcW w:type="dxa" w:w="1568"/>
+          </w:tcPr>
+          <w:p>
+            <w:r/>
+            <w:r>
+              <w:rPr>
+                <w:b w:val="0"/>
+                <w:i w:val="0"/>
+                <w:sz w:val="17"/>
+              </w:rPr>
+              <w:t>2.36</w:t>
+            </w:r>
+          </w:p>
+        </w:tc>
+        <w:tc>
+          <w:tcPr>
+            <w:tcW w:type="dxa" w:w="1568"/>
+          </w:tcPr>
+          <w:p>
+            <w:r/>
+            <w:r>
+              <w:rPr>
+                <w:b w:val="0"/>
+                <w:i w:val="0"/>
+                <w:sz w:val="17"/>
+              </w:rPr>
+              <w:t>1.32</w:t>
+            </w:r>
+          </w:p>
+        </w:tc>
+        <w:tc>
+          <w:tcPr>
+            <w:tcW w:type="dxa" w:w="1568"/>
+          </w:tcPr>
+          <w:p>
+            <w:r/>
+            <w:r>
+              <w:rPr>
+                <w:b w:val="0"/>
+                <w:i w:val="0"/>
+                <w:sz w:val="17"/>
+              </w:rPr>
+              <w:t>0.00</w:t>
+            </w:r>
+          </w:p>
+        </w:tc>
+      </w:tr>
+      <w:tr>
+        <w:tc>
+          <w:tcPr>
+            <w:tcW w:type="dxa" w:w="1568"/>
+          </w:tcPr>
+          <w:p>
+            <w:r/>
+            <w:r>
+              <w:rPr>
+                <w:b w:val="0"/>
+                <w:i w:val="0"/>
+                <w:sz w:val="17"/>
+              </w:rPr>
+              <w:t>13</w:t>
+            </w:r>
+          </w:p>
+        </w:tc>
+        <w:tc>
+          <w:tcPr>
+            <w:tcW w:type="dxa" w:w="1568"/>
+          </w:tcPr>
+          <w:p>
+            <w:r/>
+            <w:r>
+              <w:rPr>
+                <w:b w:val="0"/>
+                <w:i w:val="0"/>
+                <w:sz w:val="17"/>
+              </w:rPr>
+              <w:t>inactive</w:t>
+            </w:r>
+          </w:p>
+        </w:tc>
+        <w:tc>
+          <w:tcPr>
+            <w:tcW w:type="dxa" w:w="1568"/>
+          </w:tcPr>
+          <w:p>
+            <w:r/>
+            <w:r>
+              <w:rPr>
+                <w:b w:val="0"/>
+                <w:i w:val="0"/>
+                <w:sz w:val="17"/>
+              </w:rPr>
+              <w:t>4.8</w:t>
+            </w:r>
+          </w:p>
+        </w:tc>
+        <w:tc>
+          <w:tcPr>
+            <w:tcW w:type="dxa" w:w="1568"/>
+          </w:tcPr>
+          <w:p>
+            <w:r/>
+            <w:r>
+              <w:rPr>
+                <w:b w:val="0"/>
+                <w:i w:val="0"/>
+                <w:sz w:val="17"/>
+              </w:rPr>
+              <w:t>1.15</w:t>
+            </w:r>
+          </w:p>
+        </w:tc>
+        <w:tc>
+          <w:tcPr>
+            <w:tcW w:type="dxa" w:w="1568"/>
+          </w:tcPr>
+          <w:p>
+            <w:r/>
+            <w:r>
+              <w:rPr>
+                <w:b w:val="0"/>
+                <w:i w:val="0"/>
+                <w:sz w:val="17"/>
+              </w:rPr>
+              <w:t>0.66</w:t>
+            </w:r>
+          </w:p>
+        </w:tc>
+        <w:tc>
+          <w:tcPr>
+            <w:tcW w:type="dxa" w:w="1568"/>
+          </w:tcPr>
+          <w:p>
+            <w:r/>
+            <w:r>
+              <w:rPr>
+                <w:b w:val="0"/>
+                <w:i w:val="0"/>
+                <w:sz w:val="17"/>
+              </w:rPr>
+              <w:t>0.69</w:t>
+            </w:r>
+          </w:p>
+        </w:tc>
+      </w:tr>
+      <w:tr>
+        <w:tc>
+          <w:tcPr>
+            <w:tcW w:type="dxa" w:w="1568"/>
+          </w:tcPr>
+          <w:p>
+            <w:r/>
+            <w:r>
+              <w:rPr>
+                <w:b w:val="0"/>
+                <w:i w:val="0"/>
+                <w:sz w:val="17"/>
+              </w:rPr>
+              <w:t>14</w:t>
+            </w:r>
+          </w:p>
+        </w:tc>
+        <w:tc>
+          <w:tcPr>
+            <w:tcW w:type="dxa" w:w="1568"/>
+          </w:tcPr>
+          <w:p>
+            <w:r/>
+            <w:r>
+              <w:rPr>
+                <w:b w:val="0"/>
+                <w:i w:val="0"/>
+                <w:sz w:val="17"/>
+              </w:rPr>
+              <w:t>inactive</w:t>
+            </w:r>
+          </w:p>
+        </w:tc>
+        <w:tc>
+          <w:tcPr>
+            <w:tcW w:type="dxa" w:w="1568"/>
+          </w:tcPr>
+          <w:p>
+            <w:r/>
+            <w:r>
+              <w:rPr>
+                <w:b w:val="0"/>
+                <w:i w:val="0"/>
+                <w:sz w:val="17"/>
+              </w:rPr>
+              <w:t>4.5</w:t>
+            </w:r>
+          </w:p>
+        </w:tc>
+        <w:tc>
+          <w:tcPr>
+            <w:tcW w:type="dxa" w:w="1568"/>
+          </w:tcPr>
+          <w:p>
+            <w:r/>
+            <w:r>
+              <w:rPr>
+                <w:b w:val="0"/>
+                <w:i w:val="0"/>
+                <w:sz w:val="17"/>
+              </w:rPr>
+              <w:t>1.40</w:t>
+            </w:r>
+          </w:p>
+        </w:tc>
+        <w:tc>
+          <w:tcPr>
+            <w:tcW w:type="dxa" w:w="1568"/>
+          </w:tcPr>
+          <w:p>
+            <w:r/>
+            <w:r>
+              <w:rPr>
+                <w:b w:val="0"/>
+                <w:i w:val="0"/>
+                <w:sz w:val="17"/>
+              </w:rPr>
+              <w:t>0.57</w:t>
+            </w:r>
+          </w:p>
+        </w:tc>
+        <w:tc>
+          <w:tcPr>
+            <w:tcW w:type="dxa" w:w="1568"/>
+          </w:tcPr>
+          <w:p>
+            <w:r/>
+            <w:r>
+              <w:rPr>
+                <w:b w:val="0"/>
+                <w:i w:val="0"/>
+                <w:sz w:val="17"/>
+              </w:rPr>
+              <w:t>1.00</w:t>
+            </w:r>
+          </w:p>
+        </w:tc>
+      </w:tr>
+      <w:tr>
+        <w:tc>
+          <w:tcPr>
+            <w:tcW w:type="dxa" w:w="1568"/>
+          </w:tcPr>
+          <w:p>
+            <w:r/>
+            <w:r>
+              <w:rPr>
+                <w:b w:val="0"/>
+                <w:i w:val="0"/>
+                <w:sz w:val="17"/>
+              </w:rPr>
+              <w:t>15</w:t>
+            </w:r>
+          </w:p>
+        </w:tc>
+        <w:tc>
+          <w:tcPr>
+            <w:tcW w:type="dxa" w:w="1568"/>
+          </w:tcPr>
+          <w:p>
+            <w:r/>
+            <w:r>
+              <w:rPr>
+                <w:b w:val="0"/>
+                <w:i w:val="0"/>
+                <w:sz w:val="17"/>
+              </w:rPr>
+              <w:t>inactive</w:t>
+            </w:r>
+          </w:p>
+        </w:tc>
+        <w:tc>
+          <w:tcPr>
+            <w:tcW w:type="dxa" w:w="1568"/>
+          </w:tcPr>
+          <w:p>
+            <w:r/>
+            <w:r>
+              <w:rPr>
+                <w:b w:val="0"/>
+                <w:i w:val="0"/>
+                <w:sz w:val="17"/>
+              </w:rPr>
+              <w:t>4.5</w:t>
+            </w:r>
+          </w:p>
+        </w:tc>
+        <w:tc>
+          <w:tcPr>
+            <w:tcW w:type="dxa" w:w="1568"/>
+          </w:tcPr>
+          <w:p>
+            <w:r/>
+            <w:r>
+              <w:rPr>
+                <w:b w:val="0"/>
+                <w:i w:val="0"/>
+                <w:sz w:val="17"/>
+              </w:rPr>
+              <w:t>3.79</w:t>
+            </w:r>
+          </w:p>
+        </w:tc>
+        <w:tc>
+          <w:tcPr>
+            <w:tcW w:type="dxa" w:w="1568"/>
+          </w:tcPr>
+          <w:p>
+            <w:r/>
+            <w:r>
+              <w:rPr>
+                <w:b w:val="0"/>
+                <w:i w:val="0"/>
+                <w:sz w:val="17"/>
+              </w:rPr>
+              <w:t>1.96</w:t>
+            </w:r>
+          </w:p>
+        </w:tc>
+        <w:tc>
+          <w:tcPr>
+            <w:tcW w:type="dxa" w:w="1568"/>
+          </w:tcPr>
+          <w:p>
+            <w:r/>
+            <w:r>
+              <w:rPr>
+                <w:b w:val="0"/>
+                <w:i w:val="0"/>
+                <w:sz w:val="17"/>
+              </w:rPr>
+              <w:t>1.00</w:t>
+            </w:r>
+          </w:p>
+        </w:tc>
+      </w:tr>
+      <w:tr>
+        <w:tc>
+          <w:tcPr>
+            <w:tcW w:type="dxa" w:w="1568"/>
+          </w:tcPr>
+          <w:p>
+            <w:r/>
+            <w:r>
+              <w:rPr>
+                <w:b w:val="0"/>
+                <w:i w:val="0"/>
+                <w:sz w:val="17"/>
+              </w:rPr>
+              <w:t>16</w:t>
+            </w:r>
+          </w:p>
+        </w:tc>
+        <w:tc>
+          <w:tcPr>
+            <w:tcW w:type="dxa" w:w="1568"/>
+          </w:tcPr>
+          <w:p>
+            <w:r/>
+            <w:r>
+              <w:rPr>
+                <w:b w:val="0"/>
+                <w:i w:val="0"/>
+                <w:sz w:val="17"/>
+              </w:rPr>
+              <w:t>inactive</w:t>
+            </w:r>
+          </w:p>
+        </w:tc>
+        <w:tc>
+          <w:tcPr>
+            <w:tcW w:type="dxa" w:w="1568"/>
+          </w:tcPr>
+          <w:p>
+            <w:r/>
+            <w:r>
+              <w:rPr>
+                <w:b w:val="0"/>
+                <w:i w:val="0"/>
+                <w:sz w:val="17"/>
+              </w:rPr>
+              <w:t>4.9</w:t>
+            </w:r>
+          </w:p>
+        </w:tc>
+        <w:tc>
+          <w:tcPr>
+            <w:tcW w:type="dxa" w:w="1568"/>
+          </w:tcPr>
+          <w:p>
+            <w:r/>
+            <w:r>
+              <w:rPr>
+                <w:b w:val="0"/>
+                <w:i w:val="0"/>
+                <w:sz w:val="17"/>
+              </w:rPr>
+              <w:t>1.04</w:t>
+            </w:r>
+          </w:p>
+        </w:tc>
+        <w:tc>
+          <w:tcPr>
+            <w:tcW w:type="dxa" w:w="1568"/>
+          </w:tcPr>
+          <w:p>
+            <w:r/>
+            <w:r>
+              <w:rPr>
+                <w:b w:val="0"/>
+                <w:i w:val="0"/>
+                <w:sz w:val="17"/>
+              </w:rPr>
+              <w:t>0.70</w:t>
+            </w:r>
+          </w:p>
+        </w:tc>
+        <w:tc>
+          <w:tcPr>
+            <w:tcW w:type="dxa" w:w="1568"/>
+          </w:tcPr>
+          <w:p>
+            <w:r/>
+            <w:r>
+              <w:rPr>
+                <w:b w:val="0"/>
+                <w:i w:val="0"/>
+                <w:sz w:val="17"/>
+              </w:rPr>
+              <w:t>0.00</w:t>
+            </w:r>
+          </w:p>
+        </w:tc>
+      </w:tr>
+      <w:tr>
+        <w:tc>
+          <w:tcPr>
+            <w:tcW w:type="dxa" w:w="1568"/>
+          </w:tcPr>
+          <w:p>
+            <w:r/>
+            <w:r>
+              <w:rPr>
+                <w:b w:val="0"/>
+                <w:i w:val="0"/>
+                <w:sz w:val="17"/>
+              </w:rPr>
+              <w:t>17</w:t>
+            </w:r>
+          </w:p>
+        </w:tc>
+        <w:tc>
+          <w:tcPr>
+            <w:tcW w:type="dxa" w:w="1568"/>
+          </w:tcPr>
+          <w:p>
+            <w:r/>
+            <w:r>
+              <w:rPr>
+                <w:b w:val="0"/>
+                <w:i w:val="0"/>
+                <w:sz w:val="17"/>
+              </w:rPr>
+              <w:t>inactive</w:t>
+            </w:r>
+          </w:p>
+        </w:tc>
+        <w:tc>
+          <w:tcPr>
+            <w:tcW w:type="dxa" w:w="1568"/>
+          </w:tcPr>
+          <w:p>
+            <w:r/>
+            <w:r>
+              <w:rPr>
+                <w:b w:val="0"/>
+                <w:i w:val="0"/>
+                <w:sz w:val="17"/>
+              </w:rPr>
+              <w:t>4.5</w:t>
+            </w:r>
+          </w:p>
+        </w:tc>
+        <w:tc>
+          <w:tcPr>
+            <w:tcW w:type="dxa" w:w="1568"/>
+          </w:tcPr>
+          <w:p>
+            <w:r/>
+            <w:r>
+              <w:rPr>
+                <w:b w:val="0"/>
+                <w:i w:val="0"/>
+                <w:sz w:val="17"/>
+              </w:rPr>
+              <w:t>1.17</w:t>
+            </w:r>
+          </w:p>
+        </w:tc>
+        <w:tc>
+          <w:tcPr>
+            <w:tcW w:type="dxa" w:w="1568"/>
+          </w:tcPr>
+          <w:p>
+            <w:r/>
+            <w:r>
+              <w:rPr>
+                <w:b w:val="0"/>
+                <w:i w:val="0"/>
+                <w:sz w:val="17"/>
+              </w:rPr>
+              <w:t>0.61</w:t>
+            </w:r>
+          </w:p>
+        </w:tc>
+        <w:tc>
+          <w:tcPr>
+            <w:tcW w:type="dxa" w:w="1568"/>
+          </w:tcPr>
+          <w:p>
+            <w:r/>
+            <w:r>
+              <w:rPr>
+                <w:b w:val="0"/>
+                <w:i w:val="0"/>
+                <w:sz w:val="17"/>
+              </w:rPr>
+              <w:t>0.99</w:t>
+            </w:r>
+          </w:p>
+        </w:tc>
+      </w:tr>
+      <w:tr>
+        <w:tc>
+          <w:tcPr>
+            <w:tcW w:type="dxa" w:w="1568"/>
+          </w:tcPr>
+          <w:p>
+            <w:r/>
+            <w:r>
+              <w:rPr>
+                <w:b w:val="0"/>
+                <w:i w:val="0"/>
+                <w:sz w:val="17"/>
+              </w:rPr>
+              <w:t>18</w:t>
+            </w:r>
+          </w:p>
+        </w:tc>
+        <w:tc>
+          <w:tcPr>
+            <w:tcW w:type="dxa" w:w="1568"/>
+          </w:tcPr>
+          <w:p>
+            <w:r/>
+            <w:r>
+              <w:rPr>
+                <w:b w:val="0"/>
+                <w:i w:val="0"/>
+                <w:sz w:val="17"/>
+              </w:rPr>
+              <w:t>inactive</w:t>
+            </w:r>
+          </w:p>
+        </w:tc>
+        <w:tc>
+          <w:tcPr>
+            <w:tcW w:type="dxa" w:w="1568"/>
+          </w:tcPr>
+          <w:p>
+            <w:r/>
+            <w:r>
+              <w:rPr>
+                <w:b w:val="0"/>
+                <w:i w:val="0"/>
+                <w:sz w:val="17"/>
+              </w:rPr>
+              <w:t>4.4</w:t>
+            </w:r>
+          </w:p>
+        </w:tc>
+        <w:tc>
+          <w:tcPr>
+            <w:tcW w:type="dxa" w:w="1568"/>
+          </w:tcPr>
+          <w:p>
+            <w:r/>
+            <w:r>
+              <w:rPr>
+                <w:b w:val="0"/>
+                <w:i w:val="0"/>
+                <w:sz w:val="17"/>
+              </w:rPr>
+              <w:t>2.26</w:t>
+            </w:r>
+          </w:p>
+        </w:tc>
+        <w:tc>
+          <w:tcPr>
+            <w:tcW w:type="dxa" w:w="1568"/>
+          </w:tcPr>
+          <w:p>
+            <w:r/>
+            <w:r>
+              <w:rPr>
+                <w:b w:val="0"/>
+                <w:i w:val="0"/>
+                <w:sz w:val="17"/>
+              </w:rPr>
+              <w:t>1.25</w:t>
+            </w:r>
+          </w:p>
+        </w:tc>
+        <w:tc>
+          <w:tcPr>
+            <w:tcW w:type="dxa" w:w="1568"/>
+          </w:tcPr>
+          <w:p>
+            <w:r/>
+            <w:r>
+              <w:rPr>
+                <w:b w:val="0"/>
+                <w:i w:val="0"/>
+                <w:sz w:val="17"/>
+              </w:rPr>
+              <w:t>0.98</w:t>
+            </w:r>
+          </w:p>
+        </w:tc>
+      </w:tr>
+      <w:tr>
+        <w:tc>
+          <w:tcPr>
+            <w:tcW w:type="dxa" w:w="1568"/>
+          </w:tcPr>
+          <w:p>
+            <w:r/>
+            <w:r>
+              <w:rPr>
+                <w:b w:val="0"/>
+                <w:i w:val="0"/>
+                <w:sz w:val="17"/>
+              </w:rPr>
+              <w:t>19</w:t>
+            </w:r>
+          </w:p>
+        </w:tc>
+        <w:tc>
+          <w:tcPr>
+            <w:tcW w:type="dxa" w:w="1568"/>
+          </w:tcPr>
+          <w:p>
+            <w:r/>
+            <w:r>
+              <w:rPr>
+                <w:b w:val="0"/>
+                <w:i w:val="0"/>
+                <w:sz w:val="17"/>
+              </w:rPr>
+              <w:t>inactive</w:t>
+            </w:r>
+          </w:p>
+        </w:tc>
+        <w:tc>
+          <w:tcPr>
+            <w:tcW w:type="dxa" w:w="1568"/>
+          </w:tcPr>
+          <w:p>
+            <w:r/>
+            <w:r>
+              <w:rPr>
+                <w:b w:val="0"/>
+                <w:i w:val="0"/>
+                <w:sz w:val="17"/>
+              </w:rPr>
+              <w:t>4.5</w:t>
+            </w:r>
+          </w:p>
+        </w:tc>
+        <w:tc>
+          <w:tcPr>
+            <w:tcW w:type="dxa" w:w="1568"/>
+          </w:tcPr>
+          <w:p>
+            <w:r/>
+            <w:r>
+              <w:rPr>
+                <w:b w:val="0"/>
+                <w:i w:val="0"/>
+                <w:sz w:val="17"/>
+              </w:rPr>
+              <w:t>1.26</w:t>
+            </w:r>
+          </w:p>
+        </w:tc>
+        <w:tc>
+          <w:tcPr>
+            <w:tcW w:type="dxa" w:w="1568"/>
+          </w:tcPr>
+          <w:p>
+            <w:r/>
+            <w:r>
+              <w:rPr>
+                <w:b w:val="0"/>
+                <w:i w:val="0"/>
+                <w:sz w:val="17"/>
+              </w:rPr>
+              <w:t>0.94</w:t>
+            </w:r>
+          </w:p>
+        </w:tc>
+        <w:tc>
+          <w:tcPr>
+            <w:tcW w:type="dxa" w:w="1568"/>
+          </w:tcPr>
+          <w:p>
+            <w:r/>
+            <w:r>
+              <w:rPr>
+                <w:b w:val="0"/>
+                <w:i w:val="0"/>
+                <w:sz w:val="17"/>
+              </w:rPr>
+              <w:t>0.00</w:t>
+            </w:r>
+          </w:p>
+        </w:tc>
+      </w:tr>
+      <w:tr>
+        <w:tc>
+          <w:tcPr>
+            <w:tcW w:type="dxa" w:w="1568"/>
+          </w:tcPr>
+          <w:p>
+            <w:r/>
+            <w:r>
+              <w:rPr>
+                <w:b w:val="0"/>
+                <w:i w:val="0"/>
+                <w:sz w:val="17"/>
+              </w:rPr>
+              <w:t>20</w:t>
+            </w:r>
+          </w:p>
+        </w:tc>
+        <w:tc>
+          <w:tcPr>
+            <w:tcW w:type="dxa" w:w="1568"/>
+          </w:tcPr>
+          <w:p>
+            <w:r/>
+            <w:r>
+              <w:rPr>
+                <w:b w:val="0"/>
+                <w:i w:val="0"/>
+                <w:sz w:val="17"/>
+              </w:rPr>
+              <w:t>inactive</w:t>
+            </w:r>
+          </w:p>
+        </w:tc>
+        <w:tc>
+          <w:tcPr>
+            <w:tcW w:type="dxa" w:w="1568"/>
+          </w:tcPr>
+          <w:p>
+            <w:r/>
+            <w:r>
+              <w:rPr>
+                <w:b w:val="0"/>
+                <w:i w:val="0"/>
+                <w:sz w:val="17"/>
+              </w:rPr>
+              <w:t>4.6</w:t>
+            </w:r>
+          </w:p>
+        </w:tc>
+        <w:tc>
+          <w:tcPr>
+            <w:tcW w:type="dxa" w:w="1568"/>
+          </w:tcPr>
+          <w:p>
+            <w:r/>
+            <w:r>
+              <w:rPr>
+                <w:b w:val="0"/>
+                <w:i w:val="0"/>
+                <w:sz w:val="17"/>
+              </w:rPr>
+              <w:t>0.69</w:t>
+            </w:r>
+          </w:p>
+        </w:tc>
+        <w:tc>
+          <w:tcPr>
+            <w:tcW w:type="dxa" w:w="1568"/>
+          </w:tcPr>
+          <w:p>
+            <w:r/>
+            <w:r>
+              <w:rPr>
+                <w:b w:val="0"/>
+                <w:i w:val="0"/>
+                <w:sz w:val="17"/>
+              </w:rPr>
+              <w:t>0.47</w:t>
+            </w:r>
+          </w:p>
+        </w:tc>
+        <w:tc>
+          <w:tcPr>
+            <w:tcW w:type="dxa" w:w="1568"/>
+          </w:tcPr>
+          <w:p>
+            <w:r/>
+            <w:r>
+              <w:rPr>
+                <w:b w:val="0"/>
+                <w:i w:val="0"/>
+                <w:sz w:val="17"/>
+              </w:rPr>
+              <w:t>0.00</w:t>
+            </w:r>
+          </w:p>
+        </w:tc>
+      </w:tr>
+    </w:tbl>
+    <w:p>
       <w:pPr>
         <w:pStyle w:val="Heading2"/>
       </w:pPr>
@@ -14337,7 +16441,7 @@
           <w:b w:val="0"/>
           <w:i w:val="0"/>
         </w:rPr>
-        <w:t>Nothing reported here has been synthesized or assayed; every property is a prediction. The activity model is reliable only near known chemistry (in the time-split test it did not beat nearest-neighbour similarity for compounds unlike its training set, Section 2.8), the docking score is a weak filter, the exposure estimate is a regression on total brain-to-blood ratios (cross-validated RMSE 0.55 log units, a typical error of a factor of about 3.5) and not a measured unbound ratio, and the P-gp and BCRP models are proxies. The margin that ranks the molecules is defined by those models, so a larger margin means the molecule sits farther inside their thresholds and not that it is a more potent inhibitor. The statement that these 106 molecules are the strongest we could find holds for the 2,700 designs generated and for the gates stated in Table 11; molecules outside the library, from a different generator, or judged by different models are not covered. The set is also a selection near threshold edges: only the 63 priority-tier molecules have at least 10 % margin, and none of the 106 can be ranked for hERG risk with the models we have. The edits come from a matched-pair library whose transformations are mostly exploratory-tier (all 106 delivered molecules) and are matched on the fragment and its attachment atom only, so an exchange that is common in the library may be a poor choice on a given scaffold; the retrosynthesis check is the evidence that the molecules can be made, and it is a computed route and not a demonstrated one. In a blind re-discovery test the edit library did not find later-reported compounds better than random draws of other edits, so we do not claim that the edit selection adds anything beyond the gates and the anchoring to measured parents. The first experimental step is an Ellman assay[25] for AChE inhibition with donepezil on the same plate, a BChE counter-screen, an MDCK-MDR1 permeability assay with and without a P-gp inhibitor, a BCRP transport assay and hERG patch clamp, beginning with the molecules that have a one- or two-step route.</w:t>
+        <w:t>Nothing reported here has been synthesized or assayed; every property is a prediction. The activity model is reliable only near known chemistry (in the time-split test it did not beat nearest-neighbour similarity for compounds unlike its training set, Section 2.8), the docking score is a weak filter, the exposure estimate is a regression on total brain-to-blood ratios (cross-validated RMSE 0.55 log units, a typical error of a factor of about 3.5) and not a measured unbound ratio, and the P-gp and BCRP models are proxies. The margin that ranks the molecules is defined by those models, so a larger margin means the molecule sits farther inside their thresholds and not that it is a more potent inhibitor. The statement that these 106 molecules are the strongest we could find holds for the 2,700 designs generated and for the gates stated in Table 12; molecules outside the library, from a different generator, or judged by different models are not covered. The set is also a selection near threshold edges: only the 63 priority-tier molecules have at least 10 % margin, and none of the 106 can be ranked for hERG risk with the models we have. The edits come from a matched-pair library whose transformations are mostly exploratory-tier (all 106 delivered molecules) and are matched on the fragment and its attachment atom only, so an exchange that is common in the library may be a poor choice on a given scaffold; the retrosynthesis check is the evidence that the molecules can be made, and it is a computed route and not a demonstrated one. In a blind re-discovery test the edit library did not find later-reported compounds better than random draws of other edits, so we do not claim that the edit selection adds anything beyond the gates and the anchoring to measured parents. The first experimental step is an Ellman assay[25] for AChE inhibition with donepezil on the same plate, a BChE counter-screen, an MDCK-MDR1 permeability assay with and without a P-gp inhibitor, a BCRP transport assay and hERG patch clamp, beginning with the molecules that have a one- or two-step route.</w:t>
       </w:r>
     </w:p>
     <w:p>
@@ -14444,7 +16548,7 @@
           <w:b w:val="0"/>
           <w:i w:val="0"/>
         </w:rPr>
-        <w:t>Round 1 applied each of the 222 transformations once to all 2,225 parents (38,209 distinct analogues). Round 2 applied a second transformation to 16,000 round-1 products, a random sample (seed 0) of the size-filtered round-1 analogues, giving 345,543 further analogues; the two rounds together are the 383,752 distinct one- or two-edit analogues of this study (Table 10). These were reduced at the design stage in the order of Table 10: removal of structures already present in the project's training data, size, CNS MPO, synthetic-accessibility, PAINS[34]/Brenk[35] and unstable-group filters, agreement of two independent BBB models, a predicted AChE probability of at least 0.5, and a limit of eight designs per scaffold chosen by a confidence score. The 2,454 survivors of the 16,000-seed run and 859 designs from the earlier single-edit run (613 shared) form the 2,700 stored designs, from 386 distinct parents, of which 1,838 are two-edit and 862 one-edit molecules. The gates of Section 4.3 were applied to these 2,700 designs only, so the 383,752 analogues are a pool that was screened by the design-stage filters and not by the audited gates.</w:t>
+        <w:t>Round 1 applied each of the 222 transformations once to all 2,225 parents (38,209 distinct analogues). Round 2 applied a second transformation to 16,000 round-1 products, a random sample (seed 0) of the size-filtered round-1 analogues, giving 345,543 further analogues; the two rounds together are the 383,752 distinct one- or two-edit analogues of this study (Table 11). These were reduced at the design stage in the order of Table 11: removal of structures already present in the project's training data, size, CNS MPO, synthetic-accessibility, PAINS[34]/Brenk[35] and unstable-group filters, agreement of two independent BBB models, a predicted AChE probability of at least 0.5, and a limit of eight designs per scaffold chosen by a confidence score. The 2,454 survivors of the 16,000-seed run and 859 designs from the earlier single-edit run (613 shared) form the 2,700 stored designs, from 386 distinct parents, of which 1,838 are two-edit and 862 one-edit molecules. The gates of Section 4.3 were applied to these 2,700 designs only, so the 383,752 analogues are a pool that was screened by the design-stage filters and not by the audited gates.</w:t>
       </w:r>
     </w:p>
     <w:p>
@@ -14453,7 +16557,7 @@
           <w:b w:val="0"/>
           <w:i w:val="0"/>
         </w:rPr>
-        <w:t>The delivered molecules use only 22 distinct transformations, all of them ordinary medicinal-chemistry substitutions: methyl to cyclopropyl (22); phenyl to methyl (14); methoxy to methyl (11); methyl to cyclopropylmethyl (11); ethyl to propyl (8); methoxy to methylthio (7). 39 of the 106 are one-edit and 67 two-edit molecules; all 106 come from exploratory-tier transformations (median 9 pairs per transformation, range 5 to 111), and only 5 carry a transformation with q&lt;0.05. The transformation statistics describe how an edit moved brain penetration in other compounds; they do not show that an edit preserves AChE inhibition on a particular parent, which is only predicted by the activity model, and the matched-pair statistics did no better than random edits when tested (Table 11). That an edit can be made is supported differently: each delivered molecule has a computed route of one to six steps from purchasable materials, found by retrosynthesis and independent of the transformation library (Section 4.7).</w:t>
+        <w:t>The delivered molecules use only 22 distinct transformations, all of them ordinary medicinal-chemistry substitutions: methyl to cyclopropyl (22); phenyl to methyl (14); methoxy to methyl (11); methyl to cyclopropylmethyl (11); ethyl to propyl (8); methoxy to methylthio (7). 39 of the 106 are one-edit and 67 two-edit molecules; all 106 come from exploratory-tier transformations (median 9 pairs per transformation, range 5 to 111), and only 5 carry a transformation with q&lt;0.05. The transformation statistics describe how an edit moved brain penetration in other compounds; they do not show that an edit preserves AChE inhibition on a particular parent, which is only predicted by the activity model, and the matched-pair statistics did no better than random edits when tested (Table 12). That an edit can be made is supported differently: each delivered molecule has a computed route of one to six steps from purchasable materials, found by retrosynthesis and independent of the transformation library (Section 4.7).</w:t>
       </w:r>
     </w:p>
     <w:p>
@@ -14461,7 +16565,7 @@
         <w:rPr>
           <w:b/>
         </w:rPr>
-        <w:t xml:space="preserve">Table 10. </w:t>
+        <w:t xml:space="preserve">Table 11. </w:t>
       </w:r>
       <w:r>
         <w:rPr>
@@ -14469,7 +16573,7 @@
           <w:i w:val="0"/>
           <w:sz w:val="19"/>
         </w:rPr>
-        <w:t>Generation of the stored designs: from the potent published parents to the 2,700 designs that enter the gates of Table 11. Counts are from the design runs; the shared designs are those found in both runs.</w:t>
+        <w:t>Generation of the stored designs: from the potent published parents to the 2,700 designs that enter the gates of Table 12. Counts are from the design runs; the shared designs are those found in both runs.</w:t>
       </w:r>
     </w:p>
     <w:tbl>
@@ -14941,7 +17045,7 @@
           <w:b w:val="0"/>
           <w:i w:val="0"/>
         </w:rPr>
-        <w:t xml:space="preserve">The stored designs of Section 4.2 entered the gates in the order below. Candidates had to pass the gates of Table 11 in this order. Two kinds of threshold are used: </w:t>
+        <w:t xml:space="preserve">The stored designs of Section 4.2 entered the gates in the order below. Candidates had to pass the gates of Table 12 in this order. Two kinds of threshold are used: </w:t>
       </w:r>
       <w:r>
         <w:rPr>
@@ -15005,7 +17109,7 @@
         <w:rPr>
           <w:b/>
         </w:rPr>
-        <w:t xml:space="preserve">Table 11. </w:t>
+        <w:t xml:space="preserve">Table 12. </w:t>
       </w:r>
       <w:r>
         <w:rPr>

</xml_diff>

<commit_message>
Remove the Statement of Contribution section
</commit_message>
<xml_diff>
--- a/paper/Manuscript_MolInf.docx
+++ b/paper/Manuscript_MolInf.docx
@@ -17995,23 +17995,6 @@
           <w:i w:val="0"/>
         </w:rPr>
         <w:t xml:space="preserve"> records with a pChEMBL value (5,814 compounds after standardisation to the largest fragment without stereochemistry; mean pChEMBL per compound, and per publication for same-publication pairs). Matched pairs were found by one-cut fragmentation as in the design stage; for each of the 22 transformations of the delivered set every pair of measured compounds with the same constant part and the two variable fragments exchanged in the design direction was taken, and the shares were bootstrapped over publications (2,000 resamples) because pairs from one publication are not independent. The first edit of a two-edit molecule was recovered by applying every transformation to the parent and keeping the one that gives the stored intermediate. The in-domain time-split test repeats the time-split procedure for later compounds whose maximum ECFP4 similarity to the training actives is at least 0.417; calibration used a random 25 % of the training compounds as a calibration set (reliability in ten equal-count bins; split-conformal sets with score one minus the probability of the true class) and the 2015 cutoff. The re-discovery test generated one- and two-edit analogues (second edit on a random 16,000 of the size-filtered round-1 products, seed 0) from the potent parents (pChEMBL of at least 6.5) first reported up to each cutoff, using the design stage's 222 transformations, and counted exact matches with compounds first reported later; the comparison sets were random draws of 222 of the 868 unused library transformations.</w:t>
-      </w:r>
-    </w:p>
-    <w:p>
-      <w:pPr>
-        <w:pStyle w:val="Heading2"/>
-      </w:pPr>
-      <w:r>
-        <w:t>Statement of Contribution</w:t>
-      </w:r>
-    </w:p>
-    <w:p>
-      <w:r>
-        <w:rPr>
-          <w:b w:val="0"/>
-          <w:i w:val="0"/>
-        </w:rPr>
-        <w:t>All authors contributed to the design of the study and the writing of the manuscript. [Individual contributions to be completed by the authors.]</w:t>
       </w:r>
     </w:p>
     <w:p>

</xml_diff>

<commit_message>
Restore truncated re-discovery paragraph, journal-length abstract, MD validation in limitations and methods, figure and table fixes
</commit_message>
<xml_diff>
--- a/paper/Manuscript_MolInf.docx
+++ b/paper/Manuscript_MolInf.docx
@@ -47,7 +47,7 @@
           <w:b w:val="0"/>
           <w:i w:val="0"/>
         </w:rPr>
-        <w:t>Computational papers on acetylcholinesterase (AChE) inhibitors rarely go beyond predicted potency. We enumerated 383,752 analogues of 2,225 potent published inhibitors by one or two matched-pair edits, kept 2,700 that passed design-stage filters and passed them through gates for activity, brain penetration, drug-likeness, toxicity, docking, protonation and stereochemistry, a four-source novelty search and computed retrosynthesis. 106 molecules on 63 scaffolds cleared every gate with at least 5 % margin (63 with 10 % or more), each absent from PubChem, ChEMBL and SureChEMBL and each with a computed route of one to six steps from purchasable materials. A shortlist of 20 was ranked under 5,000 random weightings of eight further checks. The models behind the gates were tested on held-out scaffolds and on compounds published after a cutoff year, where the activity model beat simple baselines overall but not for chemistry unlike its training set; molecular dynamics in two 2 ns replicas left no shortlisted molecule outside the gorge, although the RMSD criterion varied between replicas (donepezil 2.1 and 3.1 Å), and the same screen did not separate ten potent from ten inactive published compounds (area under the curve 0.47); and the weak components (docking score, efflux term, hERG) are reported. The substitutions used preserve potency to within 0.5 log units in 64.5 % of measured AChE compound pairs (51.6 % for other exchanges), every molecule is tied to a measured potent parent, and inside its applicability domain the activity model ranks later-published compounds with ROC-AUC 0.81 (0.68 for nearest-neighbour similarity). All results are predictions; nothing has been synthesized.</w:t>
+        <w:t>Computational studies of acetylcholinesterase (AChE) inhibitors rarely go beyond predicted potency. We made 383,752 analogues of 2,225 potent published inhibitors by one or two matched-pair edits and passed 2,700 of them through gates for activity, brain penetration, toxicity, docking, stereochemistry, a four-source novelty search and computed retrosynthesis. 106 molecules on 63 scaffolds cleared every gate with at least 5 % margin; each is absent from PubChem, ChEMBL and SureChEMBL and has a computed route of one to six steps from purchasable materials. In time-split tests the activity model beat nearest-neighbour similarity only inside its applicability domain (ROC-AUC 0.81 against 0.68); the docking score, efflux term, hERG model and a molecular-dynamics pose screen were weak or did not discriminate, and are reported as such. All results are predictions; nothing has been synthesized.</w:t>
       </w:r>
     </w:p>
     <w:p>
@@ -3626,7 +3626,7 @@
                 <w:i w:val="0"/>
                 <w:sz w:val="17"/>
               </w:rPr>
-              <w:t>-11.8</w:t>
+              <w:t>−11.8</w:t>
             </w:r>
           </w:p>
         </w:tc>
@@ -3740,7 +3740,7 @@
                 <w:i w:val="0"/>
                 <w:sz w:val="17"/>
               </w:rPr>
-              <w:t>-8.2</w:t>
+              <w:t>−8.2</w:t>
             </w:r>
           </w:p>
         </w:tc>
@@ -3854,7 +3854,7 @@
                 <w:i w:val="0"/>
                 <w:sz w:val="17"/>
               </w:rPr>
-              <w:t>-7.8</w:t>
+              <w:t>−7.8</w:t>
             </w:r>
           </w:p>
         </w:tc>
@@ -3936,7 +3936,7 @@
                 <w:i w:val="0"/>
                 <w:sz w:val="17"/>
               </w:rPr>
-              <w:t>-0.30</w:t>
+              <w:t>−0.30</w:t>
             </w:r>
           </w:p>
         </w:tc>
@@ -3968,7 +3968,7 @@
                 <w:i w:val="0"/>
                 <w:sz w:val="17"/>
               </w:rPr>
-              <w:t>-8.8</w:t>
+              <w:t>−8.8</w:t>
             </w:r>
           </w:p>
         </w:tc>
@@ -4050,7 +4050,7 @@
                 <w:i w:val="0"/>
                 <w:sz w:val="17"/>
               </w:rPr>
-              <w:t>-0.14</w:t>
+              <w:t>−0.14</w:t>
             </w:r>
           </w:p>
         </w:tc>
@@ -4082,7 +4082,7 @@
                 <w:i w:val="0"/>
                 <w:sz w:val="17"/>
               </w:rPr>
-              <w:t>-9.3</w:t>
+              <w:t>−9.3</w:t>
             </w:r>
           </w:p>
         </w:tc>
@@ -4196,7 +4196,7 @@
                 <w:i w:val="0"/>
                 <w:sz w:val="17"/>
               </w:rPr>
-              <w:t>-10.9</w:t>
+              <w:t>−10.9</w:t>
             </w:r>
           </w:p>
         </w:tc>
@@ -6871,7 +6871,7 @@
           <w:b w:val="0"/>
           <w:i w:val="0"/>
         </w:rPr>
-        <w:t>Blind re-discovery. Using only compounds reported up to a cutoff year, we applied the design stage's edits to the potent parents and asked how many compounds reported later were reproduced exactly and how close the generated analogues came to later potent compounds: at the 2015 cutoff the design-stage edits generated 325,244 analogues from 1,247 earlier potent parents and reproduced 7 of the 2,784 later compounds exactly (5 of the 593 later potent compounds), against 5 to 8 (2 to 3 potent) for 3 random draws of unused edits; the share of later potent compounds with a generated analogue at ECFP4 similarity of at least 0.8 was 2.9 % for the design-stage edits and 2.0 to 2.9 % for the random draws (mean highest similarity 0.48 against 0.47 to 0.47); at the 2018 cutoff the design-stage edits generated 345,702 analogues from 1,531 earlier potent parents and reproduced 6 of the 1,819 later compounds exactly (3 of the 393 later potent compounds), against 4 to 4 (1 to 3 potent) for 3 random draws of unused edits; the share of later potent compounds with a generated analogue at ECFP4 similarity of at least 0.8 was 2.5 % for the design-stage edits and 1.5 to 2.3 % for the random draws (mean highest similarity 0.49 against 0.47 to 0.48); at the 2012 cutoff (exact matches only) the design-stage edits reproduced 5 later compounds (4 potent) against 3 to 8 (2 to 3 potent) for 2 random draws. Exact re-discovery is rare and the counts are too small to separate the edit sets, and the near-recovery measure shows at most a small difference (the design-stage edits are within the range of the random draws at 2015 and slightly above it at 2018): the edit library has not been shown to find future compounds clearly better than other edits, which agrees with the matched-pair statistics test of Table 12. The value of the cascade therefore lies in its gates and its anchoring to measured parents and not in the edit selection.</w:t>
+        <w:t>Blind re-discovery. Using only compounds reported up to a cutoff year, we applied the design stage's edits to the potent parents and asked how many compounds reported later were reproduced exactly and how close the generated analogues came to later potent compounds: at the 2015 cutoff the design-stage edits generated 325,244 analogues from 1,247 earlier potent parents and reproduced 7 of the 2,784 later compounds exactly (5 of the 593 later potent compounds), against 5 to 8 (2 to 3 potent) for 3 random draws of unused edits; the share of later potent compounds with a generated analogue at ECFP4 similarity of at least 0.8 was 2.9 % for the design-stage edits and 2.0 to 2.9 % for the random draws (mean highest similarity 0.48 against 0.47); at the 2018 cutoff the design-stage edits generated 345,702 analogues from 1,531 earlier potent parents and reproduced 6 of the 1,819 later compounds exactly (3 of the 393 later potent compounds), against 4 (1 to 3 potent) for 3 random draws of unused edits; the share of later potent compounds with a generated analogue at ECFP4 similarity of at least 0.8 was 2.5 % for the design-stage edits and 1.5 to 2.3 % for the random draws (mean highest similarity 0.49 against 0.47 to 0.48); at the 2012 cutoff (exact matches only) the design-stage edits reproduced 5 later compounds (4 potent) against 3 to 8 (2 to 3 potent) for 2 random draws. Exact re-discovery is rare and the counts are too small to separate the edit sets, and the near-recovery measure shows at most a small difference (the design-stage edits are within the range of the random draws at 2015 and slightly above it at 2018): the edit library has not been shown to find future compounds clearly better than other edits, which agrees with the matched-pair statistics test of Table 12. The value of the cascade therefore lies in its gates and its anchoring to measured parents and not in the edit selection.</w:t>
       </w:r>
     </w:p>
     <w:p>
@@ -7094,7 +7094,7 @@
                 <w:i w:val="0"/>
                 <w:sz w:val="17"/>
               </w:rPr>
-              <w:t>Me\tocPr</w:t>
+              <w:t>Me→cPr</w:t>
             </w:r>
           </w:p>
         </w:tc>
@@ -7208,7 +7208,7 @@
                 <w:i w:val="0"/>
                 <w:sz w:val="17"/>
               </w:rPr>
-              <w:t>Ph\toMe</w:t>
+              <w:t>Ph→Me</w:t>
             </w:r>
           </w:p>
         </w:tc>
@@ -7322,7 +7322,7 @@
                 <w:i w:val="0"/>
                 <w:sz w:val="17"/>
               </w:rPr>
-              <w:t>Me\toCH2cPr</w:t>
+              <w:t>Me→CH2cPr</w:t>
             </w:r>
           </w:p>
         </w:tc>
@@ -7436,7 +7436,7 @@
                 <w:i w:val="0"/>
                 <w:sz w:val="17"/>
               </w:rPr>
-              <w:t>OMe\toMe</w:t>
+              <w:t>OMe→Me</w:t>
             </w:r>
           </w:p>
         </w:tc>
@@ -7500,7 +7500,7 @@
                 <w:i w:val="0"/>
                 <w:sz w:val="17"/>
               </w:rPr>
-              <w:t>-0.03</w:t>
+              <w:t>−0.03</w:t>
             </w:r>
           </w:p>
         </w:tc>
@@ -7550,7 +7550,7 @@
                 <w:i w:val="0"/>
                 <w:sz w:val="17"/>
               </w:rPr>
-              <w:t>Et\toPr</w:t>
+              <w:t>Et→Pr</w:t>
             </w:r>
           </w:p>
         </w:tc>
@@ -7614,7 +7614,7 @@
                 <w:i w:val="0"/>
                 <w:sz w:val="17"/>
               </w:rPr>
-              <w:t>-0.10</w:t>
+              <w:t>−0.10</w:t>
             </w:r>
           </w:p>
         </w:tc>
@@ -7664,7 +7664,7 @@
                 <w:i w:val="0"/>
                 <w:sz w:val="17"/>
               </w:rPr>
-              <w:t>OMe\toSMe</w:t>
+              <w:t>OMe→SMe</w:t>
             </w:r>
           </w:p>
         </w:tc>
@@ -7728,7 +7728,7 @@
                 <w:i w:val="0"/>
                 <w:sz w:val="17"/>
               </w:rPr>
-              <w:t>-0.29</w:t>
+              <w:t>−0.29</w:t>
             </w:r>
           </w:p>
         </w:tc>
@@ -7778,7 +7778,7 @@
                 <w:i w:val="0"/>
                 <w:sz w:val="17"/>
               </w:rPr>
-              <w:t>OMe\toCl</w:t>
+              <w:t>OMe→Cl</w:t>
             </w:r>
           </w:p>
         </w:tc>
@@ -7892,7 +7892,7 @@
                 <w:i w:val="0"/>
                 <w:sz w:val="17"/>
               </w:rPr>
-              <w:t>Cl\toF</w:t>
+              <w:t>Cl→F</w:t>
             </w:r>
           </w:p>
         </w:tc>
@@ -8006,7 +8006,7 @@
                 <w:i w:val="0"/>
                 <w:sz w:val="17"/>
               </w:rPr>
-              <w:t>CH2Cl\toCH2OH</w:t>
+              <w:t>CH2Cl→CH2OH</w:t>
             </w:r>
           </w:p>
         </w:tc>
@@ -8120,7 +8120,7 @@
                 <w:i w:val="0"/>
                 <w:sz w:val="17"/>
               </w:rPr>
-              <w:t>Et\toMe</w:t>
+              <w:t>Et→Me</w:t>
             </w:r>
           </w:p>
         </w:tc>
@@ -8234,7 +8234,7 @@
                 <w:i w:val="0"/>
                 <w:sz w:val="17"/>
               </w:rPr>
-              <w:t>Me\toCl</w:t>
+              <w:t>Me→Cl</w:t>
             </w:r>
           </w:p>
         </w:tc>
@@ -8348,7 +8348,7 @@
                 <w:i w:val="0"/>
                 <w:sz w:val="17"/>
               </w:rPr>
-              <w:t>cPr\toEt</w:t>
+              <w:t>cPr→Et</w:t>
             </w:r>
           </w:p>
         </w:tc>
@@ -8412,7 +8412,7 @@
                 <w:i w:val="0"/>
                 <w:sz w:val="17"/>
               </w:rPr>
-              <w:t>-0.04</w:t>
+              <w:t>−0.04</w:t>
             </w:r>
           </w:p>
         </w:tc>
@@ -8611,7 +8611,7 @@
                 <w:i w:val="0"/>
                 <w:sz w:val="17"/>
               </w:rPr>
-              <w:t>OMe\toSMe</w:t>
+              <w:t>OMe→SMe</w:t>
             </w:r>
           </w:p>
         </w:tc>
@@ -8693,7 +8693,7 @@
                 <w:i w:val="0"/>
                 <w:sz w:val="17"/>
               </w:rPr>
-              <w:t>OMe\toSMe</w:t>
+              <w:t>OMe→SMe</w:t>
             </w:r>
           </w:p>
         </w:tc>
@@ -8775,7 +8775,7 @@
                 <w:i w:val="0"/>
                 <w:sz w:val="17"/>
               </w:rPr>
-              <w:t>Ph\toMe, Me\tocPr</w:t>
+              <w:t>Ph→Me, Me→cPr</w:t>
             </w:r>
           </w:p>
         </w:tc>
@@ -8857,7 +8857,7 @@
                 <w:i w:val="0"/>
                 <w:sz w:val="17"/>
               </w:rPr>
-              <w:t>Me\tocPr</w:t>
+              <w:t>Me→cPr</w:t>
             </w:r>
           </w:p>
         </w:tc>
@@ -8939,7 +8939,7 @@
                 <w:i w:val="0"/>
                 <w:sz w:val="17"/>
               </w:rPr>
-              <w:t>Me\toCH2Cl, CH2Cl\toCH2OH</w:t>
+              <w:t>Me→CH2Cl, CH2Cl→CH2OH</w:t>
             </w:r>
           </w:p>
         </w:tc>
@@ -9021,7 +9021,7 @@
                 <w:i w:val="0"/>
                 <w:sz w:val="17"/>
               </w:rPr>
-              <w:t>Ph\toMe, Me\toCH2cPr</w:t>
+              <w:t>Ph→Me, Me→CH2cPr</w:t>
             </w:r>
           </w:p>
         </w:tc>
@@ -9103,7 +9103,7 @@
                 <w:i w:val="0"/>
                 <w:sz w:val="17"/>
               </w:rPr>
-              <w:t>Ph\toMe, Me\tocPr</w:t>
+              <w:t>Ph→Me, Me→cPr</w:t>
             </w:r>
           </w:p>
         </w:tc>
@@ -9185,7 +9185,7 @@
                 <w:i w:val="0"/>
                 <w:sz w:val="17"/>
               </w:rPr>
-              <w:t>Me\tocPr</w:t>
+              <w:t>Me→cPr</w:t>
             </w:r>
           </w:p>
         </w:tc>
@@ -9267,7 +9267,7 @@
                 <w:i w:val="0"/>
                 <w:sz w:val="17"/>
               </w:rPr>
-              <w:t>Me\tocPr, Ph\toMe</w:t>
+              <w:t>Me→cPr, Ph→Me</w:t>
             </w:r>
           </w:p>
         </w:tc>
@@ -9349,7 +9349,7 @@
                 <w:i w:val="0"/>
                 <w:sz w:val="17"/>
               </w:rPr>
-              <w:t>Me\tocPr, Ph\toMe</w:t>
+              <w:t>Me→cPr, Ph→Me</w:t>
             </w:r>
           </w:p>
         </w:tc>
@@ -9431,7 +9431,7 @@
                 <w:i w:val="0"/>
                 <w:sz w:val="17"/>
               </w:rPr>
-              <w:t>OMe\toMe</w:t>
+              <w:t>OMe→Me</w:t>
             </w:r>
           </w:p>
         </w:tc>
@@ -9513,7 +9513,7 @@
                 <w:i w:val="0"/>
                 <w:sz w:val="17"/>
               </w:rPr>
-              <w:t>Ph\toMe</w:t>
+              <w:t>Ph→Me</w:t>
             </w:r>
           </w:p>
         </w:tc>
@@ -9595,7 +9595,7 @@
                 <w:i w:val="0"/>
                 <w:sz w:val="17"/>
               </w:rPr>
-              <w:t>Me\tocPr, Ph\toMe</w:t>
+              <w:t>Me→cPr, Ph→Me</w:t>
             </w:r>
           </w:p>
         </w:tc>
@@ -9677,7 +9677,7 @@
                 <w:i w:val="0"/>
                 <w:sz w:val="17"/>
               </w:rPr>
-              <w:t>Ph\toMe, Me\toCH2cPr</w:t>
+              <w:t>Ph→Me, Me→CH2cPr</w:t>
             </w:r>
           </w:p>
         </w:tc>
@@ -9759,7 +9759,7 @@
                 <w:i w:val="0"/>
                 <w:sz w:val="17"/>
               </w:rPr>
-              <w:t>Me\tocPr, Ph\toMe</w:t>
+              <w:t>Me→cPr, Ph→Me</w:t>
             </w:r>
           </w:p>
         </w:tc>
@@ -9841,7 +9841,7 @@
                 <w:i w:val="0"/>
                 <w:sz w:val="17"/>
               </w:rPr>
-              <w:t>Ph\to2-F-Ph</w:t>
+              <w:t>Ph→2-F-Ph</w:t>
             </w:r>
           </w:p>
         </w:tc>
@@ -9923,7 +9923,7 @@
                 <w:i w:val="0"/>
                 <w:sz w:val="17"/>
               </w:rPr>
-              <w:t>Ph\toMe, Et\toPr</w:t>
+              <w:t>Ph→Me, Et→Pr</w:t>
             </w:r>
           </w:p>
         </w:tc>
@@ -10005,7 +10005,7 @@
                 <w:i w:val="0"/>
                 <w:sz w:val="17"/>
               </w:rPr>
-              <w:t>OMe\toMe</w:t>
+              <w:t>OMe→Me</w:t>
             </w:r>
           </w:p>
         </w:tc>
@@ -10087,7 +10087,7 @@
                 <w:i w:val="0"/>
                 <w:sz w:val="17"/>
               </w:rPr>
-              <w:t>Ph\toMe, Et\toPr</w:t>
+              <w:t>Ph→Me, Et→Pr</w:t>
             </w:r>
           </w:p>
         </w:tc>
@@ -10169,7 +10169,7 @@
                 <w:i w:val="0"/>
                 <w:sz w:val="17"/>
               </w:rPr>
-              <w:t>Ph\toMe</w:t>
+              <w:t>Ph→Me</w:t>
             </w:r>
           </w:p>
         </w:tc>
@@ -14345,7 +14345,7 @@
           <w:i w:val="0"/>
           <w:sz w:val="19"/>
         </w:rPr>
-        <w:t>Does the pose-stability screen separate potent from inactive published AChE compounds? Ten potent (pChEMBL at least 8.5) and ten inactive (below 5) compounds from ChEMBL were docked and simulated with the protocol of the shortlist (one 2 ns trajectory each, seed 7). RMSD and COM shift: second half of production (Å); Trp86: fraction of frames with a ligand ring within 5.5 Å of the Trp86 indole.</w:t>
+        <w:t>Does the pose-stability screen separate potent from inactive published AChE compounds? Ten potent (pChEMBL at least 8.5) and ten inactive (below 5) compounds from ChEMBL were docked and simulated with the protocol of the shortlist (one 2 ns trajectory each, seed 7). RMSD and COM shift: second half of production (Å); Trp86: fraction of frames with a ligand aromatic ring centroid within 5.5 Å of the Trp86 ring centroid.</w:t>
       </w:r>
     </w:p>
     <w:tbl>
@@ -16441,7 +16441,7 @@
           <w:b w:val="0"/>
           <w:i w:val="0"/>
         </w:rPr>
-        <w:t>Nothing reported here has been synthesized or assayed; every property is a prediction. The activity model is reliable only near known chemistry (in the time-split test it did not beat nearest-neighbour similarity for compounds unlike its training set, Section 2.8), the docking score is a weak filter, the exposure estimate is a regression on total brain-to-blood ratios (cross-validated RMSE 0.55 log units, a typical error of a factor of about 3.5) and not a measured unbound ratio, and the P-gp and BCRP models are proxies. The margin that ranks the molecules is defined by those models, so a larger margin means the molecule sits farther inside their thresholds and not that it is a more potent inhibitor. The statement that these 106 molecules are the strongest we could find holds for the 2,700 designs generated and for the gates stated in Table 12; molecules outside the library, from a different generator, or judged by different models are not covered. The set is also a selection near threshold edges: only the 63 priority-tier molecules have at least 10 % margin, and none of the 106 can be ranked for hERG risk with the models we have. The edits come from a matched-pair library whose transformations are mostly exploratory-tier (all 106 delivered molecules) and are matched on the fragment and its attachment atom only, so an exchange that is common in the library may be a poor choice on a given scaffold; the retrosynthesis check is the evidence that the molecules can be made, and it is a computed route and not a demonstrated one. In a blind re-discovery test the edit library did not find later-reported compounds better than random draws of other edits, so we do not claim that the edit selection adds anything beyond the gates and the anchoring to measured parents. The first experimental step is an Ellman assay[25] for AChE inhibition with donepezil on the same plate, a BChE counter-screen, an MDCK-MDR1 permeability assay with and without a P-gp inhibitor, a BCRP transport assay and hERG patch clamp, beginning with the molecules that have a one- or two-step route.</w:t>
+        <w:t>Nothing reported here has been synthesized or assayed; every property is a prediction. The activity model is reliable only near known chemistry (in the time-split test it did not beat nearest-neighbour similarity for compounds unlike its training set, Section 2.8), the docking score is a weak filter, the pose-stability dynamics did not separate potent from inactive compounds (Section 2.8), the exposure estimate is a regression on total brain-to-blood ratios (cross-validated RMSE 0.55 log units, a typical error of a factor of about 3.5) and not a measured unbound ratio, and the P-gp and BCRP models are proxies. The margin that ranks the molecules is defined by those models, so a larger margin means the molecule sits farther inside their thresholds and not that it is a more potent inhibitor. The statement that these 106 molecules are the strongest we could find holds for the 2,700 designs generated and for the gates stated in Table 12; molecules outside the library, from a different generator, or judged by different models are not covered. The set is also a selection near threshold edges: only the 63 priority-tier molecules have at least 10 % margin, and none of the 106 can be ranked for hERG risk with the models we have. The edits come from a matched-pair library whose transformations are mostly exploratory-tier (all 106 delivered molecules) and are matched on the fragment and its attachment atom only, so an exchange that is common in the library may be a poor choice on a given scaffold; the retrosynthesis check is the evidence that the molecules can be made, and it is a computed route and not a demonstrated one. In a blind re-discovery test the edit library did not find later-reported compounds better than random draws of other edits, so we do not claim that the edit selection adds anything beyond the gates and the anchoring to measured parents. The first experimental step is an Ellman assay[25] for AChE inhibition with donepezil on the same plate, a BChE counter-screen, an MDCK-MDR1 permeability assay with and without a P-gp inhibitor, a BCRP transport assay and hERG patch clamp, beginning with the molecules that have a one- or two-step route.</w:t>
       </w:r>
     </w:p>
     <w:p>
@@ -16458,7 +16458,7 @@
           <w:b w:val="0"/>
           <w:i w:val="0"/>
         </w:rPr>
-        <w:t>We enumerated 383,752 analogues of potent AChE inhibitors by one or two matched-pair edits, kept 2,700 designs and turned them into 106 candidates that pass every computational gate we could apply: activity, brain penetration by three independent models and a validated logBB regression, drug-likeness, toxicity relative to the parent, docking and pose coverage, protonation, tautomer and stereochemical checks, novelty in four independent sources, and a computed route of one to six steps from purchasable materials. Each candidate clears its tightest gate by at least 5 % (median 11 %; 63 molecules form a priority tier at 10 % or more), and the set lies on 63 scaffolds from 34 parents. The components behind the gates were tested on held-out scaffolds: the activity, BBB and logBB models and the docking pose held up, whereas the docking score, the P-gp term and the matched-pair statistics did not add independent evidence, and we have said where the set depends on each. Measured AChE data support the design and limit it: the substitutions used preserve potency to within 0.5 log units in 64.5 % of real compound pairs (51.6 % for other exchanges), every molecule is tied to a measured potent parent (median pChEMBL 7.2), and inside its applicability domain the activity model ranks later-published compounds with ROC-AUC 0.81 against 0.68 for similarity; the edit library itself was not shown to find later compounds better than random edits. The molecules are close analogues of known drugs, a negative database search is not freedom to operate, and hERG, efflux and potency must be measured. The 106 structures with all evidence columns, the computed routes and the reasons for every rejected candidate are provided as Supporting Information as the starting point for synthesis.</w:t>
+        <w:t>We enumerated 383,752 analogues of potent AChE inhibitors by one or two matched-pair edits, kept 2,700 designs and turned them into 106 candidates that pass every computational gate we could apply: activity, brain penetration by three independent models and a validated logBB regression, drug-likeness, toxicity relative to the parent, docking and pose coverage, protonation, tautomer and stereochemical checks, novelty in four independent sources, and a computed route of one to six steps from purchasable materials. Each candidate clears its tightest gate by at least 5 % (median 11 %; 63 molecules form a priority tier at 10 % or more), and the set lies on 63 scaffolds from 34 parents. The components behind the gates were tested on held-out scaffolds: the activity, BBB and logBB models and the docking pose held up, whereas the docking score, the P-gp term, the matched-pair statistics and the molecular-dynamics pose screen did not add independent evidence, and we have said where the set depends on each. Measured AChE data support the design and limit it: the substitutions used preserve potency to within 0.5 log units in 64.5 % of real compound pairs (51.6 % for other exchanges), every molecule is tied to a measured potent parent (median pChEMBL 7.2), and inside its applicability domain the activity model ranks later-published compounds with ROC-AUC 0.81 against 0.68 for similarity; the edit library itself was not shown to find later compounds better than random edits. The molecules are close analogues of known drugs, a negative database search is not freedom to operate, and hERG, efflux and potency must be measured. The 106 structures with all evidence columns, the computed routes and the reasons for every rejected candidate are provided as Supporting Information as the starting point for synthesis.</w:t>
       </w:r>
     </w:p>
     <w:p>
@@ -17563,7 +17563,7 @@
                 <w:i w:val="0"/>
                 <w:sz w:val="17"/>
               </w:rPr>
-              <w:t>P-gp interaction ≤ 0.713; exposure surrogate (passive \times [1 − P-gp]) ≥ 0.2485</w:t>
+              <w:t>P-gp interaction ≤ 0.713; exposure surrogate (passive × [1 − P-gp]) ≥ 0.2485</w:t>
             </w:r>
           </w:p>
         </w:tc>
@@ -17955,7 +17955,7 @@
           <w:b w:val="0"/>
           <w:i w:val="0"/>
         </w:rPr>
-        <w:t>Pose-stability dynamics. The 20 shortlisted molecules and donepezil (crystal pose) were simulated in explicit solvent (OpenMM 8, Amber ff14SB and GAFF2 with AM1-BCC charges, TIP3P, 0.15 M NaCl, 4 fs steps with hydrogen mass repartitioning, 300 K, 1 atm) from the top Vina pose of the protonated molecule (exhaustiveness 16, seed 42), after 100 ps with ligand and backbone restraints and 200 ps with backbone restraints, for 2 ns of production. Two replicas (seeds 1 and 2) were run. A pose was called stable if the mean ligand heavy-atom RMSD over the second half of production, after fitting the pocket Cα atoms, was at most 3.0 Å and the ligand centre of mass stayed within 6 Å of its start; donepezil had to pass for the protocol to be valid. The runs were made on Kaggle GPUs because the laptop has no OpenMM installation.</w:t>
+        <w:t>Pose-stability dynamics. The 20 shortlisted molecules and donepezil (crystal pose) were simulated in explicit solvent (OpenMM 8, Amber ff14SB and GAFF2 with AM1-BCC charges, TIP3P, 0.15 M NaCl, 4 fs steps with hydrogen mass repartitioning, 300 K, 1 atm) from the top Vina pose of the protonated molecule (exhaustiveness 16, seed 42), after 100 ps with ligand and backbone restraints and 200 ps with backbone restraints, for 2 ns of production. Two replicas (seeds 1 and 2) were run. A third set of runs (seed 7, one trajectory each) applied the identical protocol to ten potent and ten inactive published AChE compounds (Table 10). A pose was called stable if the mean ligand heavy-atom RMSD over the second half of production, after fitting the pocket Cα atoms, was at most 3.0 Å and the ligand centre of mass stayed within 6 Å of its start; donepezil had to pass for the protocol to be valid. The runs were made on Kaggle GPUs because the laptop has no OpenMM installation.</w:t>
       </w:r>
     </w:p>
     <w:p>
@@ -18045,7 +18045,7 @@
           <w:b w:val="0"/>
           <w:i w:val="0"/>
         </w:rPr>
-        <w:t>Supporting Information (SI) is provided with the manuscript: SYNTHESIS_SET_106.csv and .sdf (structures and every evidence column), SYNTHESIS_DOSSIER.docx (structures, computed routes, predicted values with margins, flags, assay plan and quality checklist), REJECTED_CANDIDATES_WITH_REASON.csv, FUNNEL_COUNTS.csv, COMPUTED_ROUTES.csv (every reaction of every route), DOCKING_SEED_REPLICATES.csv, GNN_ACTIVITY_CHECK.csv, REFERENCE_DRUGS.csv, RETRO_BENCHMARK.csv, AD_V2_PAPER_FACTS.txt (every number quoted about the delivered set), and the scripts that generate them.</w:t>
+        <w:t>Supporting Information (SI) is provided with the manuscript: SYNTHESIS_SET_106.csv and .sdf (structures and every evidence column), SYNTHESIS_DOSSIER.docx (structures, computed routes, predicted values with margins, flags, assay plan and quality checklist), REJECTED_CANDIDATES_WITH_REASON.csv, FUNNEL_COUNTS.csv, COMPUTED_ROUTES.csv (every reaction of every route), DOCKING_SEED_REPLICATES.csv, GNN_ACTIVITY_CHECK.csv, REFERENCE_DRUGS.csv, RETRO_BENCHMARK.csv, AD_V2_PAPER_FACTS.txt (every number quoted about the delivered set), the result tables of the time-split, anchoring, re-discovery and molecular-dynamics analyses (AD_TIME_SPLIT.csv, AD_V3_*.csv, MD_REPLICA_COMBINED.csv, AD_V3_MD_VALIDATION.csv), and the scripts that generate them.</w:t>
       </w:r>
     </w:p>
     <w:p>

</xml_diff>

<commit_message>
Redraw Figures 2, 3 and 6 at print size without overlaps; inequality signs in funnel and workflow figures; reference check script
</commit_message>
<xml_diff>
--- a/paper/Manuscript_MolInf.docx
+++ b/paper/Manuscript_MolInf.docx
@@ -1195,7 +1195,7 @@
       <w:r>
         <w:drawing>
           <wp:inline xmlns:a="http://schemas.openxmlformats.org/drawingml/2006/main" xmlns:pic="http://schemas.openxmlformats.org/drawingml/2006/picture">
-            <wp:extent cx="5580000" cy="2308128"/>
+            <wp:extent cx="5580000" cy="2491459"/>
             <wp:docPr id="2" name="Picture 2"/>
             <wp:cNvGraphicFramePr>
               <a:graphicFrameLocks noChangeAspect="1"/>
@@ -1216,7 +1216,7 @@
                   <pic:spPr>
                     <a:xfrm>
                       <a:off x="0" y="0"/>
-                      <a:ext cx="5580000" cy="2308128"/>
+                      <a:ext cx="5580000" cy="2491459"/>
                     </a:xfrm>
                     <a:prstGeom prst="rect"/>
                   </pic:spPr>
@@ -1266,7 +1266,7 @@
       <w:r>
         <w:drawing>
           <wp:inline xmlns:a="http://schemas.openxmlformats.org/drawingml/2006/main" xmlns:pic="http://schemas.openxmlformats.org/drawingml/2006/picture">
-            <wp:extent cx="5580000" cy="2227141"/>
+            <wp:extent cx="5580000" cy="2397155"/>
             <wp:docPr id="3" name="Picture 3"/>
             <wp:cNvGraphicFramePr>
               <a:graphicFrameLocks noChangeAspect="1"/>
@@ -1287,7 +1287,7 @@
                   <pic:spPr>
                     <a:xfrm>
                       <a:off x="0" y="0"/>
-                      <a:ext cx="5580000" cy="2227141"/>
+                      <a:ext cx="5580000" cy="2397155"/>
                     </a:xfrm>
                     <a:prstGeom prst="rect"/>
                   </pic:spPr>
@@ -3307,7 +3307,7 @@
       <w:r>
         <w:drawing>
           <wp:inline xmlns:a="http://schemas.openxmlformats.org/drawingml/2006/main" xmlns:pic="http://schemas.openxmlformats.org/drawingml/2006/picture">
-            <wp:extent cx="5580000" cy="3288214"/>
+            <wp:extent cx="5580000" cy="3487500"/>
             <wp:docPr id="6" name="Picture 6"/>
             <wp:cNvGraphicFramePr>
               <a:graphicFrameLocks noChangeAspect="1"/>
@@ -3328,7 +3328,7 @@
                   <pic:spPr>
                     <a:xfrm>
                       <a:off x="0" y="0"/>
-                      <a:ext cx="5580000" cy="3288214"/>
+                      <a:ext cx="5580000" cy="3487500"/>
                     </a:xfrm>
                     <a:prstGeom prst="rect"/>
                   </pic:spPr>

</xml_diff>

<commit_message>
Table 1 docking row: decoy count and property baseline from the final docking summary
</commit_message>
<xml_diff>
--- a/paper/Manuscript_MolInf.docx
+++ b/paper/Manuscript_MolInf.docx
@@ -919,7 +919,7 @@
                 <w:i w:val="0"/>
                 <w:sz w:val="17"/>
               </w:rPr>
-              <w:t>138 binders vs 526 matched decoys, AUC</w:t>
+              <w:t>138 binders vs 542 matched decoys, AUC</w:t>
             </w:r>
           </w:p>
         </w:tc>
@@ -951,7 +951,7 @@
                 <w:i w:val="0"/>
                 <w:sz w:val="17"/>
               </w:rPr>
-              <w:t>properties 0.52</w:t>
+              <w:t>properties 0.51</w:t>
             </w:r>
           </w:p>
         </w:tc>

</xml_diff>

<commit_message>
Thousands separators in Table 7, methods and Figure 2
</commit_message>
<xml_diff>
--- a/paper/Manuscript_MolInf.docx
+++ b/paper/Manuscript_MolInf.docx
@@ -10511,7 +10511,7 @@
                 <w:i w:val="0"/>
                 <w:sz w:val="17"/>
               </w:rPr>
-              <w:t>1677 / 2380</w:t>
+              <w:t>1,677 / 2,380</w:t>
             </w:r>
           </w:p>
         </w:tc>
@@ -10641,7 +10641,7 @@
                 <w:i w:val="0"/>
                 <w:sz w:val="17"/>
               </w:rPr>
-              <w:t>2255 / 1802</w:t>
+              <w:t>2,255 / 1,802</w:t>
             </w:r>
           </w:p>
         </w:tc>
@@ -10771,7 +10771,7 @@
                 <w:i w:val="0"/>
                 <w:sz w:val="17"/>
               </w:rPr>
-              <w:t>2846 / 1211</w:t>
+              <w:t>2,846 / 1,211</w:t>
             </w:r>
           </w:p>
         </w:tc>
@@ -17946,7 +17946,7 @@
           <w:b w:val="0"/>
           <w:i w:val="0"/>
         </w:rPr>
-        <w:t xml:space="preserve"> with a pChEMBL value; 6247 compounds with a label after averaging duplicates and keeping the earliest year; active at mean pChEMBL of 6.0 or more, inactive at 5.0 or less). For each cutoff year (2012, 2015, 2018) a model was trained on compounds first reported up to the cutoff and tested on compounds first reported later. Three scorers were compared: nearest-neighbour Tanimoto similarity to the training actives, a logistic regression on eight physicochemical descriptors, and the activity design used throughout (random forest, extra trees and gradient boosting averaged, on the view-A features). ROC-AUC has a 95 % bootstrap interval (300 resamples) and is reported for all later compounds and for the third of them least similar to the training set. The bar was fixed before the run: at the 2015 cutoff, in the least-similar third, the activity design must beat both baselines and reach an AUC above 0.65.</w:t>
+        <w:t xml:space="preserve"> with a pChEMBL value; 6,247 compounds with a label after averaging duplicates and keeping the earliest year; active at mean pChEMBL of 6.0 or more, inactive at 5.0 or less). For each cutoff year (2012, 2015, 2018) a model was trained on compounds first reported up to the cutoff and tested on compounds first reported later. Three scorers were compared: nearest-neighbour Tanimoto similarity to the training actives, a logistic regression on eight physicochemical descriptors, and the activity design used throughout (random forest, extra trees and gradient boosting averaged, on the view-A features). ROC-AUC has a 95 % bootstrap interval (300 resamples) and is reported for all later compounds and for the third of them least similar to the training set. The bar was fixed before the run: at the 2015 cutoff, in the least-similar third, the activity design must beat both baselines and reach an AUC above 0.65.</w:t>
       </w:r>
     </w:p>
     <w:p>

</xml_diff>